<commit_message>
feat: update spec timohouse
</commit_message>
<xml_diff>
--- a/docs_timonouse/outputs/timohouse-client-questions/TimoHouse_25_cau_hoi_xac_nhan_nghiep_vu.docx
+++ b/docs_timonouse/outputs/timohouse-client-questions/TimoHouse_25_cau_hoi_xac_nhan_nghiep_vu.docx
@@ -24,14 +24,13 @@
       </w:pPr>
       <w:r>
         <w:rPr>
-          <w:rFonts w:ascii="Calibri" w:cs="Calibri" w:eastAsia="Calibri" w:hAnsi="Calibri"/>
+          <w:rFonts w:ascii="Calibri" w:hAnsi="Calibri"/>
           <w:b/>
-          <w:bCs/>
-          <w:color w:val="17365D"/>
-          <w:sz w:val="48"/>
-          <w:szCs w:val="48"/>
+          <w:i w:val="0"/>
+          <w:color w:val="1F4E79"/>
+          <w:sz w:val="28"/>
         </w:rPr>
-        <w:t xml:space="preserve">25 câu hỏi cần chốt với khách hàng</w:t>
+        <w:t>25 câu hỏi cần chốt với khách hàng — BẢN GIẢ ĐỊNH ĐÃ ĐIỀN</w:t>
       </w:r>
     </w:p>
     <w:p>
@@ -225,19 +224,12 @@
             <w:vAlign w:val="center"/>
           </w:tcPr>
           <w:p>
-            <w:pPr>
-              <w:spacing w:after="0" w:before="0"/>
-            </w:pPr>
-            <w:r>
-              <w:rPr>
-                <w:rFonts w:ascii="Calibri" w:cs="Calibri" w:eastAsia="Calibri" w:hAnsi="Calibri"/>
-                <w:b w:val="false"/>
-                <w:bCs w:val="false"/>
-                <w:color w:val="20242A"/>
-                <w:sz w:val="22"/>
-                <w:szCs w:val="22"/>
-              </w:rPr>
-              <w:t xml:space="preserve">[Họ tên - Chức danh]</w:t>
+            <w:r>
+              <w:rPr>
+                <w:rFonts w:ascii="Calibri" w:hAnsi="Calibri"/>
+                <w:sz w:val="21"/>
+              </w:rPr>
+              <w:t>Đội dự án (giả định đề xuất)</w:t>
             </w:r>
           </w:p>
         </w:tc>
@@ -282,19 +274,12 @@
             <w:vAlign w:val="center"/>
           </w:tcPr>
           <w:p>
-            <w:pPr>
-              <w:spacing w:after="0" w:before="0"/>
-            </w:pPr>
-            <w:r>
-              <w:rPr>
-                <w:rFonts w:ascii="Calibri" w:cs="Calibri" w:eastAsia="Calibri" w:hAnsi="Calibri"/>
-                <w:b w:val="false"/>
-                <w:bCs w:val="false"/>
-                <w:color w:val="20242A"/>
-                <w:sz w:val="22"/>
-                <w:szCs w:val="22"/>
-              </w:rPr>
-              <w:t xml:space="preserve">[dd/mm/yyyy]</w:t>
+            <w:r>
+              <w:rPr>
+                <w:rFonts w:ascii="Calibri" w:hAnsi="Calibri"/>
+                <w:sz w:val="21"/>
+              </w:rPr>
+              <w:t>Chờ khách hàng xác nhận</w:t>
             </w:r>
           </w:p>
         </w:tc>
@@ -398,19 +383,12 @@
             <w:vAlign w:val="center"/>
           </w:tcPr>
           <w:p>
-            <w:pPr>
-              <w:spacing w:after="0" w:before="0"/>
-            </w:pPr>
-            <w:r>
-              <w:rPr>
-                <w:rFonts w:ascii="Calibri" w:cs="Calibri" w:eastAsia="Calibri" w:hAnsi="Calibri"/>
-                <w:b w:val="false"/>
-                <w:bCs w:val="false"/>
-                <w:color w:val="20242A"/>
-                <w:sz w:val="22"/>
-                <w:szCs w:val="22"/>
-              </w:rPr>
-              <w:t xml:space="preserve">1.0</w:t>
+            <w:r>
+              <w:rPr>
+                <w:rFonts w:ascii="Calibri" w:hAnsi="Calibri"/>
+                <w:sz w:val="21"/>
+              </w:rPr>
+              <w:t>1.1 - Bản giả định</w:t>
             </w:r>
           </w:p>
         </w:tc>
@@ -494,6 +472,22 @@
     </w:p>
     <w:p>
       <w:pPr>
+        <w:jc w:val="center"/>
+        <w:shd w:fill="FFF2CC"/>
+      </w:pPr>
+      <w:r>
+        <w:rPr>
+          <w:rFonts w:ascii="Calibri" w:hAnsi="Calibri"/>
+          <w:b/>
+          <w:i w:val="0"/>
+          <w:color w:val="9C5700"/>
+          <w:sz w:val="21"/>
+        </w:rPr>
+        <w:t>TRẠNG THÁI: Các câu trả lời dưới đây là giả định nghiệp vụ do đội dự án đề xuất, chưa phải xác nhận chính thức của khách hàng.</w:t>
+      </w:r>
+    </w:p>
+    <w:p>
+      <w:pPr>
         <w:keepNext/>
         <w:spacing w:after="130" w:before="160"/>
       </w:pPr>
@@ -608,44 +602,45 @@
             </w:pPr>
             <w:r>
               <w:rPr>
-                <w:rFonts w:ascii="Calibri" w:cs="Calibri" w:eastAsia="Calibri" w:hAnsi="Calibri"/>
-                <w:color w:val="20242A"/>
-                <w:sz w:val="21"/>
-                <w:szCs w:val="21"/>
-              </w:rPr>
-              <w:t xml:space="preserve">☐ Xác nhận cả hai nguyên tắc trên</w:t>
-            </w:r>
-          </w:p>
-          <w:p>
-            <w:pPr>
-              <w:keepNext/>
-              <w:spacing w:after="40" w:before="0" w:line="264"/>
-              <w:ind w:left="220"/>
-            </w:pPr>
-            <w:r>
-              <w:rPr>
-                <w:rFonts w:ascii="Calibri" w:cs="Calibri" w:eastAsia="Calibri" w:hAnsi="Calibri"/>
-                <w:color w:val="20242A"/>
-                <w:sz w:val="21"/>
-                <w:szCs w:val="21"/>
-              </w:rPr>
-              <w:t xml:space="preserve">☐ Dòng tiền theo ngày thực chi; báo cáo kinh doanh theo nguyên tắc khác</w:t>
-            </w:r>
-          </w:p>
-          <w:p>
-            <w:pPr>
-              <w:keepNext/>
-              <w:spacing w:after="40" w:before="0" w:line="264"/>
-              <w:ind w:left="220"/>
-            </w:pPr>
-            <w:r>
-              <w:rPr>
-                <w:rFonts w:ascii="Calibri" w:cs="Calibri" w:eastAsia="Calibri" w:hAnsi="Calibri"/>
-                <w:color w:val="20242A"/>
-                <w:sz w:val="21"/>
-                <w:szCs w:val="21"/>
-              </w:rPr>
-              <w:t xml:space="preserve">☐ Áp dụng quy tắc khác - vui lòng mô tả</w:t>
+                <w:rFonts w:ascii="Calibri" w:hAnsi="Calibri"/>
+                <w:b/>
+                <w:i w:val="0"/>
+                <w:color w:val="1F4E79"/>
+                <w:sz w:val="21"/>
+              </w:rPr>
+              <w:t>☒ Xác nhận cả hai nguyên tắc trên</w:t>
+            </w:r>
+          </w:p>
+          <w:p>
+            <w:pPr>
+              <w:keepNext/>
+              <w:spacing w:after="40" w:before="0" w:line="264"/>
+              <w:ind w:left="220"/>
+            </w:pPr>
+            <w:r>
+              <w:rPr>
+                <w:rFonts w:ascii="Calibri" w:hAnsi="Calibri"/>
+                <w:b w:val="0"/>
+                <w:i w:val="0"/>
+                <w:sz w:val="21"/>
+              </w:rPr>
+              <w:t>☐ Dòng tiền theo ngày thực chi; báo cáo kinh doanh theo nguyên tắc khác</w:t>
+            </w:r>
+          </w:p>
+          <w:p>
+            <w:pPr>
+              <w:keepNext/>
+              <w:spacing w:after="40" w:before="0" w:line="264"/>
+              <w:ind w:left="220"/>
+            </w:pPr>
+            <w:r>
+              <w:rPr>
+                <w:rFonts w:ascii="Calibri" w:hAnsi="Calibri"/>
+                <w:b w:val="0"/>
+                <w:i w:val="0"/>
+                <w:sz w:val="21"/>
+              </w:rPr>
+              <w:t>☐ Áp dụng quy tắc khác - vui lòng mô tả</w:t>
             </w:r>
           </w:p>
           <w:p>
@@ -683,66 +678,44 @@
             </w:pPr>
             <w:r>
               <w:rPr>
-                <w:rFonts w:ascii="Calibri" w:cs="Calibri" w:eastAsia="Calibri" w:hAnsi="Calibri"/>
-                <w:b/>
-                <w:bCs/>
-                <w:color w:val="2E74B5"/>
-                <w:sz w:val="22"/>
-                <w:szCs w:val="22"/>
-              </w:rPr>
-              <w:t xml:space="preserve">Trả lời/xác nhận của khách hàng</w:t>
-            </w:r>
-          </w:p>
-          <w:p>
-            <w:pPr>
-              <w:shd w:fill="F5F7F9" w:val="clear"/>
-              <w:spacing w:after="90" w:before="0" w:line="300"/>
-            </w:pPr>
-            <w:r>
-              <w:rPr>
-                <w:rFonts w:ascii="Calibri" w:cs="Calibri" w:eastAsia="Calibri" w:hAnsi="Calibri"/>
+                <w:rFonts w:ascii="Calibri" w:hAnsi="Calibri"/>
+                <w:b/>
+                <w:i w:val="0"/>
+                <w:color w:val="1F4E79"/>
+                <w:sz w:val="22"/>
+              </w:rPr>
+              <w:t>Trả lời giả định do đội dự án đề xuất (chờ khách hàng xác nhận)</w:t>
+            </w:r>
+          </w:p>
+          <w:p>
+            <w:pPr>
+              <w:shd w:fill="DDEBF7" w:val="clear"/>
+              <w:spacing w:after="80" w:before="0" w:line="300"/>
+            </w:pPr>
+            <w:r>
+              <w:rPr>
+                <w:rFonts w:ascii="Calibri" w:hAnsi="Calibri"/>
+                <w:b w:val="0"/>
+                <w:i w:val="0"/>
+                <w:color w:val="1F4E79"/>
+                <w:sz w:val="21"/>
+              </w:rPr>
+              <w:t>Xác nhận theo giả định đề xuất: báo cáo dòng tiền (CF) ghi tiền thuê nhà theo tháng hợp đồng; số tiền thực trả theo đợt chỉ theo dõi ở sổ quỹ. Báo cáo kinh doanh dồn tích (AC) phân bổ đều tổng giá trị hợp đồng trong toàn thời hạn, bao gồm tháng miễn và khoản giảm giá theo đợt.</w:t>
+            </w:r>
+          </w:p>
+          <w:p>
+            <w:pPr>
+              <w:spacing w:after="0" w:before="0"/>
+            </w:pPr>
+            <w:r>
+              <w:rPr>
+                <w:rFonts w:ascii="Calibri" w:hAnsi="Calibri"/>
+                <w:b w:val="0"/>
                 <w:i/>
-                <w:iCs/>
-                <w:color w:val="7A838D"/>
-                <w:sz w:val="22"/>
-                <w:szCs w:val="22"/>
-              </w:rPr>
-              <w:t xml:space="preserve">[Khách hàng nhập câu trả lời tại đây]</w:t>
-            </w:r>
-            <w:r>
-              <w:rPr>
-                <w:rFonts w:ascii="Calibri" w:cs="Calibri" w:eastAsia="Calibri" w:hAnsi="Calibri"/>
-                <w:color w:val="7A838D"/>
-                <w:sz w:val="22"/>
-                <w:szCs w:val="22"/>
-              </w:rPr>
-              <w:t xml:space="preserve">
-</w:t>
-            </w:r>
-          </w:p>
-          <w:p>
-            <w:pPr>
-              <w:spacing w:after="0" w:before="0"/>
-            </w:pPr>
-            <w:r>
-              <w:rPr>
-                <w:rFonts w:ascii="Calibri" w:cs="Calibri" w:eastAsia="Calibri" w:hAnsi="Calibri"/>
-                <w:b/>
-                <w:bCs/>
-                <w:color w:val="17365D"/>
-                <w:sz w:val="20"/>
-                <w:szCs w:val="20"/>
-              </w:rPr>
-              <w:t xml:space="preserve">Tài liệu/minh chứng đính kèm (nếu có): </w:t>
-            </w:r>
-            <w:r>
-              <w:rPr>
-                <w:rFonts w:ascii="Calibri" w:cs="Calibri" w:eastAsia="Calibri" w:hAnsi="Calibri"/>
-                <w:color w:val="5D6672"/>
-                <w:sz w:val="20"/>
-                <w:szCs w:val="20"/>
-              </w:rPr>
-              <w:t xml:space="preserve">________________________________________</w:t>
+                <w:color w:val="595959"/>
+                <w:sz w:val="19"/>
+              </w:rPr>
+              <w:t>Căn cứ tham khảo trong hồ sơ nghiệp vụ: P-02, R-27; §4.5 và §5.2 của hồ sơ nghiệp vụ.</w:t>
             </w:r>
           </w:p>
         </w:tc>
@@ -852,44 +825,46 @@
             </w:pPr>
             <w:r>
               <w:rPr>
-                <w:rFonts w:ascii="Calibri" w:cs="Calibri" w:eastAsia="Calibri" w:hAnsi="Calibri"/>
-                <w:color w:val="20242A"/>
-                <w:sz w:val="21"/>
-                <w:szCs w:val="21"/>
-              </w:rPr>
-              <w:t xml:space="preserve">☐ Xác nhận ghi nhận theo kỳ lương</w:t>
-            </w:r>
-          </w:p>
-          <w:p>
-            <w:pPr>
-              <w:keepNext/>
-              <w:spacing w:after="40" w:before="0" w:line="264"/>
-              <w:ind w:left="220"/>
-            </w:pPr>
-            <w:r>
-              <w:rPr>
-                <w:rFonts w:ascii="Calibri" w:cs="Calibri" w:eastAsia="Calibri" w:hAnsi="Calibri"/>
-                <w:color w:val="20242A"/>
-                <w:sz w:val="21"/>
-                <w:szCs w:val="21"/>
-              </w:rPr>
-              <w:t xml:space="preserve">☐ Báo cáo dòng tiền ghi theo ngày chi thực tế</w:t>
-            </w:r>
-          </w:p>
-          <w:p>
-            <w:pPr>
-              <w:keepNext/>
-              <w:spacing w:after="40" w:before="0" w:line="264"/>
-              <w:ind w:left="220"/>
-            </w:pPr>
-            <w:r>
-              <w:rPr>
-                <w:rFonts w:ascii="Calibri" w:cs="Calibri" w:eastAsia="Calibri" w:hAnsi="Calibri"/>
-                <w:color w:val="20242A"/>
-                <w:sz w:val="21"/>
-                <w:szCs w:val="21"/>
-              </w:rPr>
-              <w:t xml:space="preserve">☐ Có tạm ứng - vui lòng mô tả cách hạch toán</w:t>
+                <w:rFonts w:ascii="Calibri" w:hAnsi="Calibri"/>
+                <w:b/>
+                <w:i w:val="0"/>
+                <w:color w:val="1F4E79"/>
+                <w:sz w:val="21"/>
+              </w:rPr>
+              <w:t>☒ Xác nhận ghi nhận theo kỳ lương</w:t>
+            </w:r>
+          </w:p>
+          <w:p>
+            <w:pPr>
+              <w:keepNext/>
+              <w:spacing w:after="40" w:before="0" w:line="264"/>
+              <w:ind w:left="220"/>
+            </w:pPr>
+            <w:r>
+              <w:rPr>
+                <w:rFonts w:ascii="Calibri" w:hAnsi="Calibri"/>
+                <w:b w:val="0"/>
+                <w:i w:val="0"/>
+                <w:sz w:val="21"/>
+              </w:rPr>
+              <w:t>☐ Báo cáo dòng tiền ghi theo ngày chi thực tế</w:t>
+            </w:r>
+          </w:p>
+          <w:p>
+            <w:pPr>
+              <w:keepNext/>
+              <w:spacing w:after="40" w:before="0" w:line="264"/>
+              <w:ind w:left="220"/>
+            </w:pPr>
+            <w:r>
+              <w:rPr>
+                <w:rFonts w:ascii="Calibri" w:hAnsi="Calibri"/>
+                <w:b/>
+                <w:i w:val="0"/>
+                <w:color w:val="1F4E79"/>
+                <w:sz w:val="21"/>
+              </w:rPr>
+              <w:t>☒ Có tạm ứng - vui lòng mô tả cách hạch toán</w:t>
             </w:r>
           </w:p>
           <w:p>
@@ -927,66 +902,44 @@
             </w:pPr>
             <w:r>
               <w:rPr>
-                <w:rFonts w:ascii="Calibri" w:cs="Calibri" w:eastAsia="Calibri" w:hAnsi="Calibri"/>
-                <w:b/>
-                <w:bCs/>
-                <w:color w:val="2E74B5"/>
-                <w:sz w:val="22"/>
-                <w:szCs w:val="22"/>
-              </w:rPr>
-              <w:t xml:space="preserve">Trả lời/xác nhận của khách hàng</w:t>
-            </w:r>
-          </w:p>
-          <w:p>
-            <w:pPr>
-              <w:shd w:fill="F5F7F9" w:val="clear"/>
-              <w:spacing w:after="90" w:before="0" w:line="300"/>
-            </w:pPr>
-            <w:r>
-              <w:rPr>
-                <w:rFonts w:ascii="Calibri" w:cs="Calibri" w:eastAsia="Calibri" w:hAnsi="Calibri"/>
+                <w:rFonts w:ascii="Calibri" w:hAnsi="Calibri"/>
+                <w:b/>
+                <w:i w:val="0"/>
+                <w:color w:val="1F4E79"/>
+                <w:sz w:val="22"/>
+              </w:rPr>
+              <w:t>Trả lời giả định do đội dự án đề xuất (chờ khách hàng xác nhận)</w:t>
+            </w:r>
+          </w:p>
+          <w:p>
+            <w:pPr>
+              <w:shd w:fill="DDEBF7" w:val="clear"/>
+              <w:spacing w:after="80" w:before="0" w:line="300"/>
+            </w:pPr>
+            <w:r>
+              <w:rPr>
+                <w:rFonts w:ascii="Calibri" w:hAnsi="Calibri"/>
+                <w:b w:val="0"/>
+                <w:i w:val="0"/>
+                <w:color w:val="1F4E79"/>
+                <w:sz w:val="21"/>
+              </w:rPr>
+              <w:t>Xác nhận chi phí lương được ghi nhận theo kỳ lương trên cả CF và AC; ngày chi thực tế chỉ vào sổ quỹ. Lương kỳ N dự kiến chi từ ngày 20 đến ngày 25 của tháng N+1. Cho phép tạm ứng giữa kỳ; khi khóa lương phải liên kết và trừ khoản tạm ứng, Admin duyệt đợt chi trước khi ghi Đã chi.</w:t>
+            </w:r>
+          </w:p>
+          <w:p>
+            <w:pPr>
+              <w:spacing w:after="0" w:before="0"/>
+            </w:pPr>
+            <w:r>
+              <w:rPr>
+                <w:rFonts w:ascii="Calibri" w:hAnsi="Calibri"/>
+                <w:b w:val="0"/>
                 <w:i/>
-                <w:iCs/>
-                <w:color w:val="7A838D"/>
-                <w:sz w:val="22"/>
-                <w:szCs w:val="22"/>
-              </w:rPr>
-              <w:t xml:space="preserve">[Khách hàng nhập câu trả lời tại đây]</w:t>
-            </w:r>
-            <w:r>
-              <w:rPr>
-                <w:rFonts w:ascii="Calibri" w:cs="Calibri" w:eastAsia="Calibri" w:hAnsi="Calibri"/>
-                <w:color w:val="7A838D"/>
-                <w:sz w:val="22"/>
-                <w:szCs w:val="22"/>
-              </w:rPr>
-              <w:t xml:space="preserve">
-</w:t>
-            </w:r>
-          </w:p>
-          <w:p>
-            <w:pPr>
-              <w:spacing w:after="0" w:before="0"/>
-            </w:pPr>
-            <w:r>
-              <w:rPr>
-                <w:rFonts w:ascii="Calibri" w:cs="Calibri" w:eastAsia="Calibri" w:hAnsi="Calibri"/>
-                <w:b/>
-                <w:bCs/>
-                <w:color w:val="17365D"/>
-                <w:sz w:val="20"/>
-                <w:szCs w:val="20"/>
-              </w:rPr>
-              <w:t xml:space="preserve">Tài liệu/minh chứng đính kèm (nếu có): </w:t>
-            </w:r>
-            <w:r>
-              <w:rPr>
-                <w:rFonts w:ascii="Calibri" w:cs="Calibri" w:eastAsia="Calibri" w:hAnsi="Calibri"/>
-                <w:color w:val="5D6672"/>
-                <w:sz w:val="20"/>
-                <w:szCs w:val="20"/>
-              </w:rPr>
-              <w:t xml:space="preserve">________________________________________</w:t>
+                <w:color w:val="595959"/>
+                <w:sz w:val="19"/>
+              </w:rPr>
+              <w:t>Căn cứ tham khảo trong hồ sơ nghiệp vụ: P-18, P-28; §3.6 và §5.2.</w:t>
             </w:r>
           </w:p>
         </w:tc>
@@ -1096,44 +1049,45 @@
             </w:pPr>
             <w:r>
               <w:rPr>
-                <w:rFonts w:ascii="Calibri" w:cs="Calibri" w:eastAsia="Calibri" w:hAnsi="Calibri"/>
-                <w:color w:val="20242A"/>
-                <w:sz w:val="21"/>
-                <w:szCs w:val="21"/>
-              </w:rPr>
-              <w:t xml:space="preserve">☐ Tách từng hạng mục tài sản</w:t>
-            </w:r>
-          </w:p>
-          <w:p>
-            <w:pPr>
-              <w:keepNext/>
-              <w:spacing w:after="40" w:before="0" w:line="264"/>
-              <w:ind w:left="220"/>
-            </w:pPr>
-            <w:r>
-              <w:rPr>
-                <w:rFonts w:ascii="Calibri" w:cs="Calibri" w:eastAsia="Calibri" w:hAnsi="Calibri"/>
-                <w:color w:val="20242A"/>
-                <w:sz w:val="21"/>
-                <w:szCs w:val="21"/>
-              </w:rPr>
-              <w:t xml:space="preserve">☐ Gộp toàn bộ theo hợp đồng thuê</w:t>
-            </w:r>
-          </w:p>
-          <w:p>
-            <w:pPr>
-              <w:keepNext/>
-              <w:spacing w:after="40" w:before="0" w:line="264"/>
-              <w:ind w:left="220"/>
-            </w:pPr>
-            <w:r>
-              <w:rPr>
-                <w:rFonts w:ascii="Calibri" w:cs="Calibri" w:eastAsia="Calibri" w:hAnsi="Calibri"/>
-                <w:color w:val="20242A"/>
-                <w:sz w:val="21"/>
-                <w:szCs w:val="21"/>
-              </w:rPr>
-              <w:t xml:space="preserve">☐ Quy tắc khác - vui lòng cung cấp chính sách</w:t>
+                <w:rFonts w:ascii="Calibri" w:hAnsi="Calibri"/>
+                <w:b/>
+                <w:i w:val="0"/>
+                <w:color w:val="1F4E79"/>
+                <w:sz w:val="21"/>
+              </w:rPr>
+              <w:t>☒ Tách từng hạng mục tài sản</w:t>
+            </w:r>
+          </w:p>
+          <w:p>
+            <w:pPr>
+              <w:keepNext/>
+              <w:spacing w:after="40" w:before="0" w:line="264"/>
+              <w:ind w:left="220"/>
+            </w:pPr>
+            <w:r>
+              <w:rPr>
+                <w:rFonts w:ascii="Calibri" w:hAnsi="Calibri"/>
+                <w:b w:val="0"/>
+                <w:i w:val="0"/>
+                <w:sz w:val="21"/>
+              </w:rPr>
+              <w:t>☐ Gộp toàn bộ theo hợp đồng thuê</w:t>
+            </w:r>
+          </w:p>
+          <w:p>
+            <w:pPr>
+              <w:keepNext/>
+              <w:spacing w:after="40" w:before="0" w:line="264"/>
+              <w:ind w:left="220"/>
+            </w:pPr>
+            <w:r>
+              <w:rPr>
+                <w:rFonts w:ascii="Calibri" w:hAnsi="Calibri"/>
+                <w:b w:val="0"/>
+                <w:i w:val="0"/>
+                <w:sz w:val="21"/>
+              </w:rPr>
+              <w:t>☐ Quy tắc khác - vui lòng cung cấp chính sách</w:t>
             </w:r>
           </w:p>
           <w:p>
@@ -1171,66 +1125,44 @@
             </w:pPr>
             <w:r>
               <w:rPr>
-                <w:rFonts w:ascii="Calibri" w:cs="Calibri" w:eastAsia="Calibri" w:hAnsi="Calibri"/>
-                <w:b/>
-                <w:bCs/>
-                <w:color w:val="2E74B5"/>
-                <w:sz w:val="22"/>
-                <w:szCs w:val="22"/>
-              </w:rPr>
-              <w:t xml:space="preserve">Trả lời/xác nhận của khách hàng</w:t>
-            </w:r>
-          </w:p>
-          <w:p>
-            <w:pPr>
-              <w:shd w:fill="F5F7F9" w:val="clear"/>
-              <w:spacing w:after="90" w:before="0" w:line="300"/>
-            </w:pPr>
-            <w:r>
-              <w:rPr>
-                <w:rFonts w:ascii="Calibri" w:cs="Calibri" w:eastAsia="Calibri" w:hAnsi="Calibri"/>
+                <w:rFonts w:ascii="Calibri" w:hAnsi="Calibri"/>
+                <w:b/>
+                <w:i w:val="0"/>
+                <w:color w:val="1F4E79"/>
+                <w:sz w:val="22"/>
+              </w:rPr>
+              <w:t>Trả lời giả định do đội dự án đề xuất (chờ khách hàng xác nhận)</w:t>
+            </w:r>
+          </w:p>
+          <w:p>
+            <w:pPr>
+              <w:shd w:fill="DDEBF7" w:val="clear"/>
+              <w:spacing w:after="80" w:before="0" w:line="300"/>
+            </w:pPr>
+            <w:r>
+              <w:rPr>
+                <w:rFonts w:ascii="Calibri" w:hAnsi="Calibri"/>
+                <w:b w:val="0"/>
+                <w:i w:val="0"/>
+                <w:color w:val="1F4E79"/>
+                <w:sz w:val="21"/>
+              </w:rPr>
+              <w:t>Chọn tách từng hạng mục. Thiết bị rời dưới 10.000.000 đồng/đơn vị khấu hao 12 tháng; từ 10.000.000 đồng/đơn vị khấu hao 36 tháng; hạng mục cải tạo gắn với tòa phân bổ theo thời gian còn lại của hợp đồng đầu vào, tối đa 60 tháng. Với G1, mức giả định là 2.325.167 đồng/tháng. Ngưỡng 10 triệu được xét trên một đơn vị tài sản, không xét tổng một lần mua.</w:t>
+            </w:r>
+          </w:p>
+          <w:p>
+            <w:pPr>
+              <w:spacing w:after="0" w:before="0"/>
+            </w:pPr>
+            <w:r>
+              <w:rPr>
+                <w:rFonts w:ascii="Calibri" w:hAnsi="Calibri"/>
+                <w:b w:val="0"/>
                 <w:i/>
-                <w:iCs/>
-                <w:color w:val="7A838D"/>
-                <w:sz w:val="22"/>
-                <w:szCs w:val="22"/>
-              </w:rPr>
-              <w:t xml:space="preserve">[Khách hàng nhập câu trả lời tại đây]</w:t>
-            </w:r>
-            <w:r>
-              <w:rPr>
-                <w:rFonts w:ascii="Calibri" w:cs="Calibri" w:eastAsia="Calibri" w:hAnsi="Calibri"/>
-                <w:color w:val="7A838D"/>
-                <w:sz w:val="22"/>
-                <w:szCs w:val="22"/>
-              </w:rPr>
-              <w:t xml:space="preserve">
-</w:t>
-            </w:r>
-          </w:p>
-          <w:p>
-            <w:pPr>
-              <w:spacing w:after="0" w:before="0"/>
-            </w:pPr>
-            <w:r>
-              <w:rPr>
-                <w:rFonts w:ascii="Calibri" w:cs="Calibri" w:eastAsia="Calibri" w:hAnsi="Calibri"/>
-                <w:b/>
-                <w:bCs/>
-                <w:color w:val="17365D"/>
-                <w:sz w:val="20"/>
-                <w:szCs w:val="20"/>
-              </w:rPr>
-              <w:t xml:space="preserve">Tài liệu/minh chứng đính kèm (nếu có): </w:t>
-            </w:r>
-            <w:r>
-              <w:rPr>
-                <w:rFonts w:ascii="Calibri" w:cs="Calibri" w:eastAsia="Calibri" w:hAnsi="Calibri"/>
-                <w:color w:val="5D6672"/>
-                <w:sz w:val="20"/>
-                <w:szCs w:val="20"/>
-              </w:rPr>
-              <w:t xml:space="preserve">________________________________________</w:t>
+                <w:color w:val="595959"/>
+                <w:sz w:val="19"/>
+              </w:rPr>
+              <w:t>Căn cứ tham khảo trong hồ sơ nghiệp vụ: P-02; §4.4 và ví dụ G1 tại §5.3.10.</w:t>
             </w:r>
           </w:p>
         </w:tc>
@@ -1340,44 +1272,45 @@
             </w:pPr>
             <w:r>
               <w:rPr>
-                <w:rFonts w:ascii="Calibri" w:cs="Calibri" w:eastAsia="Calibri" w:hAnsi="Calibri"/>
-                <w:color w:val="20242A"/>
-                <w:sz w:val="21"/>
-                <w:szCs w:val="21"/>
-              </w:rPr>
-              <w:t xml:space="preserve">☐ Áp dụng ngưỡng 2.000.000 đồng/đơn vị</w:t>
-            </w:r>
-          </w:p>
-          <w:p>
-            <w:pPr>
-              <w:keepNext/>
-              <w:spacing w:after="40" w:before="0" w:line="264"/>
-              <w:ind w:left="220"/>
-            </w:pPr>
-            <w:r>
-              <w:rPr>
-                <w:rFonts w:ascii="Calibri" w:cs="Calibri" w:eastAsia="Calibri" w:hAnsi="Calibri"/>
-                <w:color w:val="20242A"/>
-                <w:sz w:val="21"/>
-                <w:szCs w:val="21"/>
-              </w:rPr>
-              <w:t xml:space="preserve">☐ Áp dụng ngưỡng khác - vui lòng ghi rõ</w:t>
-            </w:r>
-          </w:p>
-          <w:p>
-            <w:pPr>
-              <w:keepNext/>
-              <w:spacing w:after="40" w:before="0" w:line="264"/>
-              <w:ind w:left="220"/>
-            </w:pPr>
-            <w:r>
-              <w:rPr>
-                <w:rFonts w:ascii="Calibri" w:cs="Calibri" w:eastAsia="Calibri" w:hAnsi="Calibri"/>
-                <w:color w:val="20242A"/>
-                <w:sz w:val="21"/>
-                <w:szCs w:val="21"/>
-              </w:rPr>
-              <w:t xml:space="preserve">☐ Xét theo loại tài sản - vui lòng gửi bảng quy định</w:t>
+                <w:rFonts w:ascii="Calibri" w:hAnsi="Calibri"/>
+                <w:b/>
+                <w:i w:val="0"/>
+                <w:color w:val="1F4E79"/>
+                <w:sz w:val="21"/>
+              </w:rPr>
+              <w:t>☒ Áp dụng ngưỡng 2.000.000 đồng/đơn vị</w:t>
+            </w:r>
+          </w:p>
+          <w:p>
+            <w:pPr>
+              <w:keepNext/>
+              <w:spacing w:after="40" w:before="0" w:line="264"/>
+              <w:ind w:left="220"/>
+            </w:pPr>
+            <w:r>
+              <w:rPr>
+                <w:rFonts w:ascii="Calibri" w:hAnsi="Calibri"/>
+                <w:b w:val="0"/>
+                <w:i w:val="0"/>
+                <w:sz w:val="21"/>
+              </w:rPr>
+              <w:t>☐ Áp dụng ngưỡng khác - vui lòng ghi rõ</w:t>
+            </w:r>
+          </w:p>
+          <w:p>
+            <w:pPr>
+              <w:keepNext/>
+              <w:spacing w:after="40" w:before="0" w:line="264"/>
+              <w:ind w:left="220"/>
+            </w:pPr>
+            <w:r>
+              <w:rPr>
+                <w:rFonts w:ascii="Calibri" w:hAnsi="Calibri"/>
+                <w:b w:val="0"/>
+                <w:i w:val="0"/>
+                <w:sz w:val="21"/>
+              </w:rPr>
+              <w:t>☐ Xét theo loại tài sản - vui lòng gửi bảng quy định</w:t>
             </w:r>
           </w:p>
           <w:p>
@@ -1415,66 +1348,44 @@
             </w:pPr>
             <w:r>
               <w:rPr>
-                <w:rFonts w:ascii="Calibri" w:cs="Calibri" w:eastAsia="Calibri" w:hAnsi="Calibri"/>
-                <w:b/>
-                <w:bCs/>
-                <w:color w:val="2E74B5"/>
-                <w:sz w:val="22"/>
-                <w:szCs w:val="22"/>
-              </w:rPr>
-              <w:t xml:space="preserve">Trả lời/xác nhận của khách hàng</w:t>
-            </w:r>
-          </w:p>
-          <w:p>
-            <w:pPr>
-              <w:shd w:fill="F5F7F9" w:val="clear"/>
-              <w:spacing w:after="90" w:before="0" w:line="300"/>
-            </w:pPr>
-            <w:r>
-              <w:rPr>
-                <w:rFonts w:ascii="Calibri" w:cs="Calibri" w:eastAsia="Calibri" w:hAnsi="Calibri"/>
+                <w:rFonts w:ascii="Calibri" w:hAnsi="Calibri"/>
+                <w:b/>
+                <w:i w:val="0"/>
+                <w:color w:val="1F4E79"/>
+                <w:sz w:val="22"/>
+              </w:rPr>
+              <w:t>Trả lời giả định do đội dự án đề xuất (chờ khách hàng xác nhận)</w:t>
+            </w:r>
+          </w:p>
+          <w:p>
+            <w:pPr>
+              <w:shd w:fill="DDEBF7" w:val="clear"/>
+              <w:spacing w:after="80" w:before="0" w:line="300"/>
+            </w:pPr>
+            <w:r>
+              <w:rPr>
+                <w:rFonts w:ascii="Calibri" w:hAnsi="Calibri"/>
+                <w:b w:val="0"/>
+                <w:i w:val="0"/>
+                <w:color w:val="1F4E79"/>
+                <w:sz w:val="21"/>
+              </w:rPr>
+              <w:t>Áp dụng ngưỡng vốn hóa 2.000.000 đồng trên một đơn vị tài sản. Tài sản từ ngưỡng này trở lên được tạo hồ sơ tài sản và khấu hao trên AC; dưới ngưỡng ghi chi phí trong kỳ trên cả CF và AC.</w:t>
+            </w:r>
+          </w:p>
+          <w:p>
+            <w:pPr>
+              <w:spacing w:after="0" w:before="0"/>
+            </w:pPr>
+            <w:r>
+              <w:rPr>
+                <w:rFonts w:ascii="Calibri" w:hAnsi="Calibri"/>
+                <w:b w:val="0"/>
                 <w:i/>
-                <w:iCs/>
-                <w:color w:val="7A838D"/>
-                <w:sz w:val="22"/>
-                <w:szCs w:val="22"/>
-              </w:rPr>
-              <w:t xml:space="preserve">[Khách hàng nhập câu trả lời tại đây]</w:t>
-            </w:r>
-            <w:r>
-              <w:rPr>
-                <w:rFonts w:ascii="Calibri" w:cs="Calibri" w:eastAsia="Calibri" w:hAnsi="Calibri"/>
-                <w:color w:val="7A838D"/>
-                <w:sz w:val="22"/>
-                <w:szCs w:val="22"/>
-              </w:rPr>
-              <w:t xml:space="preserve">
-</w:t>
-            </w:r>
-          </w:p>
-          <w:p>
-            <w:pPr>
-              <w:spacing w:after="0" w:before="0"/>
-            </w:pPr>
-            <w:r>
-              <w:rPr>
-                <w:rFonts w:ascii="Calibri" w:cs="Calibri" w:eastAsia="Calibri" w:hAnsi="Calibri"/>
-                <w:b/>
-                <w:bCs/>
-                <w:color w:val="17365D"/>
-                <w:sz w:val="20"/>
-                <w:szCs w:val="20"/>
-              </w:rPr>
-              <w:t xml:space="preserve">Tài liệu/minh chứng đính kèm (nếu có): </w:t>
-            </w:r>
-            <w:r>
-              <w:rPr>
-                <w:rFonts w:ascii="Calibri" w:cs="Calibri" w:eastAsia="Calibri" w:hAnsi="Calibri"/>
-                <w:color w:val="5D6672"/>
-                <w:sz w:val="20"/>
-                <w:szCs w:val="20"/>
-              </w:rPr>
-              <w:t xml:space="preserve">________________________________________</w:t>
+                <w:color w:val="595959"/>
+                <w:sz w:val="19"/>
+              </w:rPr>
+              <w:t>Căn cứ tham khảo trong hồ sơ nghiệp vụ: P-11; BR-4.01.11 và BR-4.04.6.</w:t>
             </w:r>
           </w:p>
         </w:tc>
@@ -1584,44 +1495,45 @@
             </w:pPr>
             <w:r>
               <w:rPr>
-                <w:rFonts w:ascii="Calibri" w:cs="Calibri" w:eastAsia="Calibri" w:hAnsi="Calibri"/>
-                <w:color w:val="20242A"/>
-                <w:sz w:val="21"/>
-                <w:szCs w:val="21"/>
-              </w:rPr>
-              <w:t xml:space="preserve">☐ Cộng vào Doanh thu điện</w:t>
-            </w:r>
-          </w:p>
-          <w:p>
-            <w:pPr>
-              <w:keepNext/>
-              <w:spacing w:after="40" w:before="0" w:line="264"/>
-              <w:ind w:left="220"/>
-            </w:pPr>
-            <w:r>
-              <w:rPr>
-                <w:rFonts w:ascii="Calibri" w:cs="Calibri" w:eastAsia="Calibri" w:hAnsi="Calibri"/>
-                <w:color w:val="20242A"/>
-                <w:sz w:val="21"/>
-                <w:szCs w:val="21"/>
-              </w:rPr>
-              <w:t xml:space="preserve">☐ Tách dòng Điện khu vực chung</w:t>
-            </w:r>
-          </w:p>
-          <w:p>
-            <w:pPr>
-              <w:keepNext/>
-              <w:spacing w:after="40" w:before="0" w:line="264"/>
-              <w:ind w:left="220"/>
-            </w:pPr>
-            <w:r>
-              <w:rPr>
-                <w:rFonts w:ascii="Calibri" w:cs="Calibri" w:eastAsia="Calibri" w:hAnsi="Calibri"/>
-                <w:color w:val="20242A"/>
-                <w:sz w:val="21"/>
-                <w:szCs w:val="21"/>
-              </w:rPr>
-              <w:t xml:space="preserve">☐ Tùy từng tòa - vui lòng mô tả</w:t>
+                <w:rFonts w:ascii="Calibri" w:hAnsi="Calibri"/>
+                <w:b/>
+                <w:i w:val="0"/>
+                <w:color w:val="1F4E79"/>
+                <w:sz w:val="21"/>
+              </w:rPr>
+              <w:t>☒ Cộng vào Doanh thu điện</w:t>
+            </w:r>
+          </w:p>
+          <w:p>
+            <w:pPr>
+              <w:keepNext/>
+              <w:spacing w:after="40" w:before="0" w:line="264"/>
+              <w:ind w:left="220"/>
+            </w:pPr>
+            <w:r>
+              <w:rPr>
+                <w:rFonts w:ascii="Calibri" w:hAnsi="Calibri"/>
+                <w:b w:val="0"/>
+                <w:i w:val="0"/>
+                <w:sz w:val="21"/>
+              </w:rPr>
+              <w:t>☐ Tách dòng Điện khu vực chung</w:t>
+            </w:r>
+          </w:p>
+          <w:p>
+            <w:pPr>
+              <w:keepNext/>
+              <w:spacing w:after="40" w:before="0" w:line="264"/>
+              <w:ind w:left="220"/>
+            </w:pPr>
+            <w:r>
+              <w:rPr>
+                <w:rFonts w:ascii="Calibri" w:hAnsi="Calibri"/>
+                <w:b w:val="0"/>
+                <w:i w:val="0"/>
+                <w:sz w:val="21"/>
+              </w:rPr>
+              <w:t>☐ Tùy từng tòa - vui lòng mô tả</w:t>
             </w:r>
           </w:p>
           <w:p>
@@ -1659,66 +1571,44 @@
             </w:pPr>
             <w:r>
               <w:rPr>
-                <w:rFonts w:ascii="Calibri" w:cs="Calibri" w:eastAsia="Calibri" w:hAnsi="Calibri"/>
-                <w:b/>
-                <w:bCs/>
-                <w:color w:val="2E74B5"/>
-                <w:sz w:val="22"/>
-                <w:szCs w:val="22"/>
-              </w:rPr>
-              <w:t xml:space="preserve">Trả lời/xác nhận của khách hàng</w:t>
-            </w:r>
-          </w:p>
-          <w:p>
-            <w:pPr>
-              <w:shd w:fill="F5F7F9" w:val="clear"/>
-              <w:spacing w:after="90" w:before="0" w:line="300"/>
-            </w:pPr>
-            <w:r>
-              <w:rPr>
-                <w:rFonts w:ascii="Calibri" w:cs="Calibri" w:eastAsia="Calibri" w:hAnsi="Calibri"/>
+                <w:rFonts w:ascii="Calibri" w:hAnsi="Calibri"/>
+                <w:b/>
+                <w:i w:val="0"/>
+                <w:color w:val="1F4E79"/>
+                <w:sz w:val="22"/>
+              </w:rPr>
+              <w:t>Trả lời giả định do đội dự án đề xuất (chờ khách hàng xác nhận)</w:t>
+            </w:r>
+          </w:p>
+          <w:p>
+            <w:pPr>
+              <w:shd w:fill="DDEBF7" w:val="clear"/>
+              <w:spacing w:after="80" w:before="0" w:line="300"/>
+            </w:pPr>
+            <w:r>
+              <w:rPr>
+                <w:rFonts w:ascii="Calibri" w:hAnsi="Calibri"/>
+                <w:b w:val="0"/>
+                <w:i w:val="0"/>
+                <w:color w:val="1F4E79"/>
+                <w:sz w:val="21"/>
+              </w:rPr>
+              <w:t>Cộng điện khu vực chung vào chỉ tiêu Doanh thu điện để thống nhất với báo cáo tháng 8. Hệ thống vẫn lưu chi tiết và cho phép hiển thị dòng phụ 'Doanh thu điện chung' khi cần đối soát.</w:t>
+            </w:r>
+          </w:p>
+          <w:p>
+            <w:pPr>
+              <w:spacing w:after="0" w:before="0"/>
+            </w:pPr>
+            <w:r>
+              <w:rPr>
+                <w:rFonts w:ascii="Calibri" w:hAnsi="Calibri"/>
+                <w:b w:val="0"/>
                 <w:i/>
-                <w:iCs/>
-                <w:color w:val="7A838D"/>
-                <w:sz w:val="22"/>
-                <w:szCs w:val="22"/>
-              </w:rPr>
-              <w:t xml:space="preserve">[Khách hàng nhập câu trả lời tại đây]</w:t>
-            </w:r>
-            <w:r>
-              <w:rPr>
-                <w:rFonts w:ascii="Calibri" w:cs="Calibri" w:eastAsia="Calibri" w:hAnsi="Calibri"/>
-                <w:color w:val="7A838D"/>
-                <w:sz w:val="22"/>
-                <w:szCs w:val="22"/>
-              </w:rPr>
-              <w:t xml:space="preserve">
-</w:t>
-            </w:r>
-          </w:p>
-          <w:p>
-            <w:pPr>
-              <w:spacing w:after="0" w:before="0"/>
-            </w:pPr>
-            <w:r>
-              <w:rPr>
-                <w:rFonts w:ascii="Calibri" w:cs="Calibri" w:eastAsia="Calibri" w:hAnsi="Calibri"/>
-                <w:b/>
-                <w:bCs/>
-                <w:color w:val="17365D"/>
-                <w:sz w:val="20"/>
-                <w:szCs w:val="20"/>
-              </w:rPr>
-              <w:t xml:space="preserve">Tài liệu/minh chứng đính kèm (nếu có): </w:t>
-            </w:r>
-            <w:r>
-              <w:rPr>
-                <w:rFonts w:ascii="Calibri" w:cs="Calibri" w:eastAsia="Calibri" w:hAnsi="Calibri"/>
-                <w:color w:val="5D6672"/>
-                <w:sz w:val="20"/>
-                <w:szCs w:val="20"/>
-              </w:rPr>
-              <w:t xml:space="preserve">________________________________________</w:t>
+                <w:color w:val="595959"/>
+                <w:sz w:val="19"/>
+              </w:rPr>
+              <w:t>Căn cứ tham khảo trong hồ sơ nghiệp vụ: P-13; BR-5.03.6.</w:t>
             </w:r>
           </w:p>
         </w:tc>
@@ -1828,44 +1718,45 @@
             </w:pPr>
             <w:r>
               <w:rPr>
-                <w:rFonts w:ascii="Calibri" w:cs="Calibri" w:eastAsia="Calibri" w:hAnsi="Calibri"/>
-                <w:color w:val="20242A"/>
-                <w:sz w:val="21"/>
-                <w:szCs w:val="21"/>
-              </w:rPr>
-              <w:t xml:space="preserve">☐ Xác nhận toàn bộ</w:t>
-            </w:r>
-          </w:p>
-          <w:p>
-            <w:pPr>
-              <w:keepNext/>
-              <w:spacing w:after="40" w:before="0" w:line="264"/>
-              <w:ind w:left="220"/>
-            </w:pPr>
-            <w:r>
-              <w:rPr>
-                <w:rFonts w:ascii="Calibri" w:cs="Calibri" w:eastAsia="Calibri" w:hAnsi="Calibri"/>
-                <w:color w:val="20242A"/>
-                <w:sz w:val="21"/>
-                <w:szCs w:val="21"/>
-              </w:rPr>
-              <w:t xml:space="preserve">☐ Không xác nhận một hoặc nhiều nội dung - vui lòng chỉ rõ</w:t>
-            </w:r>
-          </w:p>
-          <w:p>
-            <w:pPr>
-              <w:keepNext/>
-              <w:spacing w:after="40" w:before="0" w:line="264"/>
-              <w:ind w:left="220"/>
-            </w:pPr>
-            <w:r>
-              <w:rPr>
-                <w:rFonts w:ascii="Calibri" w:cs="Calibri" w:eastAsia="Calibri" w:hAnsi="Calibri"/>
-                <w:color w:val="20242A"/>
-                <w:sz w:val="21"/>
-                <w:szCs w:val="21"/>
-              </w:rPr>
-              <w:t xml:space="preserve">☐ Áp dụng khác theo từng trường hợp - vui lòng mô tả</w:t>
+                <w:rFonts w:ascii="Calibri" w:hAnsi="Calibri"/>
+                <w:b/>
+                <w:i w:val="0"/>
+                <w:color w:val="1F4E79"/>
+                <w:sz w:val="21"/>
+              </w:rPr>
+              <w:t>☒ Xác nhận toàn bộ</w:t>
+            </w:r>
+          </w:p>
+          <w:p>
+            <w:pPr>
+              <w:keepNext/>
+              <w:spacing w:after="40" w:before="0" w:line="264"/>
+              <w:ind w:left="220"/>
+            </w:pPr>
+            <w:r>
+              <w:rPr>
+                <w:rFonts w:ascii="Calibri" w:hAnsi="Calibri"/>
+                <w:b w:val="0"/>
+                <w:i w:val="0"/>
+                <w:sz w:val="21"/>
+              </w:rPr>
+              <w:t>☐ Không xác nhận một hoặc nhiều nội dung - vui lòng chỉ rõ</w:t>
+            </w:r>
+          </w:p>
+          <w:p>
+            <w:pPr>
+              <w:keepNext/>
+              <w:spacing w:after="40" w:before="0" w:line="264"/>
+              <w:ind w:left="220"/>
+            </w:pPr>
+            <w:r>
+              <w:rPr>
+                <w:rFonts w:ascii="Calibri" w:hAnsi="Calibri"/>
+                <w:b w:val="0"/>
+                <w:i w:val="0"/>
+                <w:sz w:val="21"/>
+              </w:rPr>
+              <w:t>☐ Áp dụng khác theo từng trường hợp - vui lòng mô tả</w:t>
             </w:r>
           </w:p>
           <w:p>
@@ -1903,66 +1794,44 @@
             </w:pPr>
             <w:r>
               <w:rPr>
-                <w:rFonts w:ascii="Calibri" w:cs="Calibri" w:eastAsia="Calibri" w:hAnsi="Calibri"/>
-                <w:b/>
-                <w:bCs/>
-                <w:color w:val="2E74B5"/>
-                <w:sz w:val="22"/>
-                <w:szCs w:val="22"/>
-              </w:rPr>
-              <w:t xml:space="preserve">Trả lời/xác nhận của khách hàng</w:t>
-            </w:r>
-          </w:p>
-          <w:p>
-            <w:pPr>
-              <w:shd w:fill="F5F7F9" w:val="clear"/>
-              <w:spacing w:after="90" w:before="0" w:line="300"/>
-            </w:pPr>
-            <w:r>
-              <w:rPr>
-                <w:rFonts w:ascii="Calibri" w:cs="Calibri" w:eastAsia="Calibri" w:hAnsi="Calibri"/>
+                <w:rFonts w:ascii="Calibri" w:hAnsi="Calibri"/>
+                <w:b/>
+                <w:i w:val="0"/>
+                <w:color w:val="1F4E79"/>
+                <w:sz w:val="22"/>
+              </w:rPr>
+              <w:t>Trả lời giả định do đội dự án đề xuất (chờ khách hàng xác nhận)</w:t>
+            </w:r>
+          </w:p>
+          <w:p>
+            <w:pPr>
+              <w:shd w:fill="DDEBF7" w:val="clear"/>
+              <w:spacing w:after="80" w:before="0" w:line="300"/>
+            </w:pPr>
+            <w:r>
+              <w:rPr>
+                <w:rFonts w:ascii="Calibri" w:hAnsi="Calibri"/>
+                <w:b w:val="0"/>
+                <w:i w:val="0"/>
+                <w:color w:val="1F4E79"/>
+                <w:sz w:val="21"/>
+              </w:rPr>
+              <w:t>Xác nhận toàn bộ: tiền cọc không phải doanh thu; phần cọc bị giữ sau khi quyết toán được ghi Thu nhập khác; khoản khách trả trước nhiều tháng được treo doanh thu chưa thực hiện và phân bổ theo từng tháng sử dụng.</w:t>
+            </w:r>
+          </w:p>
+          <w:p>
+            <w:pPr>
+              <w:spacing w:after="0" w:before="0"/>
+            </w:pPr>
+            <w:r>
+              <w:rPr>
+                <w:rFonts w:ascii="Calibri" w:hAnsi="Calibri"/>
+                <w:b w:val="0"/>
                 <w:i/>
-                <w:iCs/>
-                <w:color w:val="7A838D"/>
-                <w:sz w:val="22"/>
-                <w:szCs w:val="22"/>
-              </w:rPr>
-              <w:t xml:space="preserve">[Khách hàng nhập câu trả lời tại đây]</w:t>
-            </w:r>
-            <w:r>
-              <w:rPr>
-                <w:rFonts w:ascii="Calibri" w:cs="Calibri" w:eastAsia="Calibri" w:hAnsi="Calibri"/>
-                <w:color w:val="7A838D"/>
-                <w:sz w:val="22"/>
-                <w:szCs w:val="22"/>
-              </w:rPr>
-              <w:t xml:space="preserve">
-</w:t>
-            </w:r>
-          </w:p>
-          <w:p>
-            <w:pPr>
-              <w:spacing w:after="0" w:before="0"/>
-            </w:pPr>
-            <w:r>
-              <w:rPr>
-                <w:rFonts w:ascii="Calibri" w:cs="Calibri" w:eastAsia="Calibri" w:hAnsi="Calibri"/>
-                <w:b/>
-                <w:bCs/>
-                <w:color w:val="17365D"/>
-                <w:sz w:val="20"/>
-                <w:szCs w:val="20"/>
-              </w:rPr>
-              <w:t xml:space="preserve">Tài liệu/minh chứng đính kèm (nếu có): </w:t>
-            </w:r>
-            <w:r>
-              <w:rPr>
-                <w:rFonts w:ascii="Calibri" w:cs="Calibri" w:eastAsia="Calibri" w:hAnsi="Calibri"/>
-                <w:color w:val="5D6672"/>
-                <w:sz w:val="20"/>
-                <w:szCs w:val="20"/>
-              </w:rPr>
-              <w:t xml:space="preserve">________________________________________</w:t>
+                <w:color w:val="595959"/>
+                <w:sz w:val="19"/>
+              </w:rPr>
+              <w:t>Căn cứ tham khảo trong hồ sơ nghiệp vụ: R-03, R-05; BR-5.02.3.</w:t>
             </w:r>
           </w:p>
         </w:tc>
@@ -2072,44 +1941,45 @@
             </w:pPr>
             <w:r>
               <w:rPr>
-                <w:rFonts w:ascii="Calibri" w:cs="Calibri" w:eastAsia="Calibri" w:hAnsi="Calibri"/>
-                <w:color w:val="20242A"/>
-                <w:sz w:val="21"/>
-                <w:szCs w:val="21"/>
-              </w:rPr>
-              <w:t xml:space="preserve">☐ Giữ các mốc 16/20 và điều chỉnh trong kỳ hiện tại</w:t>
-            </w:r>
-          </w:p>
-          <w:p>
-            <w:pPr>
-              <w:keepNext/>
-              <w:spacing w:after="40" w:before="0" w:line="264"/>
-              <w:ind w:left="220"/>
-            </w:pPr>
-            <w:r>
-              <w:rPr>
-                <w:rFonts w:ascii="Calibri" w:cs="Calibri" w:eastAsia="Calibri" w:hAnsi="Calibri"/>
-                <w:color w:val="20242A"/>
-                <w:sz w:val="21"/>
-                <w:szCs w:val="21"/>
-              </w:rPr>
-              <w:t xml:space="preserve">☐ Cho phép mở lại kỳ cũ</w:t>
-            </w:r>
-          </w:p>
-          <w:p>
-            <w:pPr>
-              <w:keepNext/>
-              <w:spacing w:after="40" w:before="0" w:line="264"/>
-              <w:ind w:left="220"/>
-            </w:pPr>
-            <w:r>
-              <w:rPr>
-                <w:rFonts w:ascii="Calibri" w:cs="Calibri" w:eastAsia="Calibri" w:hAnsi="Calibri"/>
-                <w:color w:val="20242A"/>
-                <w:sz w:val="21"/>
-                <w:szCs w:val="21"/>
-              </w:rPr>
-              <w:t xml:space="preserve">☐ Mốc hoặc cách xử lý khác - vui lòng mô tả</w:t>
+                <w:rFonts w:ascii="Calibri" w:hAnsi="Calibri"/>
+                <w:b/>
+                <w:i w:val="0"/>
+                <w:color w:val="1F4E79"/>
+                <w:sz w:val="21"/>
+              </w:rPr>
+              <w:t>☒ Giữ các mốc 16/20 và điều chỉnh trong kỳ hiện tại</w:t>
+            </w:r>
+          </w:p>
+          <w:p>
+            <w:pPr>
+              <w:keepNext/>
+              <w:spacing w:after="40" w:before="0" w:line="264"/>
+              <w:ind w:left="220"/>
+            </w:pPr>
+            <w:r>
+              <w:rPr>
+                <w:rFonts w:ascii="Calibri" w:hAnsi="Calibri"/>
+                <w:b w:val="0"/>
+                <w:i w:val="0"/>
+                <w:sz w:val="21"/>
+              </w:rPr>
+              <w:t>☐ Cho phép mở lại kỳ cũ</w:t>
+            </w:r>
+          </w:p>
+          <w:p>
+            <w:pPr>
+              <w:keepNext/>
+              <w:spacing w:after="40" w:before="0" w:line="264"/>
+              <w:ind w:left="220"/>
+            </w:pPr>
+            <w:r>
+              <w:rPr>
+                <w:rFonts w:ascii="Calibri" w:hAnsi="Calibri"/>
+                <w:b w:val="0"/>
+                <w:i w:val="0"/>
+                <w:sz w:val="21"/>
+              </w:rPr>
+              <w:t>☐ Mốc hoặc cách xử lý khác - vui lòng mô tả</w:t>
             </w:r>
           </w:p>
           <w:p>
@@ -2147,66 +2017,44 @@
             </w:pPr>
             <w:r>
               <w:rPr>
-                <w:rFonts w:ascii="Calibri" w:cs="Calibri" w:eastAsia="Calibri" w:hAnsi="Calibri"/>
-                <w:b/>
-                <w:bCs/>
-                <w:color w:val="2E74B5"/>
-                <w:sz w:val="22"/>
-                <w:szCs w:val="22"/>
-              </w:rPr>
-              <w:t xml:space="preserve">Trả lời/xác nhận của khách hàng</w:t>
-            </w:r>
-          </w:p>
-          <w:p>
-            <w:pPr>
-              <w:shd w:fill="F5F7F9" w:val="clear"/>
-              <w:spacing w:after="90" w:before="0" w:line="300"/>
-            </w:pPr>
-            <w:r>
-              <w:rPr>
-                <w:rFonts w:ascii="Calibri" w:cs="Calibri" w:eastAsia="Calibri" w:hAnsi="Calibri"/>
+                <w:rFonts w:ascii="Calibri" w:hAnsi="Calibri"/>
+                <w:b/>
+                <w:i w:val="0"/>
+                <w:color w:val="1F4E79"/>
+                <w:sz w:val="22"/>
+              </w:rPr>
+              <w:t>Trả lời giả định do đội dự án đề xuất (chờ khách hàng xác nhận)</w:t>
+            </w:r>
+          </w:p>
+          <w:p>
+            <w:pPr>
+              <w:shd w:fill="DDEBF7" w:val="clear"/>
+              <w:spacing w:after="80" w:before="0" w:line="300"/>
+            </w:pPr>
+            <w:r>
+              <w:rPr>
+                <w:rFonts w:ascii="Calibri" w:hAnsi="Calibri"/>
+                <w:b w:val="0"/>
+                <w:i w:val="0"/>
+                <w:color w:val="1F4E79"/>
+                <w:sz w:val="21"/>
+              </w:rPr>
+              <w:t>Giữ các mốc: chốt dữ liệu lương ngày 16, kiểm tra chi phí ngày 20 và khóa kỳ sau ngày 20. Khoản tiền nhận sau khi kỳ đã khóa được ghi nhận/điều chỉnh trong kỳ hiện tại, liên kết về chứng từ gốc và lưu audit; không tự động mở lại kỳ cũ. Chỉ Admin/Kế toán được mở lại khi có phê duyệt.</w:t>
+            </w:r>
+          </w:p>
+          <w:p>
+            <w:pPr>
+              <w:spacing w:after="0" w:before="0"/>
+            </w:pPr>
+            <w:r>
+              <w:rPr>
+                <w:rFonts w:ascii="Calibri" w:hAnsi="Calibri"/>
+                <w:b w:val="0"/>
                 <w:i/>
-                <w:iCs/>
-                <w:color w:val="7A838D"/>
-                <w:sz w:val="22"/>
-                <w:szCs w:val="22"/>
-              </w:rPr>
-              <w:t xml:space="preserve">[Khách hàng nhập câu trả lời tại đây]</w:t>
-            </w:r>
-            <w:r>
-              <w:rPr>
-                <w:rFonts w:ascii="Calibri" w:cs="Calibri" w:eastAsia="Calibri" w:hAnsi="Calibri"/>
-                <w:color w:val="7A838D"/>
-                <w:sz w:val="22"/>
-                <w:szCs w:val="22"/>
-              </w:rPr>
-              <w:t xml:space="preserve">
-</w:t>
-            </w:r>
-          </w:p>
-          <w:p>
-            <w:pPr>
-              <w:spacing w:after="0" w:before="0"/>
-            </w:pPr>
-            <w:r>
-              <w:rPr>
-                <w:rFonts w:ascii="Calibri" w:cs="Calibri" w:eastAsia="Calibri" w:hAnsi="Calibri"/>
-                <w:b/>
-                <w:bCs/>
-                <w:color w:val="17365D"/>
-                <w:sz w:val="20"/>
-                <w:szCs w:val="20"/>
-              </w:rPr>
-              <w:t xml:space="preserve">Tài liệu/minh chứng đính kèm (nếu có): </w:t>
-            </w:r>
-            <w:r>
-              <w:rPr>
-                <w:rFonts w:ascii="Calibri" w:cs="Calibri" w:eastAsia="Calibri" w:hAnsi="Calibri"/>
-                <w:color w:val="5D6672"/>
-                <w:sz w:val="20"/>
-                <w:szCs w:val="20"/>
-              </w:rPr>
-              <w:t xml:space="preserve">________________________________________</w:t>
+                <w:color w:val="595959"/>
+                <w:sz w:val="19"/>
+              </w:rPr>
+              <w:t>Căn cứ tham khảo trong hồ sơ nghiệp vụ: P-06, R-08; §5.1.</w:t>
             </w:r>
           </w:p>
         </w:tc>
@@ -2334,44 +2182,45 @@
             </w:pPr>
             <w:r>
               <w:rPr>
-                <w:rFonts w:ascii="Calibri" w:cs="Calibri" w:eastAsia="Calibri" w:hAnsi="Calibri"/>
-                <w:color w:val="20242A"/>
-                <w:sz w:val="21"/>
-                <w:szCs w:val="21"/>
-              </w:rPr>
-              <w:t xml:space="preserve">☐ Nợ cũ -&gt; dịch vụ -&gt; thu khác -&gt; tiền phòng -&gt; tiền cọc</w:t>
-            </w:r>
-          </w:p>
-          <w:p>
-            <w:pPr>
-              <w:keepNext/>
-              <w:spacing w:after="40" w:before="0" w:line="264"/>
-              <w:ind w:left="220"/>
-            </w:pPr>
-            <w:r>
-              <w:rPr>
-                <w:rFonts w:ascii="Calibri" w:cs="Calibri" w:eastAsia="Calibri" w:hAnsi="Calibri"/>
-                <w:color w:val="20242A"/>
-                <w:sz w:val="21"/>
-                <w:szCs w:val="21"/>
-              </w:rPr>
-              <w:t xml:space="preserve">☐ Tiền phòng trước, sau đó mới đến các khoản khác</w:t>
-            </w:r>
-          </w:p>
-          <w:p>
-            <w:pPr>
-              <w:keepNext/>
-              <w:spacing w:after="40" w:before="0" w:line="264"/>
-              <w:ind w:left="220"/>
-            </w:pPr>
-            <w:r>
-              <w:rPr>
-                <w:rFonts w:ascii="Calibri" w:cs="Calibri" w:eastAsia="Calibri" w:hAnsi="Calibri"/>
-                <w:color w:val="20242A"/>
-                <w:sz w:val="21"/>
-                <w:szCs w:val="21"/>
-              </w:rPr>
-              <w:t xml:space="preserve">☐ Cho nhân viên chọn thứ tự khi ghi nhận thanh toán</w:t>
+                <w:rFonts w:ascii="Calibri" w:hAnsi="Calibri"/>
+                <w:b/>
+                <w:i w:val="0"/>
+                <w:color w:val="1F4E79"/>
+                <w:sz w:val="21"/>
+              </w:rPr>
+              <w:t>☒ Nợ cũ -&gt; dịch vụ -&gt; thu khác -&gt; tiền phòng -&gt; tiền cọc</w:t>
+            </w:r>
+          </w:p>
+          <w:p>
+            <w:pPr>
+              <w:keepNext/>
+              <w:spacing w:after="40" w:before="0" w:line="264"/>
+              <w:ind w:left="220"/>
+            </w:pPr>
+            <w:r>
+              <w:rPr>
+                <w:rFonts w:ascii="Calibri" w:hAnsi="Calibri"/>
+                <w:b w:val="0"/>
+                <w:i w:val="0"/>
+                <w:sz w:val="21"/>
+              </w:rPr>
+              <w:t>☐ Tiền phòng trước, sau đó mới đến các khoản khác</w:t>
+            </w:r>
+          </w:p>
+          <w:p>
+            <w:pPr>
+              <w:keepNext/>
+              <w:spacing w:after="40" w:before="0" w:line="264"/>
+              <w:ind w:left="220"/>
+            </w:pPr>
+            <w:r>
+              <w:rPr>
+                <w:rFonts w:ascii="Calibri" w:hAnsi="Calibri"/>
+                <w:b w:val="0"/>
+                <w:i w:val="0"/>
+                <w:sz w:val="21"/>
+              </w:rPr>
+              <w:t>☐ Cho nhân viên chọn thứ tự khi ghi nhận thanh toán</w:t>
             </w:r>
           </w:p>
           <w:p>
@@ -2409,66 +2258,44 @@
             </w:pPr>
             <w:r>
               <w:rPr>
-                <w:rFonts w:ascii="Calibri" w:cs="Calibri" w:eastAsia="Calibri" w:hAnsi="Calibri"/>
-                <w:b/>
-                <w:bCs/>
-                <w:color w:val="2E74B5"/>
-                <w:sz w:val="22"/>
-                <w:szCs w:val="22"/>
-              </w:rPr>
-              <w:t xml:space="preserve">Trả lời/xác nhận của khách hàng</w:t>
-            </w:r>
-          </w:p>
-          <w:p>
-            <w:pPr>
-              <w:shd w:fill="F5F7F9" w:val="clear"/>
-              <w:spacing w:after="90" w:before="0" w:line="300"/>
-            </w:pPr>
-            <w:r>
-              <w:rPr>
-                <w:rFonts w:ascii="Calibri" w:cs="Calibri" w:eastAsia="Calibri" w:hAnsi="Calibri"/>
+                <w:rFonts w:ascii="Calibri" w:hAnsi="Calibri"/>
+                <w:b/>
+                <w:i w:val="0"/>
+                <w:color w:val="1F4E79"/>
+                <w:sz w:val="22"/>
+              </w:rPr>
+              <w:t>Trả lời giả định do đội dự án đề xuất (chờ khách hàng xác nhận)</w:t>
+            </w:r>
+          </w:p>
+          <w:p>
+            <w:pPr>
+              <w:shd w:fill="DDEBF7" w:val="clear"/>
+              <w:spacing w:after="80" w:before="0" w:line="300"/>
+            </w:pPr>
+            <w:r>
+              <w:rPr>
+                <w:rFonts w:ascii="Calibri" w:hAnsi="Calibri"/>
+                <w:b w:val="0"/>
+                <w:i w:val="0"/>
+                <w:color w:val="1F4E79"/>
+                <w:sz w:val="21"/>
+              </w:rPr>
+              <w:t>Phân bổ theo thứ tự: nợ cũ → bảy nhóm dịch vụ và điện chung → thu khác/phạt → tiền phòng → tiền cọc. Kế toán được đổi thứ tự cho một giao dịch cụ thể nhưng bắt buộc nhập lý do và lưu audit.</w:t>
+            </w:r>
+          </w:p>
+          <w:p>
+            <w:pPr>
+              <w:spacing w:after="0" w:before="0"/>
+            </w:pPr>
+            <w:r>
+              <w:rPr>
+                <w:rFonts w:ascii="Calibri" w:hAnsi="Calibri"/>
+                <w:b w:val="0"/>
                 <w:i/>
-                <w:iCs/>
-                <w:color w:val="7A838D"/>
-                <w:sz w:val="22"/>
-                <w:szCs w:val="22"/>
-              </w:rPr>
-              <w:t xml:space="preserve">[Khách hàng nhập câu trả lời tại đây]</w:t>
-            </w:r>
-            <w:r>
-              <w:rPr>
-                <w:rFonts w:ascii="Calibri" w:cs="Calibri" w:eastAsia="Calibri" w:hAnsi="Calibri"/>
-                <w:color w:val="7A838D"/>
-                <w:sz w:val="22"/>
-                <w:szCs w:val="22"/>
-              </w:rPr>
-              <w:t xml:space="preserve">
-</w:t>
-            </w:r>
-          </w:p>
-          <w:p>
-            <w:pPr>
-              <w:spacing w:after="0" w:before="0"/>
-            </w:pPr>
-            <w:r>
-              <w:rPr>
-                <w:rFonts w:ascii="Calibri" w:cs="Calibri" w:eastAsia="Calibri" w:hAnsi="Calibri"/>
-                <w:b/>
-                <w:bCs/>
-                <w:color w:val="17365D"/>
-                <w:sz w:val="20"/>
-                <w:szCs w:val="20"/>
-              </w:rPr>
-              <w:t xml:space="preserve">Tài liệu/minh chứng đính kèm (nếu có): </w:t>
-            </w:r>
-            <w:r>
-              <w:rPr>
-                <w:rFonts w:ascii="Calibri" w:cs="Calibri" w:eastAsia="Calibri" w:hAnsi="Calibri"/>
-                <w:color w:val="5D6672"/>
-                <w:sz w:val="20"/>
-                <w:szCs w:val="20"/>
-              </w:rPr>
-              <w:t xml:space="preserve">________________________________________</w:t>
+                <w:color w:val="595959"/>
+                <w:sz w:val="19"/>
+              </w:rPr>
+              <w:t>Căn cứ tham khảo trong hồ sơ nghiệp vụ: P-14; BR-5.02.9 và BR-2.10.4.</w:t>
             </w:r>
           </w:p>
         </w:tc>
@@ -2578,44 +2405,45 @@
             </w:pPr>
             <w:r>
               <w:rPr>
-                <w:rFonts w:ascii="Calibri" w:cs="Calibri" w:eastAsia="Calibri" w:hAnsi="Calibri"/>
-                <w:color w:val="20242A"/>
-                <w:sz w:val="21"/>
-                <w:szCs w:val="21"/>
-              </w:rPr>
-              <w:t xml:space="preserve">☐ Tính từ ngày phát hành hóa đơn</w:t>
-            </w:r>
-          </w:p>
-          <w:p>
-            <w:pPr>
-              <w:keepNext/>
-              <w:spacing w:after="40" w:before="0" w:line="264"/>
-              <w:ind w:left="220"/>
-            </w:pPr>
-            <w:r>
-              <w:rPr>
-                <w:rFonts w:ascii="Calibri" w:cs="Calibri" w:eastAsia="Calibri" w:hAnsi="Calibri"/>
-                <w:color w:val="20242A"/>
-                <w:sz w:val="21"/>
-                <w:szCs w:val="21"/>
-              </w:rPr>
-              <w:t xml:space="preserve">☐ Tính từ ngày hết hạn thanh toán</w:t>
-            </w:r>
-          </w:p>
-          <w:p>
-            <w:pPr>
-              <w:keepNext/>
-              <w:spacing w:after="40" w:before="0" w:line="264"/>
-              <w:ind w:left="220"/>
-            </w:pPr>
-            <w:r>
-              <w:rPr>
-                <w:rFonts w:ascii="Calibri" w:cs="Calibri" w:eastAsia="Calibri" w:hAnsi="Calibri"/>
-                <w:color w:val="20242A"/>
-                <w:sz w:val="21"/>
-                <w:szCs w:val="21"/>
-              </w:rPr>
-              <w:t xml:space="preserve">☐ Quy tắc khác - vui lòng ghi rõ cả ngày bắt đầu và mức trần</w:t>
+                <w:rFonts w:ascii="Calibri" w:hAnsi="Calibri"/>
+                <w:b/>
+                <w:i w:val="0"/>
+                <w:color w:val="1F4E79"/>
+                <w:sz w:val="21"/>
+              </w:rPr>
+              <w:t>☒ Tính từ ngày phát hành hóa đơn</w:t>
+            </w:r>
+          </w:p>
+          <w:p>
+            <w:pPr>
+              <w:keepNext/>
+              <w:spacing w:after="40" w:before="0" w:line="264"/>
+              <w:ind w:left="220"/>
+            </w:pPr>
+            <w:r>
+              <w:rPr>
+                <w:rFonts w:ascii="Calibri" w:hAnsi="Calibri"/>
+                <w:b w:val="0"/>
+                <w:i w:val="0"/>
+                <w:sz w:val="21"/>
+              </w:rPr>
+              <w:t>☐ Tính từ ngày hết hạn thanh toán</w:t>
+            </w:r>
+          </w:p>
+          <w:p>
+            <w:pPr>
+              <w:keepNext/>
+              <w:spacing w:after="40" w:before="0" w:line="264"/>
+              <w:ind w:left="220"/>
+            </w:pPr>
+            <w:r>
+              <w:rPr>
+                <w:rFonts w:ascii="Calibri" w:hAnsi="Calibri"/>
+                <w:b w:val="0"/>
+                <w:i w:val="0"/>
+                <w:sz w:val="21"/>
+              </w:rPr>
+              <w:t>☐ Quy tắc khác - vui lòng ghi rõ cả ngày bắt đầu và mức trần</w:t>
             </w:r>
           </w:p>
           <w:p>
@@ -2653,66 +2481,44 @@
             </w:pPr>
             <w:r>
               <w:rPr>
-                <w:rFonts w:ascii="Calibri" w:cs="Calibri" w:eastAsia="Calibri" w:hAnsi="Calibri"/>
-                <w:b/>
-                <w:bCs/>
-                <w:color w:val="2E74B5"/>
-                <w:sz w:val="22"/>
-                <w:szCs w:val="22"/>
-              </w:rPr>
-              <w:t xml:space="preserve">Trả lời/xác nhận của khách hàng</w:t>
-            </w:r>
-          </w:p>
-          <w:p>
-            <w:pPr>
-              <w:shd w:fill="F5F7F9" w:val="clear"/>
-              <w:spacing w:after="90" w:before="0" w:line="300"/>
-            </w:pPr>
-            <w:r>
-              <w:rPr>
-                <w:rFonts w:ascii="Calibri" w:cs="Calibri" w:eastAsia="Calibri" w:hAnsi="Calibri"/>
+                <w:rFonts w:ascii="Calibri" w:hAnsi="Calibri"/>
+                <w:b/>
+                <w:i w:val="0"/>
+                <w:color w:val="1F4E79"/>
+                <w:sz w:val="22"/>
+              </w:rPr>
+              <w:t>Trả lời giả định do đội dự án đề xuất (chờ khách hàng xác nhận)</w:t>
+            </w:r>
+          </w:p>
+          <w:p>
+            <w:pPr>
+              <w:shd w:fill="DDEBF7" w:val="clear"/>
+              <w:spacing w:after="80" w:before="0" w:line="300"/>
+            </w:pPr>
+            <w:r>
+              <w:rPr>
+                <w:rFonts w:ascii="Calibri" w:hAnsi="Calibri"/>
+                <w:b w:val="0"/>
+                <w:i w:val="0"/>
+                <w:color w:val="1F4E79"/>
+                <w:sz w:val="21"/>
+              </w:rPr>
+              <w:t>Mốc chuyển công nợ là hết 5 ngày kể từ ngày phát hành hóa đơn. Tiền phạt 200.000 đồng/ngày bắt đầu từ ngày thứ 6 sau ngày phát hành, không đặt trần mặc định nhưng ưu tiên điều khoản riêng của hợp đồng. Hệ thống chỉ đề xuất; quản lý xác nhận/miễn và kế toán duyệt trước khi đưa vào Thu khác của hóa đơn kỳ sau.</w:t>
+            </w:r>
+          </w:p>
+          <w:p>
+            <w:pPr>
+              <w:spacing w:after="0" w:before="0"/>
+            </w:pPr>
+            <w:r>
+              <w:rPr>
+                <w:rFonts w:ascii="Calibri" w:hAnsi="Calibri"/>
+                <w:b w:val="0"/>
                 <w:i/>
-                <w:iCs/>
-                <w:color w:val="7A838D"/>
-                <w:sz w:val="22"/>
-                <w:szCs w:val="22"/>
-              </w:rPr>
-              <w:t xml:space="preserve">[Khách hàng nhập câu trả lời tại đây]</w:t>
-            </w:r>
-            <w:r>
-              <w:rPr>
-                <w:rFonts w:ascii="Calibri" w:cs="Calibri" w:eastAsia="Calibri" w:hAnsi="Calibri"/>
-                <w:color w:val="7A838D"/>
-                <w:sz w:val="22"/>
-                <w:szCs w:val="22"/>
-              </w:rPr>
-              <w:t xml:space="preserve">
-</w:t>
-            </w:r>
-          </w:p>
-          <w:p>
-            <w:pPr>
-              <w:spacing w:after="0" w:before="0"/>
-            </w:pPr>
-            <w:r>
-              <w:rPr>
-                <w:rFonts w:ascii="Calibri" w:cs="Calibri" w:eastAsia="Calibri" w:hAnsi="Calibri"/>
-                <w:b/>
-                <w:bCs/>
-                <w:color w:val="17365D"/>
-                <w:sz w:val="20"/>
-                <w:szCs w:val="20"/>
-              </w:rPr>
-              <w:t xml:space="preserve">Tài liệu/minh chứng đính kèm (nếu có): </w:t>
-            </w:r>
-            <w:r>
-              <w:rPr>
-                <w:rFonts w:ascii="Calibri" w:cs="Calibri" w:eastAsia="Calibri" w:hAnsi="Calibri"/>
-                <w:color w:val="5D6672"/>
-                <w:sz w:val="20"/>
-                <w:szCs w:val="20"/>
-              </w:rPr>
-              <w:t xml:space="preserve">________________________________________</w:t>
+                <w:color w:val="595959"/>
+                <w:sz w:val="19"/>
+              </w:rPr>
+              <w:t>Căn cứ tham khảo trong hồ sơ nghiệp vụ: P-17, P-09; R-13.</w:t>
             </w:r>
           </w:p>
         </w:tc>
@@ -2822,44 +2628,45 @@
             </w:pPr>
             <w:r>
               <w:rPr>
-                <w:rFonts w:ascii="Calibri" w:cs="Calibri" w:eastAsia="Calibri" w:hAnsi="Calibri"/>
-                <w:color w:val="20242A"/>
-                <w:sz w:val="21"/>
-                <w:szCs w:val="21"/>
-              </w:rPr>
-              <w:t xml:space="preserve">☐ Có - tính tại thời điểm nhân viên thu</w:t>
-            </w:r>
-          </w:p>
-          <w:p>
-            <w:pPr>
-              <w:keepNext/>
-              <w:spacing w:after="40" w:before="0" w:line="264"/>
-              <w:ind w:left="220"/>
-            </w:pPr>
-            <w:r>
-              <w:rPr>
-                <w:rFonts w:ascii="Calibri" w:cs="Calibri" w:eastAsia="Calibri" w:hAnsi="Calibri"/>
-                <w:color w:val="20242A"/>
-                <w:sz w:val="21"/>
-                <w:szCs w:val="21"/>
-              </w:rPr>
-              <w:t xml:space="preserve">☐ Không - chỉ tính khi công ty nhận tiền</w:t>
-            </w:r>
-          </w:p>
-          <w:p>
-            <w:pPr>
-              <w:keepNext/>
-              <w:spacing w:after="40" w:before="0" w:line="264"/>
-              <w:ind w:left="220"/>
-            </w:pPr>
-            <w:r>
-              <w:rPr>
-                <w:rFonts w:ascii="Calibri" w:cs="Calibri" w:eastAsia="Calibri" w:hAnsi="Calibri"/>
-                <w:color w:val="20242A"/>
-                <w:sz w:val="21"/>
-                <w:szCs w:val="21"/>
-              </w:rPr>
-              <w:t xml:space="preserve">☐ Tính có điều kiện - vui lòng mô tả điều kiện</w:t>
+                <w:rFonts w:ascii="Calibri" w:hAnsi="Calibri"/>
+                <w:b w:val="0"/>
+                <w:i w:val="0"/>
+                <w:sz w:val="21"/>
+              </w:rPr>
+              <w:t>☐ Có - tính tại thời điểm nhân viên thu</w:t>
+            </w:r>
+          </w:p>
+          <w:p>
+            <w:pPr>
+              <w:keepNext/>
+              <w:spacing w:after="40" w:before="0" w:line="264"/>
+              <w:ind w:left="220"/>
+            </w:pPr>
+            <w:r>
+              <w:rPr>
+                <w:rFonts w:ascii="Calibri" w:hAnsi="Calibri"/>
+                <w:b/>
+                <w:i w:val="0"/>
+                <w:color w:val="1F4E79"/>
+                <w:sz w:val="21"/>
+              </w:rPr>
+              <w:t>☒ Không - chỉ tính khi công ty nhận tiền</w:t>
+            </w:r>
+          </w:p>
+          <w:p>
+            <w:pPr>
+              <w:keepNext/>
+              <w:spacing w:after="40" w:before="0" w:line="264"/>
+              <w:ind w:left="220"/>
+            </w:pPr>
+            <w:r>
+              <w:rPr>
+                <w:rFonts w:ascii="Calibri" w:hAnsi="Calibri"/>
+                <w:b w:val="0"/>
+                <w:i w:val="0"/>
+                <w:sz w:val="21"/>
+              </w:rPr>
+              <w:t>☐ Tính có điều kiện - vui lòng mô tả điều kiện</w:t>
             </w:r>
           </w:p>
           <w:p>
@@ -2897,66 +2704,44 @@
             </w:pPr>
             <w:r>
               <w:rPr>
-                <w:rFonts w:ascii="Calibri" w:cs="Calibri" w:eastAsia="Calibri" w:hAnsi="Calibri"/>
-                <w:b/>
-                <w:bCs/>
-                <w:color w:val="2E74B5"/>
-                <w:sz w:val="22"/>
-                <w:szCs w:val="22"/>
-              </w:rPr>
-              <w:t xml:space="preserve">Trả lời/xác nhận của khách hàng</w:t>
-            </w:r>
-          </w:p>
-          <w:p>
-            <w:pPr>
-              <w:shd w:fill="F5F7F9" w:val="clear"/>
-              <w:spacing w:after="90" w:before="0" w:line="300"/>
-            </w:pPr>
-            <w:r>
-              <w:rPr>
-                <w:rFonts w:ascii="Calibri" w:cs="Calibri" w:eastAsia="Calibri" w:hAnsi="Calibri"/>
+                <w:rFonts w:ascii="Calibri" w:hAnsi="Calibri"/>
+                <w:b/>
+                <w:i w:val="0"/>
+                <w:color w:val="1F4E79"/>
+                <w:sz w:val="22"/>
+              </w:rPr>
+              <w:t>Trả lời giả định do đội dự án đề xuất (chờ khách hàng xác nhận)</w:t>
+            </w:r>
+          </w:p>
+          <w:p>
+            <w:pPr>
+              <w:shd w:fill="DDEBF7" w:val="clear"/>
+              <w:spacing w:after="80" w:before="0" w:line="300"/>
+            </w:pPr>
+            <w:r>
+              <w:rPr>
+                <w:rFonts w:ascii="Calibri" w:hAnsi="Calibri"/>
+                <w:b w:val="0"/>
+                <w:i w:val="0"/>
+                <w:color w:val="1F4E79"/>
+                <w:sz w:val="21"/>
+              </w:rPr>
+              <w:t>Không tính vào M5/M10/M15 tại thời điểm nhân viên thu. Chỉ tính khi tiền đã nộp về công ty và payment được kế toán chuyển sang trạng thái Đã xác nhận.</w:t>
+            </w:r>
+          </w:p>
+          <w:p>
+            <w:pPr>
+              <w:spacing w:after="0" w:before="0"/>
+            </w:pPr>
+            <w:r>
+              <w:rPr>
+                <w:rFonts w:ascii="Calibri" w:hAnsi="Calibri"/>
+                <w:b w:val="0"/>
                 <w:i/>
-                <w:iCs/>
-                <w:color w:val="7A838D"/>
-                <w:sz w:val="22"/>
-                <w:szCs w:val="22"/>
-              </w:rPr>
-              <w:t xml:space="preserve">[Khách hàng nhập câu trả lời tại đây]</w:t>
-            </w:r>
-            <w:r>
-              <w:rPr>
-                <w:rFonts w:ascii="Calibri" w:cs="Calibri" w:eastAsia="Calibri" w:hAnsi="Calibri"/>
-                <w:color w:val="7A838D"/>
-                <w:sz w:val="22"/>
-                <w:szCs w:val="22"/>
-              </w:rPr>
-              <w:t xml:space="preserve">
-</w:t>
-            </w:r>
-          </w:p>
-          <w:p>
-            <w:pPr>
-              <w:spacing w:after="0" w:before="0"/>
-            </w:pPr>
-            <w:r>
-              <w:rPr>
-                <w:rFonts w:ascii="Calibri" w:cs="Calibri" w:eastAsia="Calibri" w:hAnsi="Calibri"/>
-                <w:b/>
-                <w:bCs/>
-                <w:color w:val="17365D"/>
-                <w:sz w:val="20"/>
-                <w:szCs w:val="20"/>
-              </w:rPr>
-              <w:t xml:space="preserve">Tài liệu/minh chứng đính kèm (nếu có): </w:t>
-            </w:r>
-            <w:r>
-              <w:rPr>
-                <w:rFonts w:ascii="Calibri" w:cs="Calibri" w:eastAsia="Calibri" w:hAnsi="Calibri"/>
-                <w:color w:val="5D6672"/>
-                <w:sz w:val="20"/>
-                <w:szCs w:val="20"/>
-              </w:rPr>
-              <w:t xml:space="preserve">________________________________________</w:t>
+                <w:color w:val="595959"/>
+                <w:sz w:val="19"/>
+              </w:rPr>
+              <w:t>Căn cứ tham khảo trong hồ sơ nghiệp vụ: P-26; M-2.10 và M-3.04.</w:t>
             </w:r>
           </w:p>
         </w:tc>
@@ -3066,44 +2851,45 @@
             </w:pPr>
             <w:r>
               <w:rPr>
-                <w:rFonts w:ascii="Calibri" w:cs="Calibri" w:eastAsia="Calibri" w:hAnsi="Calibri"/>
-                <w:color w:val="20242A"/>
-                <w:sz w:val="21"/>
-                <w:szCs w:val="21"/>
-              </w:rPr>
-              <w:t xml:space="preserve">☐ Luôn chia 30 ngày</w:t>
-            </w:r>
-          </w:p>
-          <w:p>
-            <w:pPr>
-              <w:keepNext/>
-              <w:spacing w:after="40" w:before="0" w:line="264"/>
-              <w:ind w:left="220"/>
-            </w:pPr>
-            <w:r>
-              <w:rPr>
-                <w:rFonts w:ascii="Calibri" w:cs="Calibri" w:eastAsia="Calibri" w:hAnsi="Calibri"/>
-                <w:color w:val="20242A"/>
-                <w:sz w:val="21"/>
-                <w:szCs w:val="21"/>
-              </w:rPr>
-              <w:t xml:space="preserve">☐ Luôn chia số ngày thực tế của tháng</w:t>
-            </w:r>
-          </w:p>
-          <w:p>
-            <w:pPr>
-              <w:keepNext/>
-              <w:spacing w:after="40" w:before="0" w:line="264"/>
-              <w:ind w:left="220"/>
-            </w:pPr>
-            <w:r>
-              <w:rPr>
-                <w:rFonts w:ascii="Calibri" w:cs="Calibri" w:eastAsia="Calibri" w:hAnsi="Calibri"/>
-                <w:color w:val="20242A"/>
-                <w:sz w:val="21"/>
-                <w:szCs w:val="21"/>
-              </w:rPr>
-              <w:t xml:space="preserve">☐ Mỗi nghiệp vụ áp dụng khác nhau - vui lòng lập bảng quy tắc</w:t>
+                <w:rFonts w:ascii="Calibri" w:hAnsi="Calibri"/>
+                <w:b/>
+                <w:i w:val="0"/>
+                <w:color w:val="1F4E79"/>
+                <w:sz w:val="21"/>
+              </w:rPr>
+              <w:t>☒ Luôn chia 30 ngày</w:t>
+            </w:r>
+          </w:p>
+          <w:p>
+            <w:pPr>
+              <w:keepNext/>
+              <w:spacing w:after="40" w:before="0" w:line="264"/>
+              <w:ind w:left="220"/>
+            </w:pPr>
+            <w:r>
+              <w:rPr>
+                <w:rFonts w:ascii="Calibri" w:hAnsi="Calibri"/>
+                <w:b w:val="0"/>
+                <w:i w:val="0"/>
+                <w:sz w:val="21"/>
+              </w:rPr>
+              <w:t>☐ Luôn chia số ngày thực tế của tháng</w:t>
+            </w:r>
+          </w:p>
+          <w:p>
+            <w:pPr>
+              <w:keepNext/>
+              <w:spacing w:after="40" w:before="0" w:line="264"/>
+              <w:ind w:left="220"/>
+            </w:pPr>
+            <w:r>
+              <w:rPr>
+                <w:rFonts w:ascii="Calibri" w:hAnsi="Calibri"/>
+                <w:b w:val="0"/>
+                <w:i w:val="0"/>
+                <w:sz w:val="21"/>
+              </w:rPr>
+              <w:t>☐ Mỗi nghiệp vụ áp dụng khác nhau - vui lòng lập bảng quy tắc</w:t>
             </w:r>
           </w:p>
           <w:p>
@@ -3141,66 +2927,44 @@
             </w:pPr>
             <w:r>
               <w:rPr>
-                <w:rFonts w:ascii="Calibri" w:cs="Calibri" w:eastAsia="Calibri" w:hAnsi="Calibri"/>
-                <w:b/>
-                <w:bCs/>
-                <w:color w:val="2E74B5"/>
-                <w:sz w:val="22"/>
-                <w:szCs w:val="22"/>
-              </w:rPr>
-              <w:t xml:space="preserve">Trả lời/xác nhận của khách hàng</w:t>
-            </w:r>
-          </w:p>
-          <w:p>
-            <w:pPr>
-              <w:shd w:fill="F5F7F9" w:val="clear"/>
-              <w:spacing w:after="90" w:before="0" w:line="300"/>
-            </w:pPr>
-            <w:r>
-              <w:rPr>
-                <w:rFonts w:ascii="Calibri" w:cs="Calibri" w:eastAsia="Calibri" w:hAnsi="Calibri"/>
+                <w:rFonts w:ascii="Calibri" w:hAnsi="Calibri"/>
+                <w:b/>
+                <w:i w:val="0"/>
+                <w:color w:val="1F4E79"/>
+                <w:sz w:val="22"/>
+              </w:rPr>
+              <w:t>Trả lời giả định do đội dự án đề xuất (chờ khách hàng xác nhận)</w:t>
+            </w:r>
+          </w:p>
+          <w:p>
+            <w:pPr>
+              <w:shd w:fill="DDEBF7" w:val="clear"/>
+              <w:spacing w:after="80" w:before="0" w:line="300"/>
+            </w:pPr>
+            <w:r>
+              <w:rPr>
+                <w:rFonts w:ascii="Calibri" w:hAnsi="Calibri"/>
+                <w:b w:val="0"/>
+                <w:i w:val="0"/>
+                <w:color w:val="1F4E79"/>
+                <w:sz w:val="21"/>
+              </w:rPr>
+              <w:t>Thống nhất chia cố định 30 ngày cho tất cả nghiệp vụ prorate: hóa đơn, hoàn cọc, hoa hồng khách bỏ cọc và doanh thu thu thêm. Dữ liệu mẫu đang chia 31 được ghi nhận là chênh lệch quy tắc khi đối soát, không tiếp tục dùng làm công thức hệ thống.</w:t>
+            </w:r>
+          </w:p>
+          <w:p>
+            <w:pPr>
+              <w:spacing w:after="0" w:before="0"/>
+            </w:pPr>
+            <w:r>
+              <w:rPr>
+                <w:rFonts w:ascii="Calibri" w:hAnsi="Calibri"/>
+                <w:b w:val="0"/>
                 <w:i/>
-                <w:iCs/>
-                <w:color w:val="7A838D"/>
-                <w:sz w:val="22"/>
-                <w:szCs w:val="22"/>
-              </w:rPr>
-              <w:t xml:space="preserve">[Khách hàng nhập câu trả lời tại đây]</w:t>
-            </w:r>
-            <w:r>
-              <w:rPr>
-                <w:rFonts w:ascii="Calibri" w:cs="Calibri" w:eastAsia="Calibri" w:hAnsi="Calibri"/>
-                <w:color w:val="7A838D"/>
-                <w:sz w:val="22"/>
-                <w:szCs w:val="22"/>
-              </w:rPr>
-              <w:t xml:space="preserve">
-</w:t>
-            </w:r>
-          </w:p>
-          <w:p>
-            <w:pPr>
-              <w:spacing w:after="0" w:before="0"/>
-            </w:pPr>
-            <w:r>
-              <w:rPr>
-                <w:rFonts w:ascii="Calibri" w:cs="Calibri" w:eastAsia="Calibri" w:hAnsi="Calibri"/>
-                <w:b/>
-                <w:bCs/>
-                <w:color w:val="17365D"/>
-                <w:sz w:val="20"/>
-                <w:szCs w:val="20"/>
-              </w:rPr>
-              <w:t xml:space="preserve">Tài liệu/minh chứng đính kèm (nếu có): </w:t>
-            </w:r>
-            <w:r>
-              <w:rPr>
-                <w:rFonts w:ascii="Calibri" w:cs="Calibri" w:eastAsia="Calibri" w:hAnsi="Calibri"/>
-                <w:color w:val="5D6672"/>
-                <w:sz w:val="20"/>
-                <w:szCs w:val="20"/>
-              </w:rPr>
-              <w:t xml:space="preserve">________________________________________</w:t>
+                <w:color w:val="595959"/>
+                <w:sz w:val="19"/>
+              </w:rPr>
+              <w:t>Căn cứ tham khảo trong hồ sơ nghiệp vụ: P-03; §2.9, §2.13 và §4.3.</w:t>
             </w:r>
           </w:p>
         </w:tc>
@@ -3310,44 +3074,45 @@
             </w:pPr>
             <w:r>
               <w:rPr>
-                <w:rFonts w:ascii="Calibri" w:cs="Calibri" w:eastAsia="Calibri" w:hAnsi="Calibri"/>
-                <w:color w:val="20242A"/>
-                <w:sz w:val="21"/>
-                <w:szCs w:val="21"/>
-              </w:rPr>
-              <w:t xml:space="preserve">☐ Áp dụng chung toàn hệ thống</w:t>
-            </w:r>
-          </w:p>
-          <w:p>
-            <w:pPr>
-              <w:keepNext/>
-              <w:spacing w:after="40" w:before="0" w:line="264"/>
-              <w:ind w:left="220"/>
-            </w:pPr>
-            <w:r>
-              <w:rPr>
-                <w:rFonts w:ascii="Calibri" w:cs="Calibri" w:eastAsia="Calibri" w:hAnsi="Calibri"/>
-                <w:color w:val="20242A"/>
-                <w:sz w:val="21"/>
-                <w:szCs w:val="21"/>
-              </w:rPr>
-              <w:t xml:space="preserve">☐ Cấu hình riêng theo từng tòa</w:t>
-            </w:r>
-          </w:p>
-          <w:p>
-            <w:pPr>
-              <w:keepNext/>
-              <w:spacing w:after="40" w:before="0" w:line="264"/>
-              <w:ind w:left="220"/>
-            </w:pPr>
-            <w:r>
-              <w:rPr>
-                <w:rFonts w:ascii="Calibri" w:cs="Calibri" w:eastAsia="Calibri" w:hAnsi="Calibri"/>
-                <w:color w:val="20242A"/>
-                <w:sz w:val="21"/>
-                <w:szCs w:val="21"/>
-              </w:rPr>
-              <w:t xml:space="preserve">☐ Không dùng mặc định; nhân viên nhập thực tế từng trường hợp</w:t>
+                <w:rFonts w:ascii="Calibri" w:hAnsi="Calibri"/>
+                <w:b w:val="0"/>
+                <w:i w:val="0"/>
+                <w:sz w:val="21"/>
+              </w:rPr>
+              <w:t>☐ Áp dụng chung toàn hệ thống</w:t>
+            </w:r>
+          </w:p>
+          <w:p>
+            <w:pPr>
+              <w:keepNext/>
+              <w:spacing w:after="40" w:before="0" w:line="264"/>
+              <w:ind w:left="220"/>
+            </w:pPr>
+            <w:r>
+              <w:rPr>
+                <w:rFonts w:ascii="Calibri" w:hAnsi="Calibri"/>
+                <w:b/>
+                <w:i w:val="0"/>
+                <w:color w:val="1F4E79"/>
+                <w:sz w:val="21"/>
+              </w:rPr>
+              <w:t>☒ Cấu hình riêng theo từng tòa</w:t>
+            </w:r>
+          </w:p>
+          <w:p>
+            <w:pPr>
+              <w:keepNext/>
+              <w:spacing w:after="40" w:before="0" w:line="264"/>
+              <w:ind w:left="220"/>
+            </w:pPr>
+            <w:r>
+              <w:rPr>
+                <w:rFonts w:ascii="Calibri" w:hAnsi="Calibri"/>
+                <w:b w:val="0"/>
+                <w:i w:val="0"/>
+                <w:sz w:val="21"/>
+              </w:rPr>
+              <w:t>☐ Không dùng mặc định; nhân viên nhập thực tế từng trường hợp</w:t>
             </w:r>
           </w:p>
           <w:p>
@@ -3385,66 +3150,44 @@
             </w:pPr>
             <w:r>
               <w:rPr>
-                <w:rFonts w:ascii="Calibri" w:cs="Calibri" w:eastAsia="Calibri" w:hAnsi="Calibri"/>
-                <w:b/>
-                <w:bCs/>
-                <w:color w:val="2E74B5"/>
-                <w:sz w:val="22"/>
-                <w:szCs w:val="22"/>
-              </w:rPr>
-              <w:t xml:space="preserve">Trả lời/xác nhận của khách hàng</w:t>
-            </w:r>
-          </w:p>
-          <w:p>
-            <w:pPr>
-              <w:shd w:fill="F5F7F9" w:val="clear"/>
-              <w:spacing w:after="90" w:before="0" w:line="300"/>
-            </w:pPr>
-            <w:r>
-              <w:rPr>
-                <w:rFonts w:ascii="Calibri" w:cs="Calibri" w:eastAsia="Calibri" w:hAnsi="Calibri"/>
+                <w:rFonts w:ascii="Calibri" w:hAnsi="Calibri"/>
+                <w:b/>
+                <w:i w:val="0"/>
+                <w:color w:val="1F4E79"/>
+                <w:sz w:val="22"/>
+              </w:rPr>
+              <w:t>Trả lời giả định do đội dự án đề xuất (chờ khách hàng xác nhận)</w:t>
+            </w:r>
+          </w:p>
+          <w:p>
+            <w:pPr>
+              <w:shd w:fill="DDEBF7" w:val="clear"/>
+              <w:spacing w:after="80" w:before="0" w:line="300"/>
+            </w:pPr>
+            <w:r>
+              <w:rPr>
+                <w:rFonts w:ascii="Calibri" w:hAnsi="Calibri"/>
+                <w:b w:val="0"/>
+                <w:i w:val="0"/>
+                <w:color w:val="1F4E79"/>
+                <w:sz w:val="21"/>
+              </w:rPr>
+              <w:t>Cấu hình riêng theo từng tòa, với giá trị khởi tạo tham khảo: khấu hao/hao mòn 200.000 đồng, vệ sinh 100.000 đồng, sơn 300.000–500.000 đồng. Nhân viên được sửa trên từng phiếu khi có bằng chứng và lý do; thay đổi phải lưu audit.</w:t>
+            </w:r>
+          </w:p>
+          <w:p>
+            <w:pPr>
+              <w:spacing w:after="0" w:before="0"/>
+            </w:pPr>
+            <w:r>
+              <w:rPr>
+                <w:rFonts w:ascii="Calibri" w:hAnsi="Calibri"/>
+                <w:b w:val="0"/>
                 <w:i/>
-                <w:iCs/>
-                <w:color w:val="7A838D"/>
-                <w:sz w:val="22"/>
-                <w:szCs w:val="22"/>
-              </w:rPr>
-              <w:t xml:space="preserve">[Khách hàng nhập câu trả lời tại đây]</w:t>
-            </w:r>
-            <w:r>
-              <w:rPr>
-                <w:rFonts w:ascii="Calibri" w:cs="Calibri" w:eastAsia="Calibri" w:hAnsi="Calibri"/>
-                <w:color w:val="7A838D"/>
-                <w:sz w:val="22"/>
-                <w:szCs w:val="22"/>
-              </w:rPr>
-              <w:t xml:space="preserve">
-</w:t>
-            </w:r>
-          </w:p>
-          <w:p>
-            <w:pPr>
-              <w:spacing w:after="0" w:before="0"/>
-            </w:pPr>
-            <w:r>
-              <w:rPr>
-                <w:rFonts w:ascii="Calibri" w:cs="Calibri" w:eastAsia="Calibri" w:hAnsi="Calibri"/>
-                <w:b/>
-                <w:bCs/>
-                <w:color w:val="17365D"/>
-                <w:sz w:val="20"/>
-                <w:szCs w:val="20"/>
-              </w:rPr>
-              <w:t xml:space="preserve">Tài liệu/minh chứng đính kèm (nếu có): </w:t>
-            </w:r>
-            <w:r>
-              <w:rPr>
-                <w:rFonts w:ascii="Calibri" w:cs="Calibri" w:eastAsia="Calibri" w:hAnsi="Calibri"/>
-                <w:color w:val="5D6672"/>
-                <w:sz w:val="20"/>
-                <w:szCs w:val="20"/>
-              </w:rPr>
-              <w:t xml:space="preserve">________________________________________</w:t>
+                <w:color w:val="595959"/>
+                <w:sz w:val="19"/>
+              </w:rPr>
+              <w:t>Căn cứ tham khảo trong hồ sơ nghiệp vụ: P-16; BR-2.13.4.</w:t>
             </w:r>
           </w:p>
         </w:tc>
@@ -3554,44 +3297,45 @@
             </w:pPr>
             <w:r>
               <w:rPr>
-                <w:rFonts w:ascii="Calibri" w:cs="Calibri" w:eastAsia="Calibri" w:hAnsi="Calibri"/>
-                <w:color w:val="20242A"/>
-                <w:sz w:val="21"/>
-                <w:szCs w:val="21"/>
-              </w:rPr>
-              <w:t xml:space="preserve">☐ Đúng</w:t>
-            </w:r>
-          </w:p>
-          <w:p>
-            <w:pPr>
-              <w:keepNext/>
-              <w:spacing w:after="40" w:before="0" w:line="264"/>
-              <w:ind w:left="220"/>
-            </w:pPr>
-            <w:r>
-              <w:rPr>
-                <w:rFonts w:ascii="Calibri" w:cs="Calibri" w:eastAsia="Calibri" w:hAnsi="Calibri"/>
-                <w:color w:val="20242A"/>
-                <w:sz w:val="21"/>
-                <w:szCs w:val="21"/>
-              </w:rPr>
-              <w:t xml:space="preserve">☐ Luôn khấu trừ tiền phòng tháng cuối vào cọc</w:t>
-            </w:r>
-          </w:p>
-          <w:p>
-            <w:pPr>
-              <w:keepNext/>
-              <w:spacing w:after="40" w:before="0" w:line="264"/>
-              <w:ind w:left="220"/>
-            </w:pPr>
-            <w:r>
-              <w:rPr>
-                <w:rFonts w:ascii="Calibri" w:cs="Calibri" w:eastAsia="Calibri" w:hAnsi="Calibri"/>
-                <w:color w:val="20242A"/>
-                <w:sz w:val="21"/>
-                <w:szCs w:val="21"/>
-              </w:rPr>
-              <w:t xml:space="preserve">☐ Tùy trường hợp - vui lòng mô tả</w:t>
+                <w:rFonts w:ascii="Calibri" w:hAnsi="Calibri"/>
+                <w:b/>
+                <w:i w:val="0"/>
+                <w:color w:val="1F4E79"/>
+                <w:sz w:val="21"/>
+              </w:rPr>
+              <w:t>☒ Đúng</w:t>
+            </w:r>
+          </w:p>
+          <w:p>
+            <w:pPr>
+              <w:keepNext/>
+              <w:spacing w:after="40" w:before="0" w:line="264"/>
+              <w:ind w:left="220"/>
+            </w:pPr>
+            <w:r>
+              <w:rPr>
+                <w:rFonts w:ascii="Calibri" w:hAnsi="Calibri"/>
+                <w:b w:val="0"/>
+                <w:i w:val="0"/>
+                <w:sz w:val="21"/>
+              </w:rPr>
+              <w:t>☐ Luôn khấu trừ tiền phòng tháng cuối vào cọc</w:t>
+            </w:r>
+          </w:p>
+          <w:p>
+            <w:pPr>
+              <w:keepNext/>
+              <w:spacing w:after="40" w:before="0" w:line="264"/>
+              <w:ind w:left="220"/>
+            </w:pPr>
+            <w:r>
+              <w:rPr>
+                <w:rFonts w:ascii="Calibri" w:hAnsi="Calibri"/>
+                <w:b w:val="0"/>
+                <w:i w:val="0"/>
+                <w:sz w:val="21"/>
+              </w:rPr>
+              <w:t>☐ Tùy trường hợp - vui lòng mô tả</w:t>
             </w:r>
           </w:p>
           <w:p>
@@ -3629,66 +3373,44 @@
             </w:pPr>
             <w:r>
               <w:rPr>
-                <w:rFonts w:ascii="Calibri" w:cs="Calibri" w:eastAsia="Calibri" w:hAnsi="Calibri"/>
-                <w:b/>
-                <w:bCs/>
-                <w:color w:val="2E74B5"/>
-                <w:sz w:val="22"/>
-                <w:szCs w:val="22"/>
-              </w:rPr>
-              <w:t xml:space="preserve">Trả lời/xác nhận của khách hàng</w:t>
-            </w:r>
-          </w:p>
-          <w:p>
-            <w:pPr>
-              <w:shd w:fill="F5F7F9" w:val="clear"/>
-              <w:spacing w:after="90" w:before="0" w:line="300"/>
-            </w:pPr>
-            <w:r>
-              <w:rPr>
-                <w:rFonts w:ascii="Calibri" w:cs="Calibri" w:eastAsia="Calibri" w:hAnsi="Calibri"/>
+                <w:rFonts w:ascii="Calibri" w:hAnsi="Calibri"/>
+                <w:b/>
+                <w:i w:val="0"/>
+                <w:color w:val="1F4E79"/>
+                <w:sz w:val="22"/>
+              </w:rPr>
+              <w:t>Trả lời giả định do đội dự án đề xuất (chờ khách hàng xác nhận)</w:t>
+            </w:r>
+          </w:p>
+          <w:p>
+            <w:pPr>
+              <w:shd w:fill="DDEBF7" w:val="clear"/>
+              <w:spacing w:after="80" w:before="0" w:line="300"/>
+            </w:pPr>
+            <w:r>
+              <w:rPr>
+                <w:rFonts w:ascii="Calibri" w:hAnsi="Calibri"/>
+                <w:b w:val="0"/>
+                <w:i w:val="0"/>
+                <w:color w:val="1F4E79"/>
+                <w:sz w:val="21"/>
+              </w:rPr>
+              <w:t>Đúng. Chỉ khấu trừ tiền phòng tháng cuối vào cọc đối với phần tiền phòng còn chưa thanh toán. Nếu khách đã thanh toán thì không khấu trừ lần thứ hai; hệ thống phải đối chiếu hóa đơn và payment trước khi duyệt phiếu hoàn cọc.</w:t>
+            </w:r>
+          </w:p>
+          <w:p>
+            <w:pPr>
+              <w:spacing w:after="0" w:before="0"/>
+            </w:pPr>
+            <w:r>
+              <w:rPr>
+                <w:rFonts w:ascii="Calibri" w:hAnsi="Calibri"/>
+                <w:b w:val="0"/>
                 <w:i/>
-                <w:iCs/>
-                <w:color w:val="7A838D"/>
-                <w:sz w:val="22"/>
-                <w:szCs w:val="22"/>
-              </w:rPr>
-              <w:t xml:space="preserve">[Khách hàng nhập câu trả lời tại đây]</w:t>
-            </w:r>
-            <w:r>
-              <w:rPr>
-                <w:rFonts w:ascii="Calibri" w:cs="Calibri" w:eastAsia="Calibri" w:hAnsi="Calibri"/>
-                <w:color w:val="7A838D"/>
-                <w:sz w:val="22"/>
-                <w:szCs w:val="22"/>
-              </w:rPr>
-              <w:t xml:space="preserve">
-</w:t>
-            </w:r>
-          </w:p>
-          <w:p>
-            <w:pPr>
-              <w:spacing w:after="0" w:before="0"/>
-            </w:pPr>
-            <w:r>
-              <w:rPr>
-                <w:rFonts w:ascii="Calibri" w:cs="Calibri" w:eastAsia="Calibri" w:hAnsi="Calibri"/>
-                <w:b/>
-                <w:bCs/>
-                <w:color w:val="17365D"/>
-                <w:sz w:val="20"/>
-                <w:szCs w:val="20"/>
-              </w:rPr>
-              <w:t xml:space="preserve">Tài liệu/minh chứng đính kèm (nếu có): </w:t>
-            </w:r>
-            <w:r>
-              <w:rPr>
-                <w:rFonts w:ascii="Calibri" w:cs="Calibri" w:eastAsia="Calibri" w:hAnsi="Calibri"/>
-                <w:color w:val="5D6672"/>
-                <w:sz w:val="20"/>
-                <w:szCs w:val="20"/>
-              </w:rPr>
-              <w:t xml:space="preserve">________________________________________</w:t>
+                <w:color w:val="595959"/>
+                <w:sz w:val="19"/>
+              </w:rPr>
+              <w:t>Căn cứ tham khảo trong hồ sơ nghiệp vụ: D-32; BR-2.13.17.</w:t>
             </w:r>
           </w:p>
         </w:tc>
@@ -3816,44 +3538,45 @@
             </w:pPr>
             <w:r>
               <w:rPr>
-                <w:rFonts w:ascii="Calibri" w:cs="Calibri" w:eastAsia="Calibri" w:hAnsi="Calibri"/>
-                <w:color w:val="20242A"/>
-                <w:sz w:val="21"/>
-                <w:szCs w:val="21"/>
-              </w:rPr>
-              <w:t xml:space="preserve">☐ Phân bổ theo số phòng</w:t>
-            </w:r>
-          </w:p>
-          <w:p>
-            <w:pPr>
-              <w:keepNext/>
-              <w:spacing w:after="40" w:before="0" w:line="264"/>
-              <w:ind w:left="220"/>
-            </w:pPr>
-            <w:r>
-              <w:rPr>
-                <w:rFonts w:ascii="Calibri" w:cs="Calibri" w:eastAsia="Calibri" w:hAnsi="Calibri"/>
-                <w:color w:val="20242A"/>
-                <w:sz w:val="21"/>
-                <w:szCs w:val="21"/>
-              </w:rPr>
-              <w:t xml:space="preserve">☐ Theo số tiền riêng của từng tòa trong hợp đồng/phụ lục</w:t>
-            </w:r>
-          </w:p>
-          <w:p>
-            <w:pPr>
-              <w:keepNext/>
-              <w:spacing w:after="40" w:before="0" w:line="264"/>
-              <w:ind w:left="220"/>
-            </w:pPr>
-            <w:r>
-              <w:rPr>
-                <w:rFonts w:ascii="Calibri" w:cs="Calibri" w:eastAsia="Calibri" w:hAnsi="Calibri"/>
-                <w:color w:val="20242A"/>
-                <w:sz w:val="21"/>
-                <w:szCs w:val="21"/>
-              </w:rPr>
-              <w:t xml:space="preserve">☐ Theo tiêu thức khác - vui lòng mô tả</w:t>
+                <w:rFonts w:ascii="Calibri" w:hAnsi="Calibri"/>
+                <w:b/>
+                <w:i w:val="0"/>
+                <w:color w:val="1F4E79"/>
+                <w:sz w:val="21"/>
+              </w:rPr>
+              <w:t>☒ Phân bổ theo số phòng</w:t>
+            </w:r>
+          </w:p>
+          <w:p>
+            <w:pPr>
+              <w:keepNext/>
+              <w:spacing w:after="40" w:before="0" w:line="264"/>
+              <w:ind w:left="220"/>
+            </w:pPr>
+            <w:r>
+              <w:rPr>
+                <w:rFonts w:ascii="Calibri" w:hAnsi="Calibri"/>
+                <w:b w:val="0"/>
+                <w:i w:val="0"/>
+                <w:sz w:val="21"/>
+              </w:rPr>
+              <w:t>☐ Theo số tiền riêng của từng tòa trong hợp đồng/phụ lục</w:t>
+            </w:r>
+          </w:p>
+          <w:p>
+            <w:pPr>
+              <w:keepNext/>
+              <w:spacing w:after="40" w:before="0" w:line="264"/>
+              <w:ind w:left="220"/>
+            </w:pPr>
+            <w:r>
+              <w:rPr>
+                <w:rFonts w:ascii="Calibri" w:hAnsi="Calibri"/>
+                <w:b w:val="0"/>
+                <w:i w:val="0"/>
+                <w:sz w:val="21"/>
+              </w:rPr>
+              <w:t>☐ Theo tiêu thức khác - vui lòng mô tả</w:t>
             </w:r>
           </w:p>
           <w:p>
@@ -3891,66 +3614,44 @@
             </w:pPr>
             <w:r>
               <w:rPr>
-                <w:rFonts w:ascii="Calibri" w:cs="Calibri" w:eastAsia="Calibri" w:hAnsi="Calibri"/>
-                <w:b/>
-                <w:bCs/>
-                <w:color w:val="2E74B5"/>
-                <w:sz w:val="22"/>
-                <w:szCs w:val="22"/>
-              </w:rPr>
-              <w:t xml:space="preserve">Trả lời/xác nhận của khách hàng</w:t>
-            </w:r>
-          </w:p>
-          <w:p>
-            <w:pPr>
-              <w:shd w:fill="F5F7F9" w:val="clear"/>
-              <w:spacing w:after="90" w:before="0" w:line="300"/>
-            </w:pPr>
-            <w:r>
-              <w:rPr>
-                <w:rFonts w:ascii="Calibri" w:cs="Calibri" w:eastAsia="Calibri" w:hAnsi="Calibri"/>
+                <w:rFonts w:ascii="Calibri" w:hAnsi="Calibri"/>
+                <w:b/>
+                <w:i w:val="0"/>
+                <w:color w:val="1F4E79"/>
+                <w:sz w:val="22"/>
+              </w:rPr>
+              <w:t>Trả lời giả định do đội dự án đề xuất (chờ khách hàng xác nhận)</w:t>
+            </w:r>
+          </w:p>
+          <w:p>
+            <w:pPr>
+              <w:shd w:fill="DDEBF7" w:val="clear"/>
+              <w:spacing w:after="80" w:before="0" w:line="300"/>
+            </w:pPr>
+            <w:r>
+              <w:rPr>
+                <w:rFonts w:ascii="Calibri" w:hAnsi="Calibri"/>
+                <w:b w:val="0"/>
+                <w:i w:val="0"/>
+                <w:color w:val="1F4E79"/>
+                <w:sz w:val="21"/>
+              </w:rPr>
+              <w:t>Mặc định phân bổ theo tỷ lệ số phòng của từng tòa. Nếu hợp đồng/phụ lục quy định số tiền hoặc tỷ lệ riêng thì dùng tỷ lệ nhập tay có ngày hiệu lực; tổng tỷ lệ của các tòa phải bằng 100%.</w:t>
+            </w:r>
+          </w:p>
+          <w:p>
+            <w:pPr>
+              <w:spacing w:after="0" w:before="0"/>
+            </w:pPr>
+            <w:r>
+              <w:rPr>
+                <w:rFonts w:ascii="Calibri" w:hAnsi="Calibri"/>
+                <w:b w:val="0"/>
                 <w:i/>
-                <w:iCs/>
-                <w:color w:val="7A838D"/>
-                <w:sz w:val="22"/>
-                <w:szCs w:val="22"/>
-              </w:rPr>
-              <w:t xml:space="preserve">[Khách hàng nhập câu trả lời tại đây]</w:t>
-            </w:r>
-            <w:r>
-              <w:rPr>
-                <w:rFonts w:ascii="Calibri" w:cs="Calibri" w:eastAsia="Calibri" w:hAnsi="Calibri"/>
-                <w:color w:val="7A838D"/>
-                <w:sz w:val="22"/>
-                <w:szCs w:val="22"/>
-              </w:rPr>
-              <w:t xml:space="preserve">
-</w:t>
-            </w:r>
-          </w:p>
-          <w:p>
-            <w:pPr>
-              <w:spacing w:after="0" w:before="0"/>
-            </w:pPr>
-            <w:r>
-              <w:rPr>
-                <w:rFonts w:ascii="Calibri" w:cs="Calibri" w:eastAsia="Calibri" w:hAnsi="Calibri"/>
-                <w:b/>
-                <w:bCs/>
-                <w:color w:val="17365D"/>
-                <w:sz w:val="20"/>
-                <w:szCs w:val="20"/>
-              </w:rPr>
-              <w:t xml:space="preserve">Tài liệu/minh chứng đính kèm (nếu có): </w:t>
-            </w:r>
-            <w:r>
-              <w:rPr>
-                <w:rFonts w:ascii="Calibri" w:cs="Calibri" w:eastAsia="Calibri" w:hAnsi="Calibri"/>
-                <w:color w:val="5D6672"/>
-                <w:sz w:val="20"/>
-                <w:szCs w:val="20"/>
-              </w:rPr>
-              <w:t xml:space="preserve">________________________________________</w:t>
+                <w:color w:val="595959"/>
+                <w:sz w:val="19"/>
+              </w:rPr>
+              <w:t>Căn cứ tham khảo trong hồ sơ nghiệp vụ: P-15; BR-2.02.2 và BR-4.05.12.</w:t>
             </w:r>
           </w:p>
         </w:tc>
@@ -4060,44 +3761,45 @@
             </w:pPr>
             <w:r>
               <w:rPr>
-                <w:rFonts w:ascii="Calibri" w:cs="Calibri" w:eastAsia="Calibri" w:hAnsi="Calibri"/>
-                <w:color w:val="20242A"/>
-                <w:sz w:val="21"/>
-                <w:szCs w:val="21"/>
-              </w:rPr>
-              <w:t xml:space="preserve">☐ Nhắc trước 15/7/1 ngày; cảnh báo hết hạn trước 6 tháng</w:t>
-            </w:r>
-          </w:p>
-          <w:p>
-            <w:pPr>
-              <w:keepNext/>
-              <w:spacing w:after="40" w:before="0" w:line="264"/>
-              <w:ind w:left="220"/>
-            </w:pPr>
-            <w:r>
-              <w:rPr>
-                <w:rFonts w:ascii="Calibri" w:cs="Calibri" w:eastAsia="Calibri" w:hAnsi="Calibri"/>
-                <w:color w:val="20242A"/>
-                <w:sz w:val="21"/>
-                <w:szCs w:val="21"/>
-              </w:rPr>
-              <w:t xml:space="preserve">☐ Dùng các mốc khác - vui lòng ghi rõ</w:t>
-            </w:r>
-          </w:p>
-          <w:p>
-            <w:pPr>
-              <w:keepNext/>
-              <w:spacing w:after="40" w:before="0" w:line="264"/>
-              <w:ind w:left="220"/>
-            </w:pPr>
-            <w:r>
-              <w:rPr>
-                <w:rFonts w:ascii="Calibri" w:cs="Calibri" w:eastAsia="Calibri" w:hAnsi="Calibri"/>
-                <w:color w:val="20242A"/>
-                <w:sz w:val="21"/>
-                <w:szCs w:val="21"/>
-              </w:rPr>
-              <w:t xml:space="preserve">☐ Cho phép cấu hình riêng theo hợp đồng</w:t>
+                <w:rFonts w:ascii="Calibri" w:hAnsi="Calibri"/>
+                <w:b/>
+                <w:i w:val="0"/>
+                <w:color w:val="1F4E79"/>
+                <w:sz w:val="21"/>
+              </w:rPr>
+              <w:t>☒ Nhắc trước 15/7/1 ngày; cảnh báo hết hạn trước 6 tháng</w:t>
+            </w:r>
+          </w:p>
+          <w:p>
+            <w:pPr>
+              <w:keepNext/>
+              <w:spacing w:after="40" w:before="0" w:line="264"/>
+              <w:ind w:left="220"/>
+            </w:pPr>
+            <w:r>
+              <w:rPr>
+                <w:rFonts w:ascii="Calibri" w:hAnsi="Calibri"/>
+                <w:b w:val="0"/>
+                <w:i w:val="0"/>
+                <w:sz w:val="21"/>
+              </w:rPr>
+              <w:t>☐ Dùng các mốc khác - vui lòng ghi rõ</w:t>
+            </w:r>
+          </w:p>
+          <w:p>
+            <w:pPr>
+              <w:keepNext/>
+              <w:spacing w:after="40" w:before="0" w:line="264"/>
+              <w:ind w:left="220"/>
+            </w:pPr>
+            <w:r>
+              <w:rPr>
+                <w:rFonts w:ascii="Calibri" w:hAnsi="Calibri"/>
+                <w:b w:val="0"/>
+                <w:i w:val="0"/>
+                <w:sz w:val="21"/>
+              </w:rPr>
+              <w:t>☐ Cho phép cấu hình riêng theo hợp đồng</w:t>
             </w:r>
           </w:p>
           <w:p>
@@ -4135,66 +3837,44 @@
             </w:pPr>
             <w:r>
               <w:rPr>
-                <w:rFonts w:ascii="Calibri" w:cs="Calibri" w:eastAsia="Calibri" w:hAnsi="Calibri"/>
-                <w:b/>
-                <w:bCs/>
-                <w:color w:val="2E74B5"/>
-                <w:sz w:val="22"/>
-                <w:szCs w:val="22"/>
-              </w:rPr>
-              <w:t xml:space="preserve">Trả lời/xác nhận của khách hàng</w:t>
-            </w:r>
-          </w:p>
-          <w:p>
-            <w:pPr>
-              <w:shd w:fill="F5F7F9" w:val="clear"/>
-              <w:spacing w:after="90" w:before="0" w:line="300"/>
-            </w:pPr>
-            <w:r>
-              <w:rPr>
-                <w:rFonts w:ascii="Calibri" w:cs="Calibri" w:eastAsia="Calibri" w:hAnsi="Calibri"/>
+                <w:rFonts w:ascii="Calibri" w:hAnsi="Calibri"/>
+                <w:b/>
+                <w:i w:val="0"/>
+                <w:color w:val="1F4E79"/>
+                <w:sz w:val="22"/>
+              </w:rPr>
+              <w:t>Trả lời giả định do đội dự án đề xuất (chờ khách hàng xác nhận)</w:t>
+            </w:r>
+          </w:p>
+          <w:p>
+            <w:pPr>
+              <w:shd w:fill="DDEBF7" w:val="clear"/>
+              <w:spacing w:after="80" w:before="0" w:line="300"/>
+            </w:pPr>
+            <w:r>
+              <w:rPr>
+                <w:rFonts w:ascii="Calibri" w:hAnsi="Calibri"/>
+                <w:b w:val="0"/>
+                <w:i w:val="0"/>
+                <w:color w:val="1F4E79"/>
+                <w:sz w:val="21"/>
+              </w:rPr>
+              <w:t>Mặc định nhắc thanh toán cho chủ nhà trước 15, 7 và 1 ngày; cảnh báo hợp đồng đầu vào sắp hết từ 6 tháng trước ngày hết hạn. Cho phép cấu hình ngoại lệ ở từng hợp đồng; nếu không cấu hình thì dùng các mốc mặc định trên.</w:t>
+            </w:r>
+          </w:p>
+          <w:p>
+            <w:pPr>
+              <w:spacing w:after="0" w:before="0"/>
+            </w:pPr>
+            <w:r>
+              <w:rPr>
+                <w:rFonts w:ascii="Calibri" w:hAnsi="Calibri"/>
+                <w:b w:val="0"/>
                 <w:i/>
-                <w:iCs/>
-                <w:color w:val="7A838D"/>
-                <w:sz w:val="22"/>
-                <w:szCs w:val="22"/>
-              </w:rPr>
-              <w:t xml:space="preserve">[Khách hàng nhập câu trả lời tại đây]</w:t>
-            </w:r>
-            <w:r>
-              <w:rPr>
-                <w:rFonts w:ascii="Calibri" w:cs="Calibri" w:eastAsia="Calibri" w:hAnsi="Calibri"/>
-                <w:color w:val="7A838D"/>
-                <w:sz w:val="22"/>
-                <w:szCs w:val="22"/>
-              </w:rPr>
-              <w:t xml:space="preserve">
-</w:t>
-            </w:r>
-          </w:p>
-          <w:p>
-            <w:pPr>
-              <w:spacing w:after="0" w:before="0"/>
-            </w:pPr>
-            <w:r>
-              <w:rPr>
-                <w:rFonts w:ascii="Calibri" w:cs="Calibri" w:eastAsia="Calibri" w:hAnsi="Calibri"/>
-                <w:b/>
-                <w:bCs/>
-                <w:color w:val="17365D"/>
-                <w:sz w:val="20"/>
-                <w:szCs w:val="20"/>
-              </w:rPr>
-              <w:t xml:space="preserve">Tài liệu/minh chứng đính kèm (nếu có): </w:t>
-            </w:r>
-            <w:r>
-              <w:rPr>
-                <w:rFonts w:ascii="Calibri" w:cs="Calibri" w:eastAsia="Calibri" w:hAnsi="Calibri"/>
-                <w:color w:val="5D6672"/>
-                <w:sz w:val="20"/>
-                <w:szCs w:val="20"/>
-              </w:rPr>
-              <w:t xml:space="preserve">________________________________________</w:t>
+                <w:color w:val="595959"/>
+                <w:sz w:val="19"/>
+              </w:rPr>
+              <w:t>Căn cứ tham khảo trong hồ sơ nghiệp vụ: P-23; M-2.02, M-4.05 và M-1.01.</w:t>
             </w:r>
           </w:p>
         </w:tc>
@@ -4349,44 +4029,45 @@
             </w:pPr>
             <w:r>
               <w:rPr>
-                <w:rFonts w:ascii="Calibri" w:cs="Calibri" w:eastAsia="Calibri" w:hAnsi="Calibri"/>
-                <w:color w:val="20242A"/>
-                <w:sz w:val="21"/>
-                <w:szCs w:val="21"/>
-              </w:rPr>
-              <w:t xml:space="preserve">☐ Gửi bảng chính sách/bậc lương chính thức kèm theo</w:t>
-            </w:r>
-          </w:p>
-          <w:p>
-            <w:pPr>
-              <w:keepNext/>
-              <w:spacing w:after="40" w:before="0" w:line="264"/>
-              <w:ind w:left="220"/>
-            </w:pPr>
-            <w:r>
-              <w:rPr>
-                <w:rFonts w:ascii="Calibri" w:cs="Calibri" w:eastAsia="Calibri" w:hAnsi="Calibri"/>
-                <w:color w:val="20242A"/>
-                <w:sz w:val="21"/>
-                <w:szCs w:val="21"/>
-              </w:rPr>
-              <w:t xml:space="preserve">☐ Xác nhận dùng đúng ma trận trong file mẫu</w:t>
-            </w:r>
-          </w:p>
-          <w:p>
-            <w:pPr>
-              <w:keepNext/>
-              <w:spacing w:after="40" w:before="0" w:line="264"/>
-              <w:ind w:left="220"/>
-            </w:pPr>
-            <w:r>
-              <w:rPr>
-                <w:rFonts w:ascii="Calibri" w:cs="Calibri" w:eastAsia="Calibri" w:hAnsi="Calibri"/>
-                <w:color w:val="20242A"/>
-                <w:sz w:val="21"/>
-                <w:szCs w:val="21"/>
-              </w:rPr>
-              <w:t xml:space="preserve">☐ Chưa có chính sách - đề nghị hai bên xây dựng và duyệt</w:t>
+                <w:rFonts w:ascii="Calibri" w:hAnsi="Calibri"/>
+                <w:b w:val="0"/>
+                <w:i w:val="0"/>
+                <w:sz w:val="21"/>
+              </w:rPr>
+              <w:t>☐ Gửi bảng chính sách/bậc lương chính thức kèm theo</w:t>
+            </w:r>
+          </w:p>
+          <w:p>
+            <w:pPr>
+              <w:keepNext/>
+              <w:spacing w:after="40" w:before="0" w:line="264"/>
+              <w:ind w:left="220"/>
+            </w:pPr>
+            <w:r>
+              <w:rPr>
+                <w:rFonts w:ascii="Calibri" w:hAnsi="Calibri"/>
+                <w:b w:val="0"/>
+                <w:i w:val="0"/>
+                <w:sz w:val="21"/>
+              </w:rPr>
+              <w:t>☐ Xác nhận dùng đúng ma trận trong file mẫu</w:t>
+            </w:r>
+          </w:p>
+          <w:p>
+            <w:pPr>
+              <w:keepNext/>
+              <w:spacing w:after="40" w:before="0" w:line="264"/>
+              <w:ind w:left="220"/>
+            </w:pPr>
+            <w:r>
+              <w:rPr>
+                <w:rFonts w:ascii="Calibri" w:hAnsi="Calibri"/>
+                <w:b/>
+                <w:i w:val="0"/>
+                <w:color w:val="1F4E79"/>
+                <w:sz w:val="21"/>
+              </w:rPr>
+              <w:t>☒ Chưa có chính sách - đề nghị hai bên xây dựng và duyệt</w:t>
             </w:r>
           </w:p>
           <w:p>
@@ -4424,66 +4105,44 @@
             </w:pPr>
             <w:r>
               <w:rPr>
-                <w:rFonts w:ascii="Calibri" w:cs="Calibri" w:eastAsia="Calibri" w:hAnsi="Calibri"/>
-                <w:b/>
-                <w:bCs/>
-                <w:color w:val="2E74B5"/>
-                <w:sz w:val="22"/>
-                <w:szCs w:val="22"/>
-              </w:rPr>
-              <w:t xml:space="preserve">Trả lời/xác nhận của khách hàng</w:t>
-            </w:r>
-          </w:p>
-          <w:p>
-            <w:pPr>
-              <w:shd w:fill="F5F7F9" w:val="clear"/>
-              <w:spacing w:after="90" w:before="0" w:line="300"/>
-            </w:pPr>
-            <w:r>
-              <w:rPr>
-                <w:rFonts w:ascii="Calibri" w:cs="Calibri" w:eastAsia="Calibri" w:hAnsi="Calibri"/>
+                <w:rFonts w:ascii="Calibri" w:hAnsi="Calibri"/>
+                <w:b/>
+                <w:i w:val="0"/>
+                <w:color w:val="1F4E79"/>
+                <w:sz w:val="22"/>
+              </w:rPr>
+              <w:t>Trả lời giả định do đội dự án đề xuất (chờ khách hàng xác nhận)</w:t>
+            </w:r>
+          </w:p>
+          <w:p>
+            <w:pPr>
+              <w:shd w:fill="DDEBF7" w:val="clear"/>
+              <w:spacing w:after="80" w:before="0" w:line="300"/>
+            </w:pPr>
+            <w:r>
+              <w:rPr>
+                <w:rFonts w:ascii="Calibri" w:hAnsi="Calibri"/>
+                <w:b w:val="0"/>
+                <w:i w:val="0"/>
+                <w:color w:val="1F4E79"/>
+                <w:sz w:val="21"/>
+              </w:rPr>
+              <w:t>Giả định Phase 1 chưa có chính sách chính thức khác nên cấu hình một phiên bản quy tắc từ dữ liệu mẫu: ma trận theo level nhân viên và các ngưỡng 100/95/90/85/80/75; dưới 75% không trả lương hiệu suất. Dùng phần trăm chưa làm tròn để xếp dải; chỉ làm tròn số tiền cuối cùng đến đồng. Ma trận chi tiết bậc 1/bậc 2 theo §3.5.3 phải được Admin duyệt trước khi chạy lương thật.</w:t>
+            </w:r>
+          </w:p>
+          <w:p>
+            <w:pPr>
+              <w:spacing w:after="0" w:before="0"/>
+            </w:pPr>
+            <w:r>
+              <w:rPr>
+                <w:rFonts w:ascii="Calibri" w:hAnsi="Calibri"/>
+                <w:b w:val="0"/>
                 <w:i/>
-                <w:iCs/>
-                <w:color w:val="7A838D"/>
-                <w:sz w:val="22"/>
-                <w:szCs w:val="22"/>
-              </w:rPr>
-              <w:t xml:space="preserve">[Khách hàng nhập câu trả lời tại đây]</w:t>
-            </w:r>
-            <w:r>
-              <w:rPr>
-                <w:rFonts w:ascii="Calibri" w:cs="Calibri" w:eastAsia="Calibri" w:hAnsi="Calibri"/>
-                <w:color w:val="7A838D"/>
-                <w:sz w:val="22"/>
-                <w:szCs w:val="22"/>
-              </w:rPr>
-              <w:t xml:space="preserve">
-</w:t>
-            </w:r>
-          </w:p>
-          <w:p>
-            <w:pPr>
-              <w:spacing w:after="0" w:before="0"/>
-            </w:pPr>
-            <w:r>
-              <w:rPr>
-                <w:rFonts w:ascii="Calibri" w:cs="Calibri" w:eastAsia="Calibri" w:hAnsi="Calibri"/>
-                <w:b/>
-                <w:bCs/>
-                <w:color w:val="17365D"/>
-                <w:sz w:val="20"/>
-                <w:szCs w:val="20"/>
-              </w:rPr>
-              <w:t xml:space="preserve">Tài liệu/minh chứng đính kèm (nếu có): </w:t>
-            </w:r>
-            <w:r>
-              <w:rPr>
-                <w:rFonts w:ascii="Calibri" w:cs="Calibri" w:eastAsia="Calibri" w:hAnsi="Calibri"/>
-                <w:color w:val="5D6672"/>
-                <w:sz w:val="20"/>
-                <w:szCs w:val="20"/>
-              </w:rPr>
-              <w:t xml:space="preserve">________________________________________</w:t>
+                <w:color w:val="595959"/>
+                <w:sz w:val="19"/>
+              </w:rPr>
+              <w:t>Căn cứ tham khảo trong hồ sơ nghiệp vụ: P-01; §3.5.3 và BR-3.05.5.</w:t>
             </w:r>
           </w:p>
         </w:tc>
@@ -4593,44 +4252,45 @@
             </w:pPr>
             <w:r>
               <w:rPr>
-                <w:rFonts w:ascii="Calibri" w:cs="Calibri" w:eastAsia="Calibri" w:hAnsi="Calibri"/>
-                <w:color w:val="20242A"/>
-                <w:sz w:val="21"/>
-                <w:szCs w:val="21"/>
-              </w:rPr>
-              <w:t xml:space="preserve">☐ Bao gồm cả phòng trống trong phạm vi được phân công</w:t>
-            </w:r>
-          </w:p>
-          <w:p>
-            <w:pPr>
-              <w:keepNext/>
-              <w:spacing w:after="40" w:before="0" w:line="264"/>
-              <w:ind w:left="220"/>
-            </w:pPr>
-            <w:r>
-              <w:rPr>
-                <w:rFonts w:ascii="Calibri" w:cs="Calibri" w:eastAsia="Calibri" w:hAnsi="Calibri"/>
-                <w:color w:val="20242A"/>
-                <w:sz w:val="21"/>
-                <w:szCs w:val="21"/>
-              </w:rPr>
-              <w:t xml:space="preserve">☐ Chỉ tính phòng đang có khách</w:t>
-            </w:r>
-          </w:p>
-          <w:p>
-            <w:pPr>
-              <w:keepNext/>
-              <w:spacing w:after="40" w:before="0" w:line="264"/>
-              <w:ind w:left="220"/>
-            </w:pPr>
-            <w:r>
-              <w:rPr>
-                <w:rFonts w:ascii="Calibri" w:cs="Calibri" w:eastAsia="Calibri" w:hAnsi="Calibri"/>
-                <w:color w:val="20242A"/>
-                <w:sz w:val="21"/>
-                <w:szCs w:val="21"/>
-              </w:rPr>
-              <w:t xml:space="preserve">☐ Phạm vi khác - vui lòng mô tả theo từng chức danh</w:t>
+                <w:rFonts w:ascii="Calibri" w:hAnsi="Calibri"/>
+                <w:b/>
+                <w:i w:val="0"/>
+                <w:color w:val="1F4E79"/>
+                <w:sz w:val="21"/>
+              </w:rPr>
+              <w:t>☒ Bao gồm cả phòng trống trong phạm vi được phân công</w:t>
+            </w:r>
+          </w:p>
+          <w:p>
+            <w:pPr>
+              <w:keepNext/>
+              <w:spacing w:after="40" w:before="0" w:line="264"/>
+              <w:ind w:left="220"/>
+            </w:pPr>
+            <w:r>
+              <w:rPr>
+                <w:rFonts w:ascii="Calibri" w:hAnsi="Calibri"/>
+                <w:b w:val="0"/>
+                <w:i w:val="0"/>
+                <w:sz w:val="21"/>
+              </w:rPr>
+              <w:t>☐ Chỉ tính phòng đang có khách</w:t>
+            </w:r>
+          </w:p>
+          <w:p>
+            <w:pPr>
+              <w:keepNext/>
+              <w:spacing w:after="40" w:before="0" w:line="264"/>
+              <w:ind w:left="220"/>
+            </w:pPr>
+            <w:r>
+              <w:rPr>
+                <w:rFonts w:ascii="Calibri" w:hAnsi="Calibri"/>
+                <w:b w:val="0"/>
+                <w:i w:val="0"/>
+                <w:sz w:val="21"/>
+              </w:rPr>
+              <w:t>☐ Phạm vi khác - vui lòng mô tả theo từng chức danh</w:t>
             </w:r>
           </w:p>
           <w:p>
@@ -4668,66 +4328,44 @@
             </w:pPr>
             <w:r>
               <w:rPr>
-                <w:rFonts w:ascii="Calibri" w:cs="Calibri" w:eastAsia="Calibri" w:hAnsi="Calibri"/>
-                <w:b/>
-                <w:bCs/>
-                <w:color w:val="2E74B5"/>
-                <w:sz w:val="22"/>
-                <w:szCs w:val="22"/>
-              </w:rPr>
-              <w:t xml:space="preserve">Trả lời/xác nhận của khách hàng</w:t>
-            </w:r>
-          </w:p>
-          <w:p>
-            <w:pPr>
-              <w:shd w:fill="F5F7F9" w:val="clear"/>
-              <w:spacing w:after="90" w:before="0" w:line="300"/>
-            </w:pPr>
-            <w:r>
-              <w:rPr>
-                <w:rFonts w:ascii="Calibri" w:cs="Calibri" w:eastAsia="Calibri" w:hAnsi="Calibri"/>
+                <w:rFonts w:ascii="Calibri" w:hAnsi="Calibri"/>
+                <w:b/>
+                <w:i w:val="0"/>
+                <w:color w:val="1F4E79"/>
+                <w:sz w:val="22"/>
+              </w:rPr>
+              <w:t>Trả lời giả định do đội dự án đề xuất (chờ khách hàng xác nhận)</w:t>
+            </w:r>
+          </w:p>
+          <w:p>
+            <w:pPr>
+              <w:shd w:fill="DDEBF7" w:val="clear"/>
+              <w:spacing w:after="80" w:before="0" w:line="300"/>
+            </w:pPr>
+            <w:r>
+              <w:rPr>
+                <w:rFonts w:ascii="Calibri" w:hAnsi="Calibri"/>
+                <w:b w:val="0"/>
+                <w:i w:val="0"/>
+                <w:color w:val="1F4E79"/>
+                <w:sz w:val="21"/>
+              </w:rPr>
+              <w:t>Số phòng dưới quyền gồm toàn bộ phòng, kể cả phòng trống, của các tòa đang được giao cho nhân sự trong đơn vị và các đơn vị cấp dưới; chụp snapshot ngày 15. Trưởng phòng vận hành tính trên toàn hệ thống, trưởng nhóm/khu vực tính trong phạm vi được phân công.</w:t>
+            </w:r>
+          </w:p>
+          <w:p>
+            <w:pPr>
+              <w:spacing w:after="0" w:before="0"/>
+            </w:pPr>
+            <w:r>
+              <w:rPr>
+                <w:rFonts w:ascii="Calibri" w:hAnsi="Calibri"/>
+                <w:b w:val="0"/>
                 <w:i/>
-                <w:iCs/>
-                <w:color w:val="7A838D"/>
-                <w:sz w:val="22"/>
-                <w:szCs w:val="22"/>
-              </w:rPr>
-              <w:t xml:space="preserve">[Khách hàng nhập câu trả lời tại đây]</w:t>
-            </w:r>
-            <w:r>
-              <w:rPr>
-                <w:rFonts w:ascii="Calibri" w:cs="Calibri" w:eastAsia="Calibri" w:hAnsi="Calibri"/>
-                <w:color w:val="7A838D"/>
-                <w:sz w:val="22"/>
-                <w:szCs w:val="22"/>
-              </w:rPr>
-              <w:t xml:space="preserve">
-</w:t>
-            </w:r>
-          </w:p>
-          <w:p>
-            <w:pPr>
-              <w:spacing w:after="0" w:before="0"/>
-            </w:pPr>
-            <w:r>
-              <w:rPr>
-                <w:rFonts w:ascii="Calibri" w:cs="Calibri" w:eastAsia="Calibri" w:hAnsi="Calibri"/>
-                <w:b/>
-                <w:bCs/>
-                <w:color w:val="17365D"/>
-                <w:sz w:val="20"/>
-                <w:szCs w:val="20"/>
-              </w:rPr>
-              <w:t xml:space="preserve">Tài liệu/minh chứng đính kèm (nếu có): </w:t>
-            </w:r>
-            <w:r>
-              <w:rPr>
-                <w:rFonts w:ascii="Calibri" w:cs="Calibri" w:eastAsia="Calibri" w:hAnsi="Calibri"/>
-                <w:color w:val="5D6672"/>
-                <w:sz w:val="20"/>
-                <w:szCs w:val="20"/>
-              </w:rPr>
-              <w:t xml:space="preserve">________________________________________</w:t>
+                <w:color w:val="595959"/>
+                <w:sz w:val="19"/>
+              </w:rPr>
+              <w:t>Căn cứ tham khảo trong hồ sơ nghiệp vụ: P-12; BR-3.01.11.</w:t>
             </w:r>
           </w:p>
         </w:tc>
@@ -4837,44 +4475,45 @@
             </w:pPr>
             <w:r>
               <w:rPr>
-                <w:rFonts w:ascii="Calibri" w:cs="Calibri" w:eastAsia="Calibri" w:hAnsi="Calibri"/>
-                <w:color w:val="20242A"/>
-                <w:sz w:val="21"/>
-                <w:szCs w:val="21"/>
-              </w:rPr>
-              <w:t xml:space="preserve">☐ Tính cho người phụ trách tại ngày 15</w:t>
-            </w:r>
-          </w:p>
-          <w:p>
-            <w:pPr>
-              <w:keepNext/>
-              <w:spacing w:after="40" w:before="0" w:line="264"/>
-              <w:ind w:left="220"/>
-            </w:pPr>
-            <w:r>
-              <w:rPr>
-                <w:rFonts w:ascii="Calibri" w:cs="Calibri" w:eastAsia="Calibri" w:hAnsi="Calibri"/>
-                <w:color w:val="20242A"/>
-                <w:sz w:val="21"/>
-                <w:szCs w:val="21"/>
-              </w:rPr>
-              <w:t xml:space="preserve">☐ Chia theo số ngày thực tế</w:t>
-            </w:r>
-          </w:p>
-          <w:p>
-            <w:pPr>
-              <w:keepNext/>
-              <w:spacing w:after="40" w:before="0" w:line="264"/>
-              <w:ind w:left="220"/>
-            </w:pPr>
-            <w:r>
-              <w:rPr>
-                <w:rFonts w:ascii="Calibri" w:cs="Calibri" w:eastAsia="Calibri" w:hAnsi="Calibri"/>
-                <w:color w:val="20242A"/>
-                <w:sz w:val="21"/>
-                <w:szCs w:val="21"/>
-              </w:rPr>
-              <w:t xml:space="preserve">☐ Quy tắc khác - vui lòng mô tả</w:t>
+                <w:rFonts w:ascii="Calibri" w:hAnsi="Calibri"/>
+                <w:b/>
+                <w:i w:val="0"/>
+                <w:color w:val="1F4E79"/>
+                <w:sz w:val="21"/>
+              </w:rPr>
+              <w:t>☒ Tính cho người phụ trách tại ngày 15</w:t>
+            </w:r>
+          </w:p>
+          <w:p>
+            <w:pPr>
+              <w:keepNext/>
+              <w:spacing w:after="40" w:before="0" w:line="264"/>
+              <w:ind w:left="220"/>
+            </w:pPr>
+            <w:r>
+              <w:rPr>
+                <w:rFonts w:ascii="Calibri" w:hAnsi="Calibri"/>
+                <w:b w:val="0"/>
+                <w:i w:val="0"/>
+                <w:sz w:val="21"/>
+              </w:rPr>
+              <w:t>☐ Chia theo số ngày thực tế</w:t>
+            </w:r>
+          </w:p>
+          <w:p>
+            <w:pPr>
+              <w:keepNext/>
+              <w:spacing w:after="40" w:before="0" w:line="264"/>
+              <w:ind w:left="220"/>
+            </w:pPr>
+            <w:r>
+              <w:rPr>
+                <w:rFonts w:ascii="Calibri" w:hAnsi="Calibri"/>
+                <w:b w:val="0"/>
+                <w:i w:val="0"/>
+                <w:sz w:val="21"/>
+              </w:rPr>
+              <w:t>☐ Quy tắc khác - vui lòng mô tả</w:t>
             </w:r>
           </w:p>
           <w:p>
@@ -4912,66 +4551,44 @@
             </w:pPr>
             <w:r>
               <w:rPr>
-                <w:rFonts w:ascii="Calibri" w:cs="Calibri" w:eastAsia="Calibri" w:hAnsi="Calibri"/>
-                <w:b/>
-                <w:bCs/>
-                <w:color w:val="2E74B5"/>
-                <w:sz w:val="22"/>
-                <w:szCs w:val="22"/>
-              </w:rPr>
-              <w:t xml:space="preserve">Trả lời/xác nhận của khách hàng</w:t>
-            </w:r>
-          </w:p>
-          <w:p>
-            <w:pPr>
-              <w:shd w:fill="F5F7F9" w:val="clear"/>
-              <w:spacing w:after="90" w:before="0" w:line="300"/>
-            </w:pPr>
-            <w:r>
-              <w:rPr>
-                <w:rFonts w:ascii="Calibri" w:cs="Calibri" w:eastAsia="Calibri" w:hAnsi="Calibri"/>
+                <w:rFonts w:ascii="Calibri" w:hAnsi="Calibri"/>
+                <w:b/>
+                <w:i w:val="0"/>
+                <w:color w:val="1F4E79"/>
+                <w:sz w:val="22"/>
+              </w:rPr>
+              <w:t>Trả lời giả định do đội dự án đề xuất (chờ khách hàng xác nhận)</w:t>
+            </w:r>
+          </w:p>
+          <w:p>
+            <w:pPr>
+              <w:shd w:fill="DDEBF7" w:val="clear"/>
+              <w:spacing w:after="80" w:before="0" w:line="300"/>
+            </w:pPr>
+            <w:r>
+              <w:rPr>
+                <w:rFonts w:ascii="Calibri" w:hAnsi="Calibri"/>
+                <w:b w:val="0"/>
+                <w:i w:val="0"/>
+                <w:color w:val="1F4E79"/>
+                <w:sz w:val="21"/>
+              </w:rPr>
+              <w:t>Xác nhận kỳ lương N gắn với đợt hóa đơn tiền phòng tháng N và chốt ngày 16/N. Khi đổi quản lý giữa tháng, toàn bộ lương hiệu suất của tòa trong kỳ thuộc người phụ trách chính tại ngày 15; không chia theo số ngày. Trường hợp ngoại lệ phải có điều chỉnh được duyệt và lưu audit.</w:t>
+            </w:r>
+          </w:p>
+          <w:p>
+            <w:pPr>
+              <w:spacing w:after="0" w:before="0"/>
+            </w:pPr>
+            <w:r>
+              <w:rPr>
+                <w:rFonts w:ascii="Calibri" w:hAnsi="Calibri"/>
+                <w:b w:val="0"/>
                 <w:i/>
-                <w:iCs/>
-                <w:color w:val="7A838D"/>
-                <w:sz w:val="22"/>
-                <w:szCs w:val="22"/>
-              </w:rPr>
-              <w:t xml:space="preserve">[Khách hàng nhập câu trả lời tại đây]</w:t>
-            </w:r>
-            <w:r>
-              <w:rPr>
-                <w:rFonts w:ascii="Calibri" w:cs="Calibri" w:eastAsia="Calibri" w:hAnsi="Calibri"/>
-                <w:color w:val="7A838D"/>
-                <w:sz w:val="22"/>
-                <w:szCs w:val="22"/>
-              </w:rPr>
-              <w:t xml:space="preserve">
-</w:t>
-            </w:r>
-          </w:p>
-          <w:p>
-            <w:pPr>
-              <w:spacing w:after="0" w:before="0"/>
-            </w:pPr>
-            <w:r>
-              <w:rPr>
-                <w:rFonts w:ascii="Calibri" w:cs="Calibri" w:eastAsia="Calibri" w:hAnsi="Calibri"/>
-                <w:b/>
-                <w:bCs/>
-                <w:color w:val="17365D"/>
-                <w:sz w:val="20"/>
-                <w:szCs w:val="20"/>
-              </w:rPr>
-              <w:t xml:space="preserve">Tài liệu/minh chứng đính kèm (nếu có): </w:t>
-            </w:r>
-            <w:r>
-              <w:rPr>
-                <w:rFonts w:ascii="Calibri" w:cs="Calibri" w:eastAsia="Calibri" w:hAnsi="Calibri"/>
-                <w:color w:val="5D6672"/>
-                <w:sz w:val="20"/>
-                <w:szCs w:val="20"/>
-              </w:rPr>
-              <w:t xml:space="preserve">________________________________________</w:t>
+                <w:color w:val="595959"/>
+                <w:sz w:val="19"/>
+              </w:rPr>
+              <w:t>Căn cứ tham khảo trong hồ sơ nghiệp vụ: P-06, P-21; R-23 và BR-3.03.5.</w:t>
             </w:r>
           </w:p>
         </w:tc>
@@ -5081,60 +4698,62 @@
             </w:pPr>
             <w:r>
               <w:rPr>
-                <w:rFonts w:ascii="Calibri" w:cs="Calibri" w:eastAsia="Calibri" w:hAnsi="Calibri"/>
-                <w:color w:val="20242A"/>
-                <w:sz w:val="21"/>
-                <w:szCs w:val="21"/>
-              </w:rPr>
-              <w:t xml:space="preserve">☐ Trong 2 tháng đầu</w:t>
-            </w:r>
-          </w:p>
-          <w:p>
-            <w:pPr>
-              <w:keepNext/>
-              <w:spacing w:after="40" w:before="0" w:line="264"/>
-              <w:ind w:left="220"/>
-            </w:pPr>
-            <w:r>
-              <w:rPr>
-                <w:rFonts w:ascii="Calibri" w:cs="Calibri" w:eastAsia="Calibri" w:hAnsi="Calibri"/>
-                <w:color w:val="20242A"/>
-                <w:sz w:val="21"/>
-                <w:szCs w:val="21"/>
-              </w:rPr>
-              <w:t xml:space="preserve">☐ Đến khi tỷ lệ lấp đầy đạt 70%</w:t>
-            </w:r>
-          </w:p>
-          <w:p>
-            <w:pPr>
-              <w:keepNext/>
-              <w:spacing w:after="40" w:before="0" w:line="264"/>
-              <w:ind w:left="220"/>
-            </w:pPr>
-            <w:r>
-              <w:rPr>
-                <w:rFonts w:ascii="Calibri" w:cs="Calibri" w:eastAsia="Calibri" w:hAnsi="Calibri"/>
-                <w:color w:val="20242A"/>
-                <w:sz w:val="21"/>
-                <w:szCs w:val="21"/>
-              </w:rPr>
-              <w:t xml:space="preserve">☐ Kết thúc thủ công theo quyết định của quản lý</w:t>
-            </w:r>
-          </w:p>
-          <w:p>
-            <w:pPr>
-              <w:keepNext/>
-              <w:spacing w:after="40" w:before="0" w:line="264"/>
-              <w:ind w:left="220"/>
-            </w:pPr>
-            <w:r>
-              <w:rPr>
-                <w:rFonts w:ascii="Calibri" w:cs="Calibri" w:eastAsia="Calibri" w:hAnsi="Calibri"/>
-                <w:color w:val="20242A"/>
-                <w:sz w:val="21"/>
-                <w:szCs w:val="21"/>
-              </w:rPr>
-              <w:t xml:space="preserve">☐ Quy tắc khác - vui lòng mô tả</w:t>
+                <w:rFonts w:ascii="Calibri" w:hAnsi="Calibri"/>
+                <w:b/>
+                <w:i w:val="0"/>
+                <w:color w:val="1F4E79"/>
+                <w:sz w:val="21"/>
+              </w:rPr>
+              <w:t>☒ Trong 2 tháng đầu</w:t>
+            </w:r>
+          </w:p>
+          <w:p>
+            <w:pPr>
+              <w:keepNext/>
+              <w:spacing w:after="40" w:before="0" w:line="264"/>
+              <w:ind w:left="220"/>
+            </w:pPr>
+            <w:r>
+              <w:rPr>
+                <w:rFonts w:ascii="Calibri" w:hAnsi="Calibri"/>
+                <w:b/>
+                <w:i w:val="0"/>
+                <w:color w:val="1F4E79"/>
+                <w:sz w:val="21"/>
+              </w:rPr>
+              <w:t>☒ Đến khi tỷ lệ lấp đầy đạt 70%</w:t>
+            </w:r>
+          </w:p>
+          <w:p>
+            <w:pPr>
+              <w:keepNext/>
+              <w:spacing w:after="40" w:before="0" w:line="264"/>
+              <w:ind w:left="220"/>
+            </w:pPr>
+            <w:r>
+              <w:rPr>
+                <w:rFonts w:ascii="Calibri" w:hAnsi="Calibri"/>
+                <w:b w:val="0"/>
+                <w:i w:val="0"/>
+                <w:sz w:val="21"/>
+              </w:rPr>
+              <w:t>☐ Kết thúc thủ công theo quyết định của quản lý</w:t>
+            </w:r>
+          </w:p>
+          <w:p>
+            <w:pPr>
+              <w:keepNext/>
+              <w:spacing w:after="40" w:before="0" w:line="264"/>
+              <w:ind w:left="220"/>
+            </w:pPr>
+            <w:r>
+              <w:rPr>
+                <w:rFonts w:ascii="Calibri" w:hAnsi="Calibri"/>
+                <w:b w:val="0"/>
+                <w:i w:val="0"/>
+                <w:sz w:val="21"/>
+              </w:rPr>
+              <w:t>☐ Quy tắc khác - vui lòng mô tả</w:t>
             </w:r>
           </w:p>
           <w:p>
@@ -5172,66 +4791,44 @@
             </w:pPr>
             <w:r>
               <w:rPr>
-                <w:rFonts w:ascii="Calibri" w:cs="Calibri" w:eastAsia="Calibri" w:hAnsi="Calibri"/>
-                <w:b/>
-                <w:bCs/>
-                <w:color w:val="2E74B5"/>
-                <w:sz w:val="22"/>
-                <w:szCs w:val="22"/>
-              </w:rPr>
-              <w:t xml:space="preserve">Trả lời/xác nhận của khách hàng</w:t>
-            </w:r>
-          </w:p>
-          <w:p>
-            <w:pPr>
-              <w:shd w:fill="F5F7F9" w:val="clear"/>
-              <w:spacing w:after="90" w:before="0" w:line="300"/>
-            </w:pPr>
-            <w:r>
-              <w:rPr>
-                <w:rFonts w:ascii="Calibri" w:cs="Calibri" w:eastAsia="Calibri" w:hAnsi="Calibri"/>
+                <w:rFonts w:ascii="Calibri" w:hAnsi="Calibri"/>
+                <w:b/>
+                <w:i w:val="0"/>
+                <w:color w:val="1F4E79"/>
+                <w:sz w:val="22"/>
+              </w:rPr>
+              <w:t>Trả lời giả định do đội dự án đề xuất (chờ khách hàng xác nhận)</w:t>
+            </w:r>
+          </w:p>
+          <w:p>
+            <w:pPr>
+              <w:shd w:fill="DDEBF7" w:val="clear"/>
+              <w:spacing w:after="80" w:before="0" w:line="300"/>
+            </w:pPr>
+            <w:r>
+              <w:rPr>
+                <w:rFonts w:ascii="Calibri" w:hAnsi="Calibri"/>
+                <w:b w:val="0"/>
+                <w:i w:val="0"/>
+                <w:color w:val="1F4E79"/>
+                <w:sz w:val="21"/>
+              </w:rPr>
+              <w:t>Áp dụng mức 100.000 đồng/phòng từ kỳ nhận tòa, tối đa trong hai tháng đầu và kết thúc sớm nếu tỷ lệ lấp đầy đạt từ 70%. Từ kỳ kế tiếp sau khi chạm một trong hai điều kiện, chuyển sang bảng bậc hiệu suất.</w:t>
+            </w:r>
+          </w:p>
+          <w:p>
+            <w:pPr>
+              <w:spacing w:after="0" w:before="0"/>
+            </w:pPr>
+            <w:r>
+              <w:rPr>
+                <w:rFonts w:ascii="Calibri" w:hAnsi="Calibri"/>
+                <w:b w:val="0"/>
                 <w:i/>
-                <w:iCs/>
-                <w:color w:val="7A838D"/>
-                <w:sz w:val="22"/>
-                <w:szCs w:val="22"/>
-              </w:rPr>
-              <w:t xml:space="preserve">[Khách hàng nhập câu trả lời tại đây]</w:t>
-            </w:r>
-            <w:r>
-              <w:rPr>
-                <w:rFonts w:ascii="Calibri" w:cs="Calibri" w:eastAsia="Calibri" w:hAnsi="Calibri"/>
-                <w:color w:val="7A838D"/>
-                <w:sz w:val="22"/>
-                <w:szCs w:val="22"/>
-              </w:rPr>
-              <w:t xml:space="preserve">
-</w:t>
-            </w:r>
-          </w:p>
-          <w:p>
-            <w:pPr>
-              <w:spacing w:after="0" w:before="0"/>
-            </w:pPr>
-            <w:r>
-              <w:rPr>
-                <w:rFonts w:ascii="Calibri" w:cs="Calibri" w:eastAsia="Calibri" w:hAnsi="Calibri"/>
-                <w:b/>
-                <w:bCs/>
-                <w:color w:val="17365D"/>
-                <w:sz w:val="20"/>
-                <w:szCs w:val="20"/>
-              </w:rPr>
-              <w:t xml:space="preserve">Tài liệu/minh chứng đính kèm (nếu có): </w:t>
-            </w:r>
-            <w:r>
-              <w:rPr>
-                <w:rFonts w:ascii="Calibri" w:cs="Calibri" w:eastAsia="Calibri" w:hAnsi="Calibri"/>
-                <w:color w:val="5D6672"/>
-                <w:sz w:val="20"/>
-                <w:szCs w:val="20"/>
-              </w:rPr>
-              <w:t xml:space="preserve">________________________________________</w:t>
+                <w:color w:val="595959"/>
+                <w:sz w:val="19"/>
+              </w:rPr>
+              <w:t>Căn cứ tham khảo trong hồ sơ nghiệp vụ: P-08; M-3.05.</w:t>
             </w:r>
           </w:p>
         </w:tc>
@@ -5341,44 +4938,45 @@
             </w:pPr>
             <w:r>
               <w:rPr>
-                <w:rFonts w:ascii="Calibri" w:cs="Calibri" w:eastAsia="Calibri" w:hAnsi="Calibri"/>
-                <w:color w:val="20242A"/>
-                <w:sz w:val="21"/>
-                <w:szCs w:val="21"/>
-              </w:rPr>
-              <w:t xml:space="preserve">☐ Xác nhận hai mẫu số; 1.343 là nhập nhầm</w:t>
-            </w:r>
-          </w:p>
-          <w:p>
-            <w:pPr>
-              <w:keepNext/>
-              <w:spacing w:after="40" w:before="0" w:line="264"/>
-              <w:ind w:left="220"/>
-            </w:pPr>
-            <w:r>
-              <w:rPr>
-                <w:rFonts w:ascii="Calibri" w:cs="Calibri" w:eastAsia="Calibri" w:hAnsi="Calibri"/>
-                <w:color w:val="20242A"/>
-                <w:sz w:val="21"/>
-                <w:szCs w:val="21"/>
-              </w:rPr>
-              <w:t xml:space="preserve">☐ 1.343 là mẫu số đúng cho lương sửa chữa</w:t>
-            </w:r>
-          </w:p>
-          <w:p>
-            <w:pPr>
-              <w:keepNext/>
-              <w:spacing w:after="40" w:before="0" w:line="264"/>
-              <w:ind w:left="220"/>
-            </w:pPr>
-            <w:r>
-              <w:rPr>
-                <w:rFonts w:ascii="Calibri" w:cs="Calibri" w:eastAsia="Calibri" w:hAnsi="Calibri"/>
-                <w:color w:val="20242A"/>
-                <w:sz w:val="21"/>
-                <w:szCs w:val="21"/>
-              </w:rPr>
-              <w:t xml:space="preserve">☐ Các số liệu/quy tắc khác - vui lòng cung cấp bảng chuẩn</w:t>
+                <w:rFonts w:ascii="Calibri" w:hAnsi="Calibri"/>
+                <w:b/>
+                <w:i w:val="0"/>
+                <w:color w:val="1F4E79"/>
+                <w:sz w:val="21"/>
+              </w:rPr>
+              <w:t>☒ Xác nhận hai mẫu số; 1.343 là nhập nhầm</w:t>
+            </w:r>
+          </w:p>
+          <w:p>
+            <w:pPr>
+              <w:keepNext/>
+              <w:spacing w:after="40" w:before="0" w:line="264"/>
+              <w:ind w:left="220"/>
+            </w:pPr>
+            <w:r>
+              <w:rPr>
+                <w:rFonts w:ascii="Calibri" w:hAnsi="Calibri"/>
+                <w:b w:val="0"/>
+                <w:i w:val="0"/>
+                <w:sz w:val="21"/>
+              </w:rPr>
+              <w:t>☐ 1.343 là mẫu số đúng cho lương sửa chữa</w:t>
+            </w:r>
+          </w:p>
+          <w:p>
+            <w:pPr>
+              <w:keepNext/>
+              <w:spacing w:after="40" w:before="0" w:line="264"/>
+              <w:ind w:left="220"/>
+            </w:pPr>
+            <w:r>
+              <w:rPr>
+                <w:rFonts w:ascii="Calibri" w:hAnsi="Calibri"/>
+                <w:b w:val="0"/>
+                <w:i w:val="0"/>
+                <w:sz w:val="21"/>
+              </w:rPr>
+              <w:t>☐ Các số liệu/quy tắc khác - vui lòng cung cấp bảng chuẩn</w:t>
             </w:r>
           </w:p>
           <w:p>
@@ -5416,66 +5014,44 @@
             </w:pPr>
             <w:r>
               <w:rPr>
-                <w:rFonts w:ascii="Calibri" w:cs="Calibri" w:eastAsia="Calibri" w:hAnsi="Calibri"/>
-                <w:b/>
-                <w:bCs/>
-                <w:color w:val="2E74B5"/>
-                <w:sz w:val="22"/>
-                <w:szCs w:val="22"/>
-              </w:rPr>
-              <w:t xml:space="preserve">Trả lời/xác nhận của khách hàng</w:t>
-            </w:r>
-          </w:p>
-          <w:p>
-            <w:pPr>
-              <w:shd w:fill="F5F7F9" w:val="clear"/>
-              <w:spacing w:after="90" w:before="0" w:line="300"/>
-            </w:pPr>
-            <w:r>
-              <w:rPr>
-                <w:rFonts w:ascii="Calibri" w:cs="Calibri" w:eastAsia="Calibri" w:hAnsi="Calibri"/>
+                <w:rFonts w:ascii="Calibri" w:hAnsi="Calibri"/>
+                <w:b/>
+                <w:i w:val="0"/>
+                <w:color w:val="1F4E79"/>
+                <w:sz w:val="22"/>
+              </w:rPr>
+              <w:t>Trả lời giả định do đội dự án đề xuất (chờ khách hàng xác nhận)</w:t>
+            </w:r>
+          </w:p>
+          <w:p>
+            <w:pPr>
+              <w:shd w:fill="DDEBF7" w:val="clear"/>
+              <w:spacing w:after="80" w:before="0" w:line="300"/>
+            </w:pPr>
+            <w:r>
+              <w:rPr>
+                <w:rFonts w:ascii="Calibri" w:hAnsi="Calibri"/>
+                <w:b w:val="0"/>
+                <w:i w:val="0"/>
+                <w:color w:val="1F4E79"/>
+                <w:sz w:val="21"/>
+              </w:rPr>
+              <w:t>Xác nhận hai mẫu số: N phân bổ chi phí là tổng phòng đang quản lý cuối kỳ, kể cả phòng trống (1.303 tháng 6 và 1.382 tháng 8); mẫu số hiệu suất là phòng có hóa đơn kỳ (1.079 tháng 8). Con số 1.343 tại dòng lương sửa chữa tháng 8 được coi là nhập nhầm; hệ thống dùng một N duy nhất là 1.382 cho kỳ đó.</w:t>
+            </w:r>
+          </w:p>
+          <w:p>
+            <w:pPr>
+              <w:spacing w:after="0" w:before="0"/>
+            </w:pPr>
+            <w:r>
+              <w:rPr>
+                <w:rFonts w:ascii="Calibri" w:hAnsi="Calibri"/>
+                <w:b w:val="0"/>
                 <w:i/>
-                <w:iCs/>
-                <w:color w:val="7A838D"/>
-                <w:sz w:val="22"/>
-                <w:szCs w:val="22"/>
-              </w:rPr>
-              <w:t xml:space="preserve">[Khách hàng nhập câu trả lời tại đây]</w:t>
-            </w:r>
-            <w:r>
-              <w:rPr>
-                <w:rFonts w:ascii="Calibri" w:cs="Calibri" w:eastAsia="Calibri" w:hAnsi="Calibri"/>
-                <w:color w:val="7A838D"/>
-                <w:sz w:val="22"/>
-                <w:szCs w:val="22"/>
-              </w:rPr>
-              <w:t xml:space="preserve">
-</w:t>
-            </w:r>
-          </w:p>
-          <w:p>
-            <w:pPr>
-              <w:spacing w:after="0" w:before="0"/>
-            </w:pPr>
-            <w:r>
-              <w:rPr>
-                <w:rFonts w:ascii="Calibri" w:cs="Calibri" w:eastAsia="Calibri" w:hAnsi="Calibri"/>
-                <w:b/>
-                <w:bCs/>
-                <w:color w:val="17365D"/>
-                <w:sz w:val="20"/>
-                <w:szCs w:val="20"/>
-              </w:rPr>
-              <w:t xml:space="preserve">Tài liệu/minh chứng đính kèm (nếu có): </w:t>
-            </w:r>
-            <w:r>
-              <w:rPr>
-                <w:rFonts w:ascii="Calibri" w:cs="Calibri" w:eastAsia="Calibri" w:hAnsi="Calibri"/>
-                <w:color w:val="5D6672"/>
-                <w:sz w:val="20"/>
-                <w:szCs w:val="20"/>
-              </w:rPr>
-              <w:t xml:space="preserve">________________________________________</w:t>
+                <w:color w:val="595959"/>
+                <w:sz w:val="19"/>
+              </w:rPr>
+              <w:t>Căn cứ tham khảo trong hồ sơ nghiệp vụ: P-05; BR-4.02.2 và BR-5.01.10.</w:t>
             </w:r>
           </w:p>
         </w:tc>
@@ -5630,44 +5206,45 @@
             </w:pPr>
             <w:r>
               <w:rPr>
-                <w:rFonts w:ascii="Calibri" w:cs="Calibri" w:eastAsia="Calibri" w:hAnsi="Calibri"/>
-                <w:color w:val="20242A"/>
-                <w:sz w:val="21"/>
-                <w:szCs w:val="21"/>
-              </w:rPr>
-              <w:t xml:space="preserve">☐ Xác nhận cả ba nội dung theo file mẫu và không thu hồi</w:t>
-            </w:r>
-          </w:p>
-          <w:p>
-            <w:pPr>
-              <w:keepNext/>
-              <w:spacing w:after="40" w:before="0" w:line="264"/>
-              <w:ind w:left="220"/>
-            </w:pPr>
-            <w:r>
-              <w:rPr>
-                <w:rFonts w:ascii="Calibri" w:cs="Calibri" w:eastAsia="Calibri" w:hAnsi="Calibri"/>
-                <w:color w:val="20242A"/>
-                <w:sz w:val="21"/>
-                <w:szCs w:val="21"/>
-              </w:rPr>
-              <w:t xml:space="preserve">☐ Có thu hồi/bù trừ - vui lòng mô tả thời điểm và công thức</w:t>
-            </w:r>
-          </w:p>
-          <w:p>
-            <w:pPr>
-              <w:keepNext/>
-              <w:spacing w:after="40" w:before="0" w:line="264"/>
-              <w:ind w:left="220"/>
-            </w:pPr>
-            <w:r>
-              <w:rPr>
-                <w:rFonts w:ascii="Calibri" w:cs="Calibri" w:eastAsia="Calibri" w:hAnsi="Calibri"/>
-                <w:color w:val="20242A"/>
-                <w:sz w:val="21"/>
-                <w:szCs w:val="21"/>
-              </w:rPr>
-              <w:t xml:space="preserve">☐ Tỷ lệ/đợt trả cần cấu hình và phê duyệt theo từng trường hợp</w:t>
+                <w:rFonts w:ascii="Calibri" w:hAnsi="Calibri"/>
+                <w:b/>
+                <w:i w:val="0"/>
+                <w:color w:val="1F4E79"/>
+                <w:sz w:val="21"/>
+              </w:rPr>
+              <w:t>☒ Xác nhận cả ba nội dung theo file mẫu và không thu hồi</w:t>
+            </w:r>
+          </w:p>
+          <w:p>
+            <w:pPr>
+              <w:keepNext/>
+              <w:spacing w:after="40" w:before="0" w:line="264"/>
+              <w:ind w:left="220"/>
+            </w:pPr>
+            <w:r>
+              <w:rPr>
+                <w:rFonts w:ascii="Calibri" w:hAnsi="Calibri"/>
+                <w:b w:val="0"/>
+                <w:i w:val="0"/>
+                <w:sz w:val="21"/>
+              </w:rPr>
+              <w:t>☐ Có thu hồi/bù trừ - vui lòng mô tả thời điểm và công thức</w:t>
+            </w:r>
+          </w:p>
+          <w:p>
+            <w:pPr>
+              <w:keepNext/>
+              <w:spacing w:after="40" w:before="0" w:line="264"/>
+              <w:ind w:left="220"/>
+            </w:pPr>
+            <w:r>
+              <w:rPr>
+                <w:rFonts w:ascii="Calibri" w:hAnsi="Calibri"/>
+                <w:b w:val="0"/>
+                <w:i w:val="0"/>
+                <w:sz w:val="21"/>
+              </w:rPr>
+              <w:t>☐ Tỷ lệ/đợt trả cần cấu hình và phê duyệt theo từng trường hợp</w:t>
             </w:r>
           </w:p>
           <w:p>
@@ -5705,66 +5282,44 @@
             </w:pPr>
             <w:r>
               <w:rPr>
-                <w:rFonts w:ascii="Calibri" w:cs="Calibri" w:eastAsia="Calibri" w:hAnsi="Calibri"/>
-                <w:b/>
-                <w:bCs/>
-                <w:color w:val="2E74B5"/>
-                <w:sz w:val="22"/>
-                <w:szCs w:val="22"/>
-              </w:rPr>
-              <w:t xml:space="preserve">Trả lời/xác nhận của khách hàng</w:t>
-            </w:r>
-          </w:p>
-          <w:p>
-            <w:pPr>
-              <w:shd w:fill="F5F7F9" w:val="clear"/>
-              <w:spacing w:after="90" w:before="0" w:line="300"/>
-            </w:pPr>
-            <w:r>
-              <w:rPr>
-                <w:rFonts w:ascii="Calibri" w:cs="Calibri" w:eastAsia="Calibri" w:hAnsi="Calibri"/>
+                <w:rFonts w:ascii="Calibri" w:hAnsi="Calibri"/>
+                <w:b/>
+                <w:i w:val="0"/>
+                <w:color w:val="1F4E79"/>
+                <w:sz w:val="22"/>
+              </w:rPr>
+              <w:t>Trả lời giả định do đội dự án đề xuất (chờ khách hàng xác nhận)</w:t>
+            </w:r>
+          </w:p>
+          <w:p>
+            <w:pPr>
+              <w:shd w:fill="DDEBF7" w:val="clear"/>
+              <w:spacing w:after="80" w:before="0" w:line="300"/>
+            </w:pPr>
+            <w:r>
+              <w:rPr>
+                <w:rFonts w:ascii="Calibri" w:hAnsi="Calibri"/>
+                <w:b w:val="0"/>
+                <w:i w:val="0"/>
+                <w:color w:val="1F4E79"/>
+                <w:sz w:val="21"/>
+              </w:rPr>
+              <w:t>Cho phép hoa hồng trả nhiều đợt trên cùng một deal (ví dụ 8% + 42%) và tỷ lệ riêng theo đối tác (ví dụ 65%). Mức ngoài bảng tham chiếu chỉ cảnh báo, không chặn, nhưng cần phê duyệt. Hoa hồng đã chi không thu hồi khi khách bỏ/phá hợp đồng sau đó; trường hợp chưa chi được hủy trước khi duyệt.</w:t>
+            </w:r>
+          </w:p>
+          <w:p>
+            <w:pPr>
+              <w:spacing w:after="0" w:before="0"/>
+            </w:pPr>
+            <w:r>
+              <w:rPr>
+                <w:rFonts w:ascii="Calibri" w:hAnsi="Calibri"/>
+                <w:b w:val="0"/>
                 <w:i/>
-                <w:iCs/>
-                <w:color w:val="7A838D"/>
-                <w:sz w:val="22"/>
-                <w:szCs w:val="22"/>
-              </w:rPr>
-              <w:t xml:space="preserve">[Khách hàng nhập câu trả lời tại đây]</w:t>
-            </w:r>
-            <w:r>
-              <w:rPr>
-                <w:rFonts w:ascii="Calibri" w:cs="Calibri" w:eastAsia="Calibri" w:hAnsi="Calibri"/>
-                <w:color w:val="7A838D"/>
-                <w:sz w:val="22"/>
-                <w:szCs w:val="22"/>
-              </w:rPr>
-              <w:t xml:space="preserve">
-</w:t>
-            </w:r>
-          </w:p>
-          <w:p>
-            <w:pPr>
-              <w:spacing w:after="0" w:before="0"/>
-            </w:pPr>
-            <w:r>
-              <w:rPr>
-                <w:rFonts w:ascii="Calibri" w:cs="Calibri" w:eastAsia="Calibri" w:hAnsi="Calibri"/>
-                <w:b/>
-                <w:bCs/>
-                <w:color w:val="17365D"/>
-                <w:sz w:val="20"/>
-                <w:szCs w:val="20"/>
-              </w:rPr>
-              <w:t xml:space="preserve">Tài liệu/minh chứng đính kèm (nếu có): </w:t>
-            </w:r>
-            <w:r>
-              <w:rPr>
-                <w:rFonts w:ascii="Calibri" w:cs="Calibri" w:eastAsia="Calibri" w:hAnsi="Calibri"/>
-                <w:color w:val="5D6672"/>
-                <w:sz w:val="20"/>
-                <w:szCs w:val="20"/>
-              </w:rPr>
-              <w:t xml:space="preserve">________________________________________</w:t>
+                <w:color w:val="595959"/>
+                <w:sz w:val="19"/>
+              </w:rPr>
+              <w:t>Căn cứ tham khảo trong hồ sơ nghiệp vụ: P-07; BR-4.03.8.</w:t>
             </w:r>
           </w:p>
         </w:tc>
@@ -5892,44 +5447,45 @@
             </w:pPr>
             <w:r>
               <w:rPr>
-                <w:rFonts w:ascii="Calibri" w:cs="Calibri" w:eastAsia="Calibri" w:hAnsi="Calibri"/>
-                <w:color w:val="20242A"/>
-                <w:sz w:val="21"/>
-                <w:szCs w:val="21"/>
-              </w:rPr>
-              <w:t xml:space="preserve">☐ Xác nhận là vốn góp và gửi bảng cấu thành</w:t>
-            </w:r>
-          </w:p>
-          <w:p>
-            <w:pPr>
-              <w:keepNext/>
-              <w:spacing w:after="40" w:before="0" w:line="264"/>
-              <w:ind w:left="220"/>
-            </w:pPr>
-            <w:r>
-              <w:rPr>
-                <w:rFonts w:ascii="Calibri" w:cs="Calibri" w:eastAsia="Calibri" w:hAnsi="Calibri"/>
-                <w:color w:val="20242A"/>
-                <w:sz w:val="21"/>
-                <w:szCs w:val="21"/>
-              </w:rPr>
-              <w:t xml:space="preserve">☐ Một phần là chi phí - vui lòng phân loại từng khoản</w:t>
-            </w:r>
-          </w:p>
-          <w:p>
-            <w:pPr>
-              <w:keepNext/>
-              <w:spacing w:after="40" w:before="0" w:line="264"/>
-              <w:ind w:left="220"/>
-            </w:pPr>
-            <w:r>
-              <w:rPr>
-                <w:rFonts w:ascii="Calibri" w:cs="Calibri" w:eastAsia="Calibri" w:hAnsi="Calibri"/>
-                <w:color w:val="20242A"/>
-                <w:sz w:val="21"/>
-                <w:szCs w:val="21"/>
-              </w:rPr>
-              <w:t xml:space="preserve">☐ Cách ghi nhận khác - vui lòng mô tả</w:t>
+                <w:rFonts w:ascii="Calibri" w:hAnsi="Calibri"/>
+                <w:b/>
+                <w:i w:val="0"/>
+                <w:color w:val="1F4E79"/>
+                <w:sz w:val="21"/>
+              </w:rPr>
+              <w:t>☒ Xác nhận là vốn góp và gửi bảng cấu thành</w:t>
+            </w:r>
+          </w:p>
+          <w:p>
+            <w:pPr>
+              <w:keepNext/>
+              <w:spacing w:after="40" w:before="0" w:line="264"/>
+              <w:ind w:left="220"/>
+            </w:pPr>
+            <w:r>
+              <w:rPr>
+                <w:rFonts w:ascii="Calibri" w:hAnsi="Calibri"/>
+                <w:b w:val="0"/>
+                <w:i w:val="0"/>
+                <w:sz w:val="21"/>
+              </w:rPr>
+              <w:t>☐ Một phần là chi phí - vui lòng phân loại từng khoản</w:t>
+            </w:r>
+          </w:p>
+          <w:p>
+            <w:pPr>
+              <w:keepNext/>
+              <w:spacing w:after="40" w:before="0" w:line="264"/>
+              <w:ind w:left="220"/>
+            </w:pPr>
+            <w:r>
+              <w:rPr>
+                <w:rFonts w:ascii="Calibri" w:hAnsi="Calibri"/>
+                <w:b w:val="0"/>
+                <w:i w:val="0"/>
+                <w:sz w:val="21"/>
+              </w:rPr>
+              <w:t>☐ Cách ghi nhận khác - vui lòng mô tả</w:t>
             </w:r>
           </w:p>
           <w:p>
@@ -5967,66 +5523,44 @@
             </w:pPr>
             <w:r>
               <w:rPr>
-                <w:rFonts w:ascii="Calibri" w:cs="Calibri" w:eastAsia="Calibri" w:hAnsi="Calibri"/>
-                <w:b/>
-                <w:bCs/>
-                <w:color w:val="2E74B5"/>
-                <w:sz w:val="22"/>
-                <w:szCs w:val="22"/>
-              </w:rPr>
-              <w:t xml:space="preserve">Trả lời/xác nhận của khách hàng</w:t>
-            </w:r>
-          </w:p>
-          <w:p>
-            <w:pPr>
-              <w:shd w:fill="F5F7F9" w:val="clear"/>
-              <w:spacing w:after="90" w:before="0" w:line="300"/>
-            </w:pPr>
-            <w:r>
-              <w:rPr>
-                <w:rFonts w:ascii="Calibri" w:cs="Calibri" w:eastAsia="Calibri" w:hAnsi="Calibri"/>
+                <w:rFonts w:ascii="Calibri" w:hAnsi="Calibri"/>
+                <w:b/>
+                <w:i w:val="0"/>
+                <w:color w:val="1F4E79"/>
+                <w:sz w:val="22"/>
+              </w:rPr>
+              <w:t>Trả lời giả định do đội dự án đề xuất (chờ khách hàng xác nhận)</w:t>
+            </w:r>
+          </w:p>
+          <w:p>
+            <w:pPr>
+              <w:shd w:fill="DDEBF7" w:val="clear"/>
+              <w:spacing w:after="80" w:before="0" w:line="300"/>
+            </w:pPr>
+            <w:r>
+              <w:rPr>
+                <w:rFonts w:ascii="Calibri" w:hAnsi="Calibri"/>
+                <w:b w:val="0"/>
+                <w:i w:val="0"/>
+                <w:color w:val="1F4E79"/>
+                <w:sz w:val="21"/>
+              </w:rPr>
+              <w:t>Xác nhận cọc chủ nhà và phí môi giới đầu vào thuộc vốn/đầu tư ban đầu, không ghi chi phí thông thường trong kỳ; phí môi giới được phân bổ trên AC theo thời hạn hợp đồng đầu vào. Tạm dùng 230.400.000 đồng làm số dư vốn góp mở sổ G1. Danh sách nguồn hiện cộng 232.262.000 đồng, chênh 1.862.000 đồng: ghi tài khoản 'Chênh lệch mở sổ chờ đối soát', không tự phân bổ cho cổ đông hay chi phí cho tới khi có chứng từ xác nhận.</w:t>
+            </w:r>
+          </w:p>
+          <w:p>
+            <w:pPr>
+              <w:spacing w:after="0" w:before="0"/>
+            </w:pPr>
+            <w:r>
+              <w:rPr>
+                <w:rFonts w:ascii="Calibri" w:hAnsi="Calibri"/>
+                <w:b w:val="0"/>
                 <w:i/>
-                <w:iCs/>
-                <w:color w:val="7A838D"/>
-                <w:sz w:val="22"/>
-                <w:szCs w:val="22"/>
-              </w:rPr>
-              <w:t xml:space="preserve">[Khách hàng nhập câu trả lời tại đây]</w:t>
-            </w:r>
-            <w:r>
-              <w:rPr>
-                <w:rFonts w:ascii="Calibri" w:cs="Calibri" w:eastAsia="Calibri" w:hAnsi="Calibri"/>
-                <w:color w:val="7A838D"/>
-                <w:sz w:val="22"/>
-                <w:szCs w:val="22"/>
-              </w:rPr>
-              <w:t xml:space="preserve">
-</w:t>
-            </w:r>
-          </w:p>
-          <w:p>
-            <w:pPr>
-              <w:spacing w:after="0" w:before="0"/>
-            </w:pPr>
-            <w:r>
-              <w:rPr>
-                <w:rFonts w:ascii="Calibri" w:cs="Calibri" w:eastAsia="Calibri" w:hAnsi="Calibri"/>
-                <w:b/>
-                <w:bCs/>
-                <w:color w:val="17365D"/>
-                <w:sz w:val="20"/>
-                <w:szCs w:val="20"/>
-              </w:rPr>
-              <w:t xml:space="preserve">Tài liệu/minh chứng đính kèm (nếu có): </w:t>
-            </w:r>
-            <w:r>
-              <w:rPr>
-                <w:rFonts w:ascii="Calibri" w:cs="Calibri" w:eastAsia="Calibri" w:hAnsi="Calibri"/>
-                <w:color w:val="5D6672"/>
-                <w:sz w:val="20"/>
-                <w:szCs w:val="20"/>
-              </w:rPr>
-              <w:t xml:space="preserve">________________________________________</w:t>
+                <w:color w:val="595959"/>
+                <w:sz w:val="19"/>
+              </w:rPr>
+              <w:t>Căn cứ tham khảo trong hồ sơ nghiệp vụ: P-29; BR-4.05.4, BR-4.05.5 và BR-4.06.5.</w:t>
             </w:r>
           </w:p>
         </w:tc>
@@ -6136,44 +5670,45 @@
             </w:pPr>
             <w:r>
               <w:rPr>
-                <w:rFonts w:ascii="Calibri" w:cs="Calibri" w:eastAsia="Calibri" w:hAnsi="Calibri"/>
-                <w:color w:val="20242A"/>
-                <w:sz w:val="21"/>
-                <w:szCs w:val="21"/>
-              </w:rPr>
-              <w:t xml:space="preserve">☐ Chia theo quý trên lợi nhuận dồn tích lũy kế dương</w:t>
-            </w:r>
-          </w:p>
-          <w:p>
-            <w:pPr>
-              <w:keepNext/>
-              <w:spacing w:after="40" w:before="0" w:line="264"/>
-              <w:ind w:left="220"/>
-            </w:pPr>
-            <w:r>
-              <w:rPr>
-                <w:rFonts w:ascii="Calibri" w:cs="Calibri" w:eastAsia="Calibri" w:hAnsi="Calibri"/>
-                <w:color w:val="20242A"/>
-                <w:sz w:val="21"/>
-                <w:szCs w:val="21"/>
-              </w:rPr>
-              <w:t xml:space="preserve">☐ Chia theo dòng tiền</w:t>
-            </w:r>
-          </w:p>
-          <w:p>
-            <w:pPr>
-              <w:keepNext/>
-              <w:spacing w:after="40" w:before="0" w:line="264"/>
-              <w:ind w:left="220"/>
-            </w:pPr>
-            <w:r>
-              <w:rPr>
-                <w:rFonts w:ascii="Calibri" w:cs="Calibri" w:eastAsia="Calibri" w:hAnsi="Calibri"/>
-                <w:color w:val="20242A"/>
-                <w:sz w:val="21"/>
-                <w:szCs w:val="21"/>
-              </w:rPr>
-              <w:t xml:space="preserve">☐ Quy tắc khác - vui lòng nêu chu kỳ, công thức và phạm vi xem báo cáo</w:t>
+                <w:rFonts w:ascii="Calibri" w:hAnsi="Calibri"/>
+                <w:b/>
+                <w:i w:val="0"/>
+                <w:color w:val="1F4E79"/>
+                <w:sz w:val="21"/>
+              </w:rPr>
+              <w:t>☒ Chia theo quý trên lợi nhuận dồn tích lũy kế dương</w:t>
+            </w:r>
+          </w:p>
+          <w:p>
+            <w:pPr>
+              <w:keepNext/>
+              <w:spacing w:after="40" w:before="0" w:line="264"/>
+              <w:ind w:left="220"/>
+            </w:pPr>
+            <w:r>
+              <w:rPr>
+                <w:rFonts w:ascii="Calibri" w:hAnsi="Calibri"/>
+                <w:b w:val="0"/>
+                <w:i w:val="0"/>
+                <w:sz w:val="21"/>
+              </w:rPr>
+              <w:t>☐ Chia theo dòng tiền</w:t>
+            </w:r>
+          </w:p>
+          <w:p>
+            <w:pPr>
+              <w:keepNext/>
+              <w:spacing w:after="40" w:before="0" w:line="264"/>
+              <w:ind w:left="220"/>
+            </w:pPr>
+            <w:r>
+              <w:rPr>
+                <w:rFonts w:ascii="Calibri" w:hAnsi="Calibri"/>
+                <w:b w:val="0"/>
+                <w:i w:val="0"/>
+                <w:sz w:val="21"/>
+              </w:rPr>
+              <w:t>☐ Quy tắc khác - vui lòng nêu chu kỳ, công thức và phạm vi xem báo cáo</w:t>
             </w:r>
           </w:p>
           <w:p>
@@ -6211,66 +5746,44 @@
             </w:pPr>
             <w:r>
               <w:rPr>
-                <w:rFonts w:ascii="Calibri" w:cs="Calibri" w:eastAsia="Calibri" w:hAnsi="Calibri"/>
-                <w:b/>
-                <w:bCs/>
-                <w:color w:val="2E74B5"/>
-                <w:sz w:val="22"/>
-                <w:szCs w:val="22"/>
-              </w:rPr>
-              <w:t xml:space="preserve">Trả lời/xác nhận của khách hàng</w:t>
-            </w:r>
-          </w:p>
-          <w:p>
-            <w:pPr>
-              <w:shd w:fill="F5F7F9" w:val="clear"/>
-              <w:spacing w:after="90" w:before="0" w:line="300"/>
-            </w:pPr>
-            <w:r>
-              <w:rPr>
-                <w:rFonts w:ascii="Calibri" w:cs="Calibri" w:eastAsia="Calibri" w:hAnsi="Calibri"/>
+                <w:rFonts w:ascii="Calibri" w:hAnsi="Calibri"/>
+                <w:b/>
+                <w:i w:val="0"/>
+                <w:color w:val="1F4E79"/>
+                <w:sz w:val="22"/>
+              </w:rPr>
+              <w:t>Trả lời giả định do đội dự án đề xuất (chờ khách hàng xác nhận)</w:t>
+            </w:r>
+          </w:p>
+          <w:p>
+            <w:pPr>
+              <w:shd w:fill="DDEBF7" w:val="clear"/>
+              <w:spacing w:after="80" w:before="0" w:line="300"/>
+            </w:pPr>
+            <w:r>
+              <w:rPr>
+                <w:rFonts w:ascii="Calibri" w:hAnsi="Calibri"/>
+                <w:b w:val="0"/>
+                <w:i w:val="0"/>
+                <w:color w:val="1F4E79"/>
+                <w:sz w:val="21"/>
+              </w:rPr>
+              <w:t>Chia lợi nhuận theo quý trên lợi nhuận dồn tích lũy kế dương sau khi bù lỗ; dùng basis AC đã trừ khấu hao và không gồm tiền cọc. Tỷ lệ sở hữu lấy tại ngày cuối quý, không prorate trong quý. Phase 1 không quản lý cổ đông cấp công ty; cổ đông theo tòa chỉ xem báo cáo tòa của mình và không xem Report B toàn hệ thống.</w:t>
+            </w:r>
+          </w:p>
+          <w:p>
+            <w:pPr>
+              <w:spacing w:after="0" w:before="0"/>
+            </w:pPr>
+            <w:r>
+              <w:rPr>
+                <w:rFonts w:ascii="Calibri" w:hAnsi="Calibri"/>
+                <w:b w:val="0"/>
                 <w:i/>
-                <w:iCs/>
-                <w:color w:val="7A838D"/>
-                <w:sz w:val="22"/>
-                <w:szCs w:val="22"/>
-              </w:rPr>
-              <w:t xml:space="preserve">[Khách hàng nhập câu trả lời tại đây]</w:t>
-            </w:r>
-            <w:r>
-              <w:rPr>
-                <w:rFonts w:ascii="Calibri" w:cs="Calibri" w:eastAsia="Calibri" w:hAnsi="Calibri"/>
-                <w:color w:val="7A838D"/>
-                <w:sz w:val="22"/>
-                <w:szCs w:val="22"/>
-              </w:rPr>
-              <w:t xml:space="preserve">
-</w:t>
-            </w:r>
-          </w:p>
-          <w:p>
-            <w:pPr>
-              <w:spacing w:after="0" w:before="0"/>
-            </w:pPr>
-            <w:r>
-              <w:rPr>
-                <w:rFonts w:ascii="Calibri" w:cs="Calibri" w:eastAsia="Calibri" w:hAnsi="Calibri"/>
-                <w:b/>
-                <w:bCs/>
-                <w:color w:val="17365D"/>
-                <w:sz w:val="20"/>
-                <w:szCs w:val="20"/>
-              </w:rPr>
-              <w:t xml:space="preserve">Tài liệu/minh chứng đính kèm (nếu có): </w:t>
-            </w:r>
-            <w:r>
-              <w:rPr>
-                <w:rFonts w:ascii="Calibri" w:cs="Calibri" w:eastAsia="Calibri" w:hAnsi="Calibri"/>
-                <w:color w:val="5D6672"/>
-                <w:sz w:val="20"/>
-                <w:szCs w:val="20"/>
-              </w:rPr>
-              <w:t xml:space="preserve">________________________________________</w:t>
+                <w:color w:val="595959"/>
+                <w:sz w:val="19"/>
+              </w:rPr>
+              <w:t>Căn cứ tham khảo trong hồ sơ nghiệp vụ: P-10; R-32 và M-4.06.</w:t>
             </w:r>
           </w:p>
         </w:tc>
@@ -6398,44 +5911,45 @@
             </w:pPr>
             <w:r>
               <w:rPr>
-                <w:rFonts w:ascii="Calibri" w:cs="Calibri" w:eastAsia="Calibri" w:hAnsi="Calibri"/>
-                <w:color w:val="20242A"/>
-                <w:sz w:val="21"/>
-                <w:szCs w:val="21"/>
-              </w:rPr>
-              <w:t xml:space="preserve">☐ Vui lòng cung cấp bảng định nghĩa và người có quyền cập nhật</w:t>
-            </w:r>
-          </w:p>
-          <w:p>
-            <w:pPr>
-              <w:keepNext/>
-              <w:spacing w:after="40" w:before="0" w:line="264"/>
-              <w:ind w:left="220"/>
-            </w:pPr>
-            <w:r>
-              <w:rPr>
-                <w:rFonts w:ascii="Calibri" w:cs="Calibri" w:eastAsia="Calibri" w:hAnsi="Calibri"/>
-                <w:color w:val="20242A"/>
-                <w:sz w:val="21"/>
-                <w:szCs w:val="21"/>
-              </w:rPr>
-              <w:t xml:space="preserve">☐ Các nhóm chỉ dùng để báo cáo, không ảnh hưởng quyền</w:t>
-            </w:r>
-          </w:p>
-          <w:p>
-            <w:pPr>
-              <w:keepNext/>
-              <w:spacing w:after="40" w:before="0" w:line="264"/>
-              <w:ind w:left="220"/>
-            </w:pPr>
-            <w:r>
-              <w:rPr>
-                <w:rFonts w:ascii="Calibri" w:cs="Calibri" w:eastAsia="Calibri" w:hAnsi="Calibri"/>
-                <w:color w:val="20242A"/>
-                <w:sz w:val="21"/>
-                <w:szCs w:val="21"/>
-              </w:rPr>
-              <w:t xml:space="preserve">☐ Các nhóm ảnh hưởng cả báo cáo và phân quyền - vui lòng mô tả</w:t>
+                <w:rFonts w:ascii="Calibri" w:hAnsi="Calibri"/>
+                <w:b w:val="0"/>
+                <w:i w:val="0"/>
+                <w:sz w:val="21"/>
+              </w:rPr>
+              <w:t>☐ Vui lòng cung cấp bảng định nghĩa và người có quyền cập nhật</w:t>
+            </w:r>
+          </w:p>
+          <w:p>
+            <w:pPr>
+              <w:keepNext/>
+              <w:spacing w:after="40" w:before="0" w:line="264"/>
+              <w:ind w:left="220"/>
+            </w:pPr>
+            <w:r>
+              <w:rPr>
+                <w:rFonts w:ascii="Calibri" w:hAnsi="Calibri"/>
+                <w:b/>
+                <w:i w:val="0"/>
+                <w:color w:val="1F4E79"/>
+                <w:sz w:val="21"/>
+              </w:rPr>
+              <w:t>☒ Các nhóm chỉ dùng để báo cáo, không ảnh hưởng quyền</w:t>
+            </w:r>
+          </w:p>
+          <w:p>
+            <w:pPr>
+              <w:keepNext/>
+              <w:spacing w:after="40" w:before="0" w:line="264"/>
+              <w:ind w:left="220"/>
+            </w:pPr>
+            <w:r>
+              <w:rPr>
+                <w:rFonts w:ascii="Calibri" w:hAnsi="Calibri"/>
+                <w:b w:val="0"/>
+                <w:i w:val="0"/>
+                <w:sz w:val="21"/>
+              </w:rPr>
+              <w:t>☐ Các nhóm ảnh hưởng cả báo cáo và phân quyền - vui lòng mô tả</w:t>
             </w:r>
           </w:p>
           <w:p>
@@ -6473,66 +5987,44 @@
             </w:pPr>
             <w:r>
               <w:rPr>
-                <w:rFonts w:ascii="Calibri" w:cs="Calibri" w:eastAsia="Calibri" w:hAnsi="Calibri"/>
-                <w:b/>
-                <w:bCs/>
-                <w:color w:val="2E74B5"/>
-                <w:sz w:val="22"/>
-                <w:szCs w:val="22"/>
-              </w:rPr>
-              <w:t xml:space="preserve">Trả lời/xác nhận của khách hàng</w:t>
-            </w:r>
-          </w:p>
-          <w:p>
-            <w:pPr>
-              <w:shd w:fill="F5F7F9" w:val="clear"/>
-              <w:spacing w:after="90" w:before="0" w:line="300"/>
-            </w:pPr>
-            <w:r>
-              <w:rPr>
-                <w:rFonts w:ascii="Calibri" w:cs="Calibri" w:eastAsia="Calibri" w:hAnsi="Calibri"/>
+                <w:rFonts w:ascii="Calibri" w:hAnsi="Calibri"/>
+                <w:b/>
+                <w:i w:val="0"/>
+                <w:color w:val="1F4E79"/>
+                <w:sz w:val="22"/>
+              </w:rPr>
+              <w:t>Trả lời giả định do đội dự án đề xuất (chờ khách hàng xác nhận)</w:t>
+            </w:r>
+          </w:p>
+          <w:p>
+            <w:pPr>
+              <w:shd w:fill="DDEBF7" w:val="clear"/>
+              <w:spacing w:after="80" w:before="0" w:line="300"/>
+            </w:pPr>
+            <w:r>
+              <w:rPr>
+                <w:rFonts w:ascii="Calibri" w:hAnsi="Calibri"/>
+                <w:b w:val="0"/>
+                <w:i w:val="0"/>
+                <w:color w:val="1F4E79"/>
+                <w:sz w:val="21"/>
+              </w:rPr>
+              <w:t>T/S/G là dòng nhà/dòng sản phẩm gắn trong mã tòa, dùng để phân nhóm báo cáo; không đại diện pháp nhân, khu vực và không tự quyết định quyền truy cập. L1/L2/L3 là hạng tình trạng: L1 = cũ, L2 = trung bình, L3 = mới. Admin hoặc Trưởng phòng vận hành gán và thay đổi theo ngày hiệu lực; hệ thống lưu lịch sử, không ghi đè dữ liệu cũ.</w:t>
+            </w:r>
+          </w:p>
+          <w:p>
+            <w:pPr>
+              <w:spacing w:after="0" w:before="0"/>
+            </w:pPr>
+            <w:r>
+              <w:rPr>
+                <w:rFonts w:ascii="Calibri" w:hAnsi="Calibri"/>
+                <w:b w:val="0"/>
                 <w:i/>
-                <w:iCs/>
-                <w:color w:val="7A838D"/>
-                <w:sz w:val="22"/>
-                <w:szCs w:val="22"/>
-              </w:rPr>
-              <w:t xml:space="preserve">[Khách hàng nhập câu trả lời tại đây]</w:t>
-            </w:r>
-            <w:r>
-              <w:rPr>
-                <w:rFonts w:ascii="Calibri" w:cs="Calibri" w:eastAsia="Calibri" w:hAnsi="Calibri"/>
-                <w:color w:val="7A838D"/>
-                <w:sz w:val="22"/>
-                <w:szCs w:val="22"/>
-              </w:rPr>
-              <w:t xml:space="preserve">
-</w:t>
-            </w:r>
-          </w:p>
-          <w:p>
-            <w:pPr>
-              <w:spacing w:after="0" w:before="0"/>
-            </w:pPr>
-            <w:r>
-              <w:rPr>
-                <w:rFonts w:ascii="Calibri" w:cs="Calibri" w:eastAsia="Calibri" w:hAnsi="Calibri"/>
-                <w:b/>
-                <w:bCs/>
-                <w:color w:val="17365D"/>
-                <w:sz w:val="20"/>
-                <w:szCs w:val="20"/>
-              </w:rPr>
-              <w:t xml:space="preserve">Tài liệu/minh chứng đính kèm (nếu có): </w:t>
-            </w:r>
-            <w:r>
-              <w:rPr>
-                <w:rFonts w:ascii="Calibri" w:cs="Calibri" w:eastAsia="Calibri" w:hAnsi="Calibri"/>
-                <w:color w:val="5D6672"/>
-                <w:sz w:val="20"/>
-                <w:szCs w:val="20"/>
-              </w:rPr>
-              <w:t xml:space="preserve">________________________________________</w:t>
+                <w:color w:val="595959"/>
+                <w:sz w:val="19"/>
+              </w:rPr>
+              <w:t>Căn cứ tham khảo trong hồ sơ nghiệp vụ: P-04; D-02 và M-2.03.</w:t>
             </w:r>
           </w:p>
         </w:tc>
@@ -6642,44 +6134,45 @@
             </w:pPr>
             <w:r>
               <w:rPr>
-                <w:rFonts w:ascii="Calibri" w:cs="Calibri" w:eastAsia="Calibri" w:hAnsi="Calibri"/>
-                <w:color w:val="20242A"/>
-                <w:sz w:val="21"/>
-                <w:szCs w:val="21"/>
-              </w:rPr>
-              <w:t xml:space="preserve">☐ Trả lời lần lượt 4 nội dung trong ô bên dưới</w:t>
-            </w:r>
-          </w:p>
-          <w:p>
-            <w:pPr>
-              <w:keepNext/>
-              <w:spacing w:after="40" w:before="0" w:line="264"/>
-              <w:ind w:left="220"/>
-            </w:pPr>
-            <w:r>
-              <w:rPr>
-                <w:rFonts w:ascii="Calibri" w:cs="Calibri" w:eastAsia="Calibri" w:hAnsi="Calibri"/>
-                <w:color w:val="20242A"/>
-                <w:sz w:val="21"/>
-                <w:szCs w:val="21"/>
-              </w:rPr>
-              <w:t xml:space="preserve">☐ Gửi quy trình vận hành/phân quyền hiện hành kèm theo</w:t>
-            </w:r>
-          </w:p>
-          <w:p>
-            <w:pPr>
-              <w:keepNext/>
-              <w:spacing w:after="40" w:before="0" w:line="264"/>
-              <w:ind w:left="220"/>
-            </w:pPr>
-            <w:r>
-              <w:rPr>
-                <w:rFonts w:ascii="Calibri" w:cs="Calibri" w:eastAsia="Calibri" w:hAnsi="Calibri"/>
-                <w:color w:val="20242A"/>
-                <w:sz w:val="21"/>
-                <w:szCs w:val="21"/>
-              </w:rPr>
-              <w:t xml:space="preserve">☐ Nội dung nào không áp dụng, vui lòng ghi N/A</w:t>
+                <w:rFonts w:ascii="Calibri" w:hAnsi="Calibri"/>
+                <w:b/>
+                <w:i w:val="0"/>
+                <w:color w:val="1F4E79"/>
+                <w:sz w:val="21"/>
+              </w:rPr>
+              <w:t>☒ Trả lời lần lượt 4 nội dung trong ô bên dưới</w:t>
+            </w:r>
+          </w:p>
+          <w:p>
+            <w:pPr>
+              <w:keepNext/>
+              <w:spacing w:after="40" w:before="0" w:line="264"/>
+              <w:ind w:left="220"/>
+            </w:pPr>
+            <w:r>
+              <w:rPr>
+                <w:rFonts w:ascii="Calibri" w:hAnsi="Calibri"/>
+                <w:b w:val="0"/>
+                <w:i w:val="0"/>
+                <w:sz w:val="21"/>
+              </w:rPr>
+              <w:t>☐ Gửi quy trình vận hành/phân quyền hiện hành kèm theo</w:t>
+            </w:r>
+          </w:p>
+          <w:p>
+            <w:pPr>
+              <w:keepNext/>
+              <w:spacing w:after="40" w:before="0" w:line="264"/>
+              <w:ind w:left="220"/>
+            </w:pPr>
+            <w:r>
+              <w:rPr>
+                <w:rFonts w:ascii="Calibri" w:hAnsi="Calibri"/>
+                <w:b w:val="0"/>
+                <w:i w:val="0"/>
+                <w:sz w:val="21"/>
+              </w:rPr>
+              <w:t>☐ Nội dung nào không áp dụng, vui lòng ghi N/A</w:t>
             </w:r>
           </w:p>
           <w:p>
@@ -6717,66 +6210,44 @@
             </w:pPr>
             <w:r>
               <w:rPr>
-                <w:rFonts w:ascii="Calibri" w:cs="Calibri" w:eastAsia="Calibri" w:hAnsi="Calibri"/>
-                <w:b/>
-                <w:bCs/>
-                <w:color w:val="2E74B5"/>
-                <w:sz w:val="22"/>
-                <w:szCs w:val="22"/>
-              </w:rPr>
-              <w:t xml:space="preserve">Trả lời/xác nhận của khách hàng</w:t>
-            </w:r>
-          </w:p>
-          <w:p>
-            <w:pPr>
-              <w:shd w:fill="F5F7F9" w:val="clear"/>
-              <w:spacing w:after="90" w:before="0" w:line="300"/>
-            </w:pPr>
-            <w:r>
-              <w:rPr>
-                <w:rFonts w:ascii="Calibri" w:cs="Calibri" w:eastAsia="Calibri" w:hAnsi="Calibri"/>
+                <w:rFonts w:ascii="Calibri" w:hAnsi="Calibri"/>
+                <w:b/>
+                <w:i w:val="0"/>
+                <w:color w:val="1F4E79"/>
+                <w:sz w:val="22"/>
+              </w:rPr>
+              <w:t>Trả lời giả định do đội dự án đề xuất (chờ khách hàng xác nhận)</w:t>
+            </w:r>
+          </w:p>
+          <w:p>
+            <w:pPr>
+              <w:shd w:fill="DDEBF7" w:val="clear"/>
+              <w:spacing w:after="80" w:before="0" w:line="300"/>
+            </w:pPr>
+            <w:r>
+              <w:rPr>
+                <w:rFonts w:ascii="Calibri" w:hAnsi="Calibri"/>
+                <w:b w:val="0"/>
+                <w:i w:val="0"/>
+                <w:color w:val="1F4E79"/>
+                <w:sz w:val="21"/>
+              </w:rPr>
+              <w:t>(1) Sinh mã khách khi hợp đồng chuyển sang Chờ ký. Đổi phòng nội bộ tạo mã theo phòng đích nhưng giữ số thứ tự; mã cũ lưu lịch sử. (2) Ảnh công tơ bắt buộc khi nhận phòng và trả phòng; kỳ tháng chỉ khuyến nghị. (3) Cảnh báo đỏ: công nợ quá 5 ngày, mức nghiêm trọng quá 15 ngày; hợp đồng thuê sắp hết dưới 7 ngày; lịch trả chủ nhà còn tối đa 7 ngày; OCR chờ review quá 2 ngày. Snapshot M5/M10/M15 lúc 23:59. (4) Phase 1 chưa tách vai trò HR; quyền HR gộp vào Admin/Kế toán và có thể tách bằng cấu hình sau.</w:t>
+            </w:r>
+          </w:p>
+          <w:p>
+            <w:pPr>
+              <w:spacing w:after="0" w:before="0"/>
+            </w:pPr>
+            <w:r>
+              <w:rPr>
+                <w:rFonts w:ascii="Calibri" w:hAnsi="Calibri"/>
+                <w:b w:val="0"/>
                 <w:i/>
-                <w:iCs/>
-                <w:color w:val="7A838D"/>
-                <w:sz w:val="22"/>
-                <w:szCs w:val="22"/>
-              </w:rPr>
-              <w:t xml:space="preserve">[Khách hàng nhập câu trả lời tại đây]</w:t>
-            </w:r>
-            <w:r>
-              <w:rPr>
-                <w:rFonts w:ascii="Calibri" w:cs="Calibri" w:eastAsia="Calibri" w:hAnsi="Calibri"/>
-                <w:color w:val="7A838D"/>
-                <w:sz w:val="22"/>
-                <w:szCs w:val="22"/>
-              </w:rPr>
-              <w:t xml:space="preserve">
-</w:t>
-            </w:r>
-          </w:p>
-          <w:p>
-            <w:pPr>
-              <w:spacing w:after="0" w:before="0"/>
-            </w:pPr>
-            <w:r>
-              <w:rPr>
-                <w:rFonts w:ascii="Calibri" w:cs="Calibri" w:eastAsia="Calibri" w:hAnsi="Calibri"/>
-                <w:b/>
-                <w:bCs/>
-                <w:color w:val="17365D"/>
-                <w:sz w:val="20"/>
-                <w:szCs w:val="20"/>
-              </w:rPr>
-              <w:t xml:space="preserve">Tài liệu/minh chứng đính kèm (nếu có): </w:t>
-            </w:r>
-            <w:r>
-              <w:rPr>
-                <w:rFonts w:ascii="Calibri" w:cs="Calibri" w:eastAsia="Calibri" w:hAnsi="Calibri"/>
-                <w:color w:val="5D6672"/>
-                <w:sz w:val="20"/>
-                <w:szCs w:val="20"/>
-              </w:rPr>
-              <w:t xml:space="preserve">________________________________________</w:t>
+                <w:color w:val="595959"/>
+                <w:sz w:val="19"/>
+              </w:rPr>
+              <w:t>Căn cứ tham khảo trong hồ sơ nghiệp vụ: P-24, P-25, P-20, P-19 và P-22.</w:t>
             </w:r>
           </w:p>
         </w:tc>
@@ -6810,12 +6281,13 @@
       </w:pPr>
       <w:r>
         <w:rPr>
-          <w:rFonts w:ascii="Calibri" w:cs="Calibri" w:eastAsia="Calibri" w:hAnsi="Calibri"/>
-          <w:color w:val="20242A"/>
-          <w:sz w:val="22"/>
-          <w:szCs w:val="22"/>
+          <w:rFonts w:ascii="Calibri" w:hAnsi="Calibri"/>
+          <w:b w:val="0"/>
+          <w:i/>
+          <w:color w:val="9C5700"/>
+          <w:sz w:val="21"/>
         </w:rPr>
-        <w:t xml:space="preserve">Đại diện khách hàng xác nhận các nội dung trả lời trong tài liệu này là cơ sở để hai bên hoàn thiện đặc tả và phạm vi chức năng của hệ thống.</w:t>
+        <w:t>Các câu trả lời màu xanh trong tài liệu là giả định đề xuất. Chúng chỉ trở thành cơ sở nghiệp vụ chính thức sau khi đại diện khách hàng rà soát, chỉnh sửa (nếu có) và ký xác nhận.</w:t>
       </w:r>
     </w:p>
     <w:tbl>

</xml_diff>